<commit_message>
Explain rules and code in plain English; keep code blocks and tables from splitting across pages
</commit_message>
<xml_diff>
--- a/gem_expert/docs/Gemstone_Identification_Assistant_User_Manual.docx
+++ b/gem_expert/docs/Gemstone_Identification_Assistant_User_Manual.docx
@@ -67,7 +67,7 @@
           <w:noProof/>
         </w:rPr>
         <w:drawing>
-          <wp:inline distT="0" distB="0" distL="0" distR="0" wp14:anchorId="17F9BB44" wp14:editId="72AC82CC">
+          <wp:inline distT="0" distB="0" distL="0" distR="0" wp14:anchorId="7443F561" wp14:editId="7883B0ED">
             <wp:extent cx="4572635" cy="3028315"/>
             <wp:effectExtent l="0" t="0" r="0" b="635"/>
             <wp:docPr id="1" name="Picture 1"/>
@@ -225,7 +225,7 @@
         <w:rPr>
           <w:noProof/>
         </w:rPr>
-        <w:instrText xml:space="preserve"> PAGEREF _Toc241595864 \h </w:instrText>
+        <w:instrText xml:space="preserve"> PAGEREF _Toc241602185 \h </w:instrText>
       </w:r>
       <w:r>
         <w:rPr>
@@ -287,7 +287,7 @@
         <w:rPr>
           <w:noProof/>
         </w:rPr>
-        <w:instrText xml:space="preserve"> PAGEREF _Toc241595865 \h </w:instrText>
+        <w:instrText xml:space="preserve"> PAGEREF _Toc241602186 \h </w:instrText>
       </w:r>
       <w:r>
         <w:rPr>
@@ -349,7 +349,7 @@
         <w:rPr>
           <w:noProof/>
         </w:rPr>
-        <w:instrText xml:space="preserve"> PAGEREF _Toc241595866 \h </w:instrText>
+        <w:instrText xml:space="preserve"> PAGEREF _Toc241602187 \h </w:instrText>
       </w:r>
       <w:r>
         <w:rPr>
@@ -366,7 +366,7 @@
         <w:rPr>
           <w:noProof/>
         </w:rPr>
-        <w:t>4</w:t>
+        <w:t>5</w:t>
       </w:r>
       <w:r>
         <w:rPr>
@@ -411,7 +411,7 @@
         <w:rPr>
           <w:noProof/>
         </w:rPr>
-        <w:instrText xml:space="preserve"> PAGEREF _Toc241595867 \h </w:instrText>
+        <w:instrText xml:space="preserve"> PAGEREF _Toc241602188 \h </w:instrText>
       </w:r>
       <w:r>
         <w:rPr>
@@ -473,7 +473,7 @@
         <w:rPr>
           <w:noProof/>
         </w:rPr>
-        <w:instrText xml:space="preserve"> PAGEREF _Toc241595868 \h </w:instrText>
+        <w:instrText xml:space="preserve"> PAGEREF _Toc241602189 \h </w:instrText>
       </w:r>
       <w:r>
         <w:rPr>
@@ -535,7 +535,7 @@
         <w:rPr>
           <w:noProof/>
         </w:rPr>
-        <w:instrText xml:space="preserve"> PAGEREF _Toc241595869 \h </w:instrText>
+        <w:instrText xml:space="preserve"> PAGEREF _Toc241602190 \h </w:instrText>
       </w:r>
       <w:r>
         <w:rPr>
@@ -597,7 +597,7 @@
         <w:rPr>
           <w:noProof/>
         </w:rPr>
-        <w:instrText xml:space="preserve"> PAGEREF _Toc241595870 \h </w:instrText>
+        <w:instrText xml:space="preserve"> PAGEREF _Toc241602191 \h </w:instrText>
       </w:r>
       <w:r>
         <w:rPr>
@@ -614,7 +614,7 @@
         <w:rPr>
           <w:noProof/>
         </w:rPr>
-        <w:t>5</w:t>
+        <w:t>6</w:t>
       </w:r>
       <w:r>
         <w:rPr>
@@ -659,7 +659,7 @@
         <w:rPr>
           <w:noProof/>
         </w:rPr>
-        <w:instrText xml:space="preserve"> PAGEREF _Toc241595871 \h </w:instrText>
+        <w:instrText xml:space="preserve"> PAGEREF _Toc241602192 \h </w:instrText>
       </w:r>
       <w:r>
         <w:rPr>
@@ -721,7 +721,7 @@
         <w:rPr>
           <w:noProof/>
         </w:rPr>
-        <w:instrText xml:space="preserve"> PAGEREF _Toc241595872 \h </w:instrText>
+        <w:instrText xml:space="preserve"> PAGEREF _Toc241602193 \h </w:instrText>
       </w:r>
       <w:r>
         <w:rPr>
@@ -783,7 +783,7 @@
         <w:rPr>
           <w:noProof/>
         </w:rPr>
-        <w:instrText xml:space="preserve"> PAGEREF _Toc241595873 \h </w:instrText>
+        <w:instrText xml:space="preserve"> PAGEREF _Toc241602194 \h </w:instrText>
       </w:r>
       <w:r>
         <w:rPr>
@@ -845,7 +845,7 @@
         <w:rPr>
           <w:noProof/>
         </w:rPr>
-        <w:instrText xml:space="preserve"> PAGEREF _Toc241595874 \h </w:instrText>
+        <w:instrText xml:space="preserve"> PAGEREF _Toc241602195 \h </w:instrText>
       </w:r>
       <w:r>
         <w:rPr>
@@ -907,7 +907,7 @@
         <w:rPr>
           <w:noProof/>
         </w:rPr>
-        <w:instrText xml:space="preserve"> PAGEREF _Toc241595875 \h </w:instrText>
+        <w:instrText xml:space="preserve"> PAGEREF _Toc241602196 \h </w:instrText>
       </w:r>
       <w:r>
         <w:rPr>
@@ -969,7 +969,7 @@
         <w:rPr>
           <w:noProof/>
         </w:rPr>
-        <w:instrText xml:space="preserve"> PAGEREF _Toc241595876 \h </w:instrText>
+        <w:instrText xml:space="preserve"> PAGEREF _Toc241602197 \h </w:instrText>
       </w:r>
       <w:r>
         <w:rPr>
@@ -1031,7 +1031,7 @@
         <w:rPr>
           <w:noProof/>
         </w:rPr>
-        <w:instrText xml:space="preserve"> PAGEREF _Toc241595877 \h </w:instrText>
+        <w:instrText xml:space="preserve"> PAGEREF _Toc241602198 \h </w:instrText>
       </w:r>
       <w:r>
         <w:rPr>
@@ -1093,7 +1093,7 @@
         <w:rPr>
           <w:noProof/>
         </w:rPr>
-        <w:instrText xml:space="preserve"> PAGEREF _Toc241595878 \h </w:instrText>
+        <w:instrText xml:space="preserve"> PAGEREF _Toc241602199 \h </w:instrText>
       </w:r>
       <w:r>
         <w:rPr>
@@ -1155,7 +1155,7 @@
         <w:rPr>
           <w:noProof/>
         </w:rPr>
-        <w:instrText xml:space="preserve"> PAGEREF _Toc241595879 \h </w:instrText>
+        <w:instrText xml:space="preserve"> PAGEREF _Toc241602200 \h </w:instrText>
       </w:r>
       <w:r>
         <w:rPr>
@@ -1172,7 +1172,7 @@
         <w:rPr>
           <w:noProof/>
         </w:rPr>
-        <w:t>11</w:t>
+        <w:t>12</w:t>
       </w:r>
       <w:r>
         <w:rPr>
@@ -1217,7 +1217,7 @@
         <w:rPr>
           <w:noProof/>
         </w:rPr>
-        <w:instrText xml:space="preserve"> PAGEREF _Toc241595880 \h </w:instrText>
+        <w:instrText xml:space="preserve"> PAGEREF _Toc241602201 \h </w:instrText>
       </w:r>
       <w:r>
         <w:rPr>
@@ -1279,7 +1279,7 @@
         <w:rPr>
           <w:noProof/>
         </w:rPr>
-        <w:instrText xml:space="preserve"> PAGEREF _Toc241595881 \h </w:instrText>
+        <w:instrText xml:space="preserve"> PAGEREF _Toc241602202 \h </w:instrText>
       </w:r>
       <w:r>
         <w:rPr>
@@ -1341,7 +1341,7 @@
         <w:rPr>
           <w:noProof/>
         </w:rPr>
-        <w:instrText xml:space="preserve"> PAGEREF _Toc241595882 \h </w:instrText>
+        <w:instrText xml:space="preserve"> PAGEREF _Toc241602203 \h </w:instrText>
       </w:r>
       <w:r>
         <w:rPr>
@@ -1403,7 +1403,7 @@
         <w:rPr>
           <w:noProof/>
         </w:rPr>
-        <w:instrText xml:space="preserve"> PAGEREF _Toc241595883 \h </w:instrText>
+        <w:instrText xml:space="preserve"> PAGEREF _Toc241602204 \h </w:instrText>
       </w:r>
       <w:r>
         <w:rPr>
@@ -1465,7 +1465,7 @@
         <w:rPr>
           <w:noProof/>
         </w:rPr>
-        <w:instrText xml:space="preserve"> PAGEREF _Toc241595884 \h </w:instrText>
+        <w:instrText xml:space="preserve"> PAGEREF _Toc241602205 \h </w:instrText>
       </w:r>
       <w:r>
         <w:rPr>
@@ -1527,7 +1527,7 @@
         <w:rPr>
           <w:noProof/>
         </w:rPr>
-        <w:instrText xml:space="preserve"> PAGEREF _Toc241595885 \h </w:instrText>
+        <w:instrText xml:space="preserve"> PAGEREF _Toc241602206 \h </w:instrText>
       </w:r>
       <w:r>
         <w:rPr>
@@ -1589,7 +1589,7 @@
         <w:rPr>
           <w:noProof/>
         </w:rPr>
-        <w:instrText xml:space="preserve"> PAGEREF _Toc241595886 \h </w:instrText>
+        <w:instrText xml:space="preserve"> PAGEREF _Toc241602207 \h </w:instrText>
       </w:r>
       <w:r>
         <w:rPr>
@@ -1606,7 +1606,7 @@
         <w:rPr>
           <w:noProof/>
         </w:rPr>
-        <w:t>17</w:t>
+        <w:t>18</w:t>
       </w:r>
       <w:r>
         <w:rPr>
@@ -1651,7 +1651,7 @@
         <w:rPr>
           <w:noProof/>
         </w:rPr>
-        <w:instrText xml:space="preserve"> PAGEREF _Toc241595887 \h </w:instrText>
+        <w:instrText xml:space="preserve"> PAGEREF _Toc241602208 \h </w:instrText>
       </w:r>
       <w:r>
         <w:rPr>
@@ -1713,7 +1713,7 @@
         <w:rPr>
           <w:noProof/>
         </w:rPr>
-        <w:instrText xml:space="preserve"> PAGEREF _Toc241595888 \h </w:instrText>
+        <w:instrText xml:space="preserve"> PAGEREF _Toc241602209 \h </w:instrText>
       </w:r>
       <w:r>
         <w:rPr>
@@ -1775,7 +1775,7 @@
         <w:rPr>
           <w:noProof/>
         </w:rPr>
-        <w:instrText xml:space="preserve"> PAGEREF _Toc241595889 \h </w:instrText>
+        <w:instrText xml:space="preserve"> PAGEREF _Toc241602210 \h </w:instrText>
       </w:r>
       <w:r>
         <w:rPr>
@@ -1838,7 +1838,7 @@
         <w:rPr>
           <w:noProof/>
         </w:rPr>
-        <w:instrText xml:space="preserve"> PAGEREF _Toc241595890 \h </w:instrText>
+        <w:instrText xml:space="preserve"> PAGEREF _Toc241602211 \h </w:instrText>
       </w:r>
       <w:r>
         <w:rPr>
@@ -1900,7 +1900,7 @@
         <w:rPr>
           <w:noProof/>
         </w:rPr>
-        <w:instrText xml:space="preserve"> PAGEREF _Toc241595891 \h </w:instrText>
+        <w:instrText xml:space="preserve"> PAGEREF _Toc241602212 \h </w:instrText>
       </w:r>
       <w:r>
         <w:rPr>
@@ -1917,7 +1917,7 @@
         <w:rPr>
           <w:noProof/>
         </w:rPr>
-        <w:t>19</w:t>
+        <w:t>20</w:t>
       </w:r>
       <w:r>
         <w:rPr>
@@ -1962,7 +1962,7 @@
         <w:rPr>
           <w:noProof/>
         </w:rPr>
-        <w:instrText xml:space="preserve"> PAGEREF _Toc241595892 \h </w:instrText>
+        <w:instrText xml:space="preserve"> PAGEREF _Toc241602213 \h </w:instrText>
       </w:r>
       <w:r>
         <w:rPr>
@@ -2024,7 +2024,7 @@
         <w:rPr>
           <w:noProof/>
         </w:rPr>
-        <w:instrText xml:space="preserve"> PAGEREF _Toc241595893 \h </w:instrText>
+        <w:instrText xml:space="preserve"> PAGEREF _Toc241602214 \h </w:instrText>
       </w:r>
       <w:r>
         <w:rPr>
@@ -2086,7 +2086,7 @@
         <w:rPr>
           <w:noProof/>
         </w:rPr>
-        <w:instrText xml:space="preserve"> PAGEREF _Toc241595894 \h </w:instrText>
+        <w:instrText xml:space="preserve"> PAGEREF _Toc241602215 \h </w:instrText>
       </w:r>
       <w:r>
         <w:rPr>
@@ -2148,7 +2148,7 @@
         <w:rPr>
           <w:noProof/>
         </w:rPr>
-        <w:instrText xml:space="preserve"> PAGEREF _Toc241595895 \h </w:instrText>
+        <w:instrText xml:space="preserve"> PAGEREF _Toc241602216 \h </w:instrText>
       </w:r>
       <w:r>
         <w:rPr>
@@ -2165,7 +2165,7 @@
         <w:rPr>
           <w:noProof/>
         </w:rPr>
-        <w:t>22</w:t>
+        <w:t>23</w:t>
       </w:r>
       <w:r>
         <w:rPr>
@@ -2210,7 +2210,7 @@
         <w:rPr>
           <w:noProof/>
         </w:rPr>
-        <w:instrText xml:space="preserve"> PAGEREF _Toc241595896 \h </w:instrText>
+        <w:instrText xml:space="preserve"> PAGEREF _Toc241602217 \h </w:instrText>
       </w:r>
       <w:r>
         <w:rPr>
@@ -2272,7 +2272,7 @@
         <w:rPr>
           <w:noProof/>
         </w:rPr>
-        <w:instrText xml:space="preserve"> PAGEREF _Toc241595897 \h </w:instrText>
+        <w:instrText xml:space="preserve"> PAGEREF _Toc241602218 \h </w:instrText>
       </w:r>
       <w:r>
         <w:rPr>
@@ -2289,7 +2289,7 @@
         <w:rPr>
           <w:noProof/>
         </w:rPr>
-        <w:t>24</w:t>
+        <w:t>25</w:t>
       </w:r>
       <w:r>
         <w:rPr>
@@ -2319,7 +2319,7 @@
         </w:rPr>
         <w:br w:type="page"/>
       </w:r>
-      <w:bookmarkStart w:id="0" w:name="_Toc241595864"/>
+      <w:bookmarkStart w:id="0" w:name="_Toc241602185"/>
       <w:r>
         <w:rPr>
           <w:rFonts w:eastAsia="Times New Roman"/>
@@ -2459,7 +2459,7 @@
         <w:shd w:val="clear" w:color="auto" w:fill="FFFFFF"/>
         <w:spacing w:line="360" w:lineRule="auto"/>
         <w:jc w:val="both"/>
-        <w:divId w:val="1466311377"/>
+        <w:divId w:val="297498519"/>
         <w:rPr>
           <w:rFonts w:eastAsia="Times New Roman"/>
         </w:rPr>
@@ -2492,7 +2492,7 @@
           <w:rFonts w:eastAsia="Times New Roman"/>
         </w:rPr>
       </w:pPr>
-      <w:bookmarkStart w:id="1" w:name="_Toc241595865"/>
+      <w:bookmarkStart w:id="1" w:name="_Toc241602186"/>
       <w:r>
         <w:rPr>
           <w:rFonts w:eastAsia="Times New Roman"/>
@@ -2518,6 +2518,10 @@
         <w:gridCol w:w="3785"/>
       </w:tblGrid>
       <w:tr>
+        <w:trPr>
+          <w:cantSplit/>
+          <w:tblHeader/>
+        </w:trPr>
         <w:tc>
           <w:tcPr>
             <w:tcW w:w="1200" w:type="pct"/>
@@ -2538,6 +2542,7 @@
           </w:tcPr>
           <w:p>
             <w:pPr>
+              <w:keepNext/>
               <w:spacing w:after="120" w:line="276" w:lineRule="auto"/>
               <w:rPr>
                 <w:rFonts w:eastAsia="Times New Roman"/>
@@ -2579,6 +2584,7 @@
           </w:tcPr>
           <w:p>
             <w:pPr>
+              <w:keepNext/>
               <w:spacing w:after="120" w:line="276" w:lineRule="auto"/>
               <w:rPr>
                 <w:rFonts w:eastAsia="Times New Roman"/>
@@ -2620,6 +2626,7 @@
           </w:tcPr>
           <w:p>
             <w:pPr>
+              <w:keepNext/>
               <w:spacing w:after="120" w:line="276" w:lineRule="auto"/>
               <w:rPr>
                 <w:rFonts w:eastAsia="Times New Roman"/>
@@ -2643,6 +2650,9 @@
         </w:tc>
       </w:tr>
       <w:tr>
+        <w:trPr>
+          <w:cantSplit/>
+        </w:trPr>
         <w:tc>
           <w:tcPr>
             <w:tcW w:w="0" w:type="auto"/>
@@ -2758,6 +2768,9 @@
         </w:tc>
       </w:tr>
       <w:tr>
+        <w:trPr>
+          <w:cantSplit/>
+        </w:trPr>
         <w:tc>
           <w:tcPr>
             <w:tcW w:w="0" w:type="auto"/>
@@ -2873,6 +2886,9 @@
         </w:tc>
       </w:tr>
       <w:tr>
+        <w:trPr>
+          <w:cantSplit/>
+        </w:trPr>
         <w:tc>
           <w:tcPr>
             <w:tcW w:w="0" w:type="auto"/>
@@ -3010,11 +3026,12 @@
           <w:rFonts w:eastAsia="Times New Roman"/>
         </w:rPr>
       </w:pPr>
-      <w:bookmarkStart w:id="2" w:name="_Toc241595866"/>
-      <w:r>
-        <w:rPr>
-          <w:rFonts w:eastAsia="Times New Roman"/>
-        </w:rPr>
+      <w:bookmarkStart w:id="2" w:name="_Toc241602187"/>
+      <w:r>
+        <w:rPr>
+          <w:rFonts w:eastAsia="Times New Roman"/>
+        </w:rPr>
+        <w:lastRenderedPageBreak/>
         <w:t>2. What you need</w:t>
       </w:r>
       <w:bookmarkEnd w:id="2"/>
@@ -3024,7 +3041,6 @@
         <w:pStyle w:val="tcaption"/>
       </w:pPr>
       <w:r>
-        <w:lastRenderedPageBreak/>
         <w:t>Table 1. Requirements</w:t>
       </w:r>
     </w:p>
@@ -3044,6 +3060,10 @@
         <w:gridCol w:w="6488"/>
       </w:tblGrid>
       <w:tr>
+        <w:trPr>
+          <w:cantSplit/>
+          <w:tblHeader/>
+        </w:trPr>
         <w:tc>
           <w:tcPr>
             <w:tcW w:w="1400" w:type="pct"/>
@@ -3064,6 +3084,7 @@
           </w:tcPr>
           <w:p>
             <w:pPr>
+              <w:keepNext/>
               <w:spacing w:after="120" w:line="276" w:lineRule="auto"/>
               <w:rPr>
                 <w:rFonts w:eastAsia="Times New Roman"/>
@@ -3105,6 +3126,7 @@
           </w:tcPr>
           <w:p>
             <w:pPr>
+              <w:keepNext/>
               <w:spacing w:after="120" w:line="276" w:lineRule="auto"/>
               <w:rPr>
                 <w:rFonts w:eastAsia="Times New Roman"/>
@@ -3128,6 +3150,9 @@
         </w:tc>
       </w:tr>
       <w:tr>
+        <w:trPr>
+          <w:cantSplit/>
+        </w:trPr>
         <w:tc>
           <w:tcPr>
             <w:tcW w:w="0" w:type="auto"/>
@@ -3204,6 +3229,9 @@
         </w:tc>
       </w:tr>
       <w:tr>
+        <w:trPr>
+          <w:cantSplit/>
+        </w:trPr>
         <w:tc>
           <w:tcPr>
             <w:tcW w:w="0" w:type="auto"/>
@@ -3298,6 +3326,9 @@
         </w:tc>
       </w:tr>
       <w:tr>
+        <w:trPr>
+          <w:cantSplit/>
+        </w:trPr>
         <w:tc>
           <w:tcPr>
             <w:tcW w:w="0" w:type="auto"/>
@@ -3374,6 +3405,9 @@
         </w:tc>
       </w:tr>
       <w:tr>
+        <w:trPr>
+          <w:cantSplit/>
+        </w:trPr>
         <w:tc>
           <w:tcPr>
             <w:tcW w:w="0" w:type="auto"/>
@@ -3465,6 +3499,9 @@
         </w:tc>
       </w:tr>
       <w:tr>
+        <w:trPr>
+          <w:cantSplit/>
+        </w:trPr>
         <w:tc>
           <w:tcPr>
             <w:tcW w:w="0" w:type="auto"/>
@@ -3541,6 +3578,9 @@
         </w:tc>
       </w:tr>
       <w:tr>
+        <w:trPr>
+          <w:cantSplit/>
+        </w:trPr>
         <w:tc>
           <w:tcPr>
             <w:tcW w:w="0" w:type="auto"/>
@@ -3624,7 +3664,7 @@
           <w:rFonts w:eastAsia="Times New Roman"/>
         </w:rPr>
       </w:pPr>
-      <w:bookmarkStart w:id="3" w:name="_Toc241595867"/>
+      <w:bookmarkStart w:id="3" w:name="_Toc241602188"/>
       <w:r>
         <w:rPr>
           <w:rFonts w:eastAsia="Times New Roman"/>
@@ -3640,7 +3680,7 @@
           <w:rFonts w:eastAsia="Times New Roman"/>
         </w:rPr>
       </w:pPr>
-      <w:bookmarkStart w:id="4" w:name="_Toc241595868"/>
+      <w:bookmarkStart w:id="4" w:name="_Toc241602189"/>
       <w:r>
         <w:rPr>
           <w:rFonts w:eastAsia="Times New Roman"/>
@@ -3846,7 +3886,7 @@
           <w:rFonts w:eastAsia="Times New Roman"/>
         </w:rPr>
       </w:pPr>
-      <w:bookmarkStart w:id="5" w:name="_Toc241595869"/>
+      <w:bookmarkStart w:id="5" w:name="_Toc241602190"/>
       <w:r>
         <w:rPr>
           <w:rFonts w:eastAsia="Times New Roman"/>
@@ -4062,11 +4102,12 @@
           <w:rFonts w:eastAsia="Times New Roman"/>
         </w:rPr>
       </w:pPr>
-      <w:bookmarkStart w:id="6" w:name="_Toc241595870"/>
-      <w:r>
-        <w:rPr>
-          <w:rFonts w:eastAsia="Times New Roman"/>
-        </w:rPr>
+      <w:bookmarkStart w:id="6" w:name="_Toc241602191"/>
+      <w:r>
+        <w:rPr>
+          <w:rFonts w:eastAsia="Times New Roman"/>
+        </w:rPr>
+        <w:lastRenderedPageBreak/>
         <w:t>3.3 Check the installation</w:t>
       </w:r>
       <w:bookmarkEnd w:id="6"/>
@@ -4087,7 +4128,6 @@
         <w:rPr>
           <w:rFonts w:eastAsia="Times New Roman"/>
         </w:rPr>
-        <w:lastRenderedPageBreak/>
         <w:t xml:space="preserve">Open a terminal: on Windows, open the </w:t>
       </w:r>
       <w:r>
@@ -4178,7 +4218,7 @@
         <w:shd w:val="clear" w:color="auto" w:fill="FFFFFF"/>
         <w:spacing w:line="360" w:lineRule="auto"/>
         <w:jc w:val="both"/>
-        <w:divId w:val="1250701972"/>
+        <w:divId w:val="1807508152"/>
         <w:rPr>
           <w:rFonts w:eastAsia="Times New Roman"/>
         </w:rPr>
@@ -4197,7 +4237,7 @@
           <w:rFonts w:eastAsia="Times New Roman"/>
         </w:rPr>
       </w:pPr>
-      <w:bookmarkStart w:id="7" w:name="_Toc241595871"/>
+      <w:bookmarkStart w:id="7" w:name="_Toc241602192"/>
       <w:r>
         <w:rPr>
           <w:rFonts w:eastAsia="Times New Roman"/>
@@ -4213,7 +4253,7 @@
           <w:rFonts w:eastAsia="Times New Roman"/>
         </w:rPr>
       </w:pPr>
-      <w:bookmarkStart w:id="8" w:name="_Toc241595872"/>
+      <w:bookmarkStart w:id="8" w:name="_Toc241602193"/>
       <w:r>
         <w:rPr>
           <w:rFonts w:eastAsia="Times New Roman"/>
@@ -4455,7 +4495,7 @@
         <w:shd w:val="clear" w:color="auto" w:fill="FFFFFF"/>
         <w:spacing w:line="360" w:lineRule="auto"/>
         <w:jc w:val="both"/>
-        <w:divId w:val="1661349307"/>
+        <w:divId w:val="2118596888"/>
         <w:rPr>
           <w:rFonts w:eastAsia="Times New Roman"/>
         </w:rPr>
@@ -4487,7 +4527,7 @@
         <w:shd w:val="clear" w:color="auto" w:fill="FFFFFF"/>
         <w:spacing w:line="360" w:lineRule="auto"/>
         <w:jc w:val="both"/>
-        <w:divId w:val="2028093040"/>
+        <w:divId w:val="1420367874"/>
         <w:rPr>
           <w:rFonts w:eastAsia="Times New Roman"/>
         </w:rPr>
@@ -4518,7 +4558,7 @@
           <w:rFonts w:eastAsia="Times New Roman"/>
         </w:rPr>
       </w:pPr>
-      <w:bookmarkStart w:id="9" w:name="_Toc241595873"/>
+      <w:bookmarkStart w:id="9" w:name="_Toc241602194"/>
       <w:r>
         <w:rPr>
           <w:rFonts w:eastAsia="Times New Roman"/>
@@ -4596,7 +4636,7 @@
           <w:rFonts w:eastAsia="Times New Roman"/>
         </w:rPr>
       </w:pPr>
-      <w:bookmarkStart w:id="10" w:name="_Toc241595874"/>
+      <w:bookmarkStart w:id="10" w:name="_Toc241602195"/>
       <w:r>
         <w:rPr>
           <w:rFonts w:eastAsia="Times New Roman"/>
@@ -4615,7 +4655,7 @@
           <w:noProof/>
         </w:rPr>
         <w:drawing>
-          <wp:inline distT="0" distB="0" distL="0" distR="0" wp14:anchorId="0F20203B" wp14:editId="553879FB">
+          <wp:inline distT="0" distB="0" distL="0" distR="0" wp14:anchorId="487D7C25" wp14:editId="0EB2B2D8">
             <wp:extent cx="5332730" cy="3524885"/>
             <wp:effectExtent l="0" t="0" r="1270" b="0"/>
             <wp:docPr id="2" name="Picture 2"/>
@@ -4785,7 +4825,7 @@
           <w:noProof/>
         </w:rPr>
         <w:drawing>
-          <wp:inline distT="0" distB="0" distL="0" distR="0" wp14:anchorId="1E5D670A" wp14:editId="7BCCFF5B">
+          <wp:inline distT="0" distB="0" distL="0" distR="0" wp14:anchorId="402419D4" wp14:editId="01BDC4A8">
             <wp:extent cx="5143500" cy="2990215"/>
             <wp:effectExtent l="0" t="0" r="0" b="635"/>
             <wp:docPr id="3" name="Picture 3"/>
@@ -4850,7 +4890,7 @@
           <w:rFonts w:eastAsia="Times New Roman"/>
         </w:rPr>
       </w:pPr>
-      <w:bookmarkStart w:id="11" w:name="_Toc241595875"/>
+      <w:bookmarkStart w:id="11" w:name="_Toc241602196"/>
       <w:r>
         <w:rPr>
           <w:rFonts w:eastAsia="Times New Roman"/>
@@ -4908,7 +4948,7 @@
         </w:rPr>
         <w:lastRenderedPageBreak/>
         <w:drawing>
-          <wp:inline distT="0" distB="0" distL="0" distR="0" wp14:anchorId="33EC7EA6" wp14:editId="644BA0F4">
+          <wp:inline distT="0" distB="0" distL="0" distR="0" wp14:anchorId="40EC0987" wp14:editId="4477D7DB">
             <wp:extent cx="4954270" cy="7601585"/>
             <wp:effectExtent l="0" t="0" r="0" b="0"/>
             <wp:docPr id="4" name="Picture 4"/>
@@ -4971,6 +5011,7 @@
         <w:pStyle w:val="tcaption"/>
       </w:pPr>
       <w:r>
+        <w:lastRenderedPageBreak/>
         <w:t>Table 2. Input fields</w:t>
       </w:r>
     </w:p>
@@ -4992,6 +5033,10 @@
         <w:gridCol w:w="2703"/>
       </w:tblGrid>
       <w:tr>
+        <w:trPr>
+          <w:cantSplit/>
+          <w:tblHeader/>
+        </w:trPr>
         <w:tc>
           <w:tcPr>
             <w:tcW w:w="850" w:type="pct"/>
@@ -5012,6 +5057,7 @@
           </w:tcPr>
           <w:p>
             <w:pPr>
+              <w:keepNext/>
               <w:spacing w:after="120" w:line="276" w:lineRule="auto"/>
               <w:rPr>
                 <w:rFonts w:eastAsia="Times New Roman"/>
@@ -5053,6 +5099,7 @@
           </w:tcPr>
           <w:p>
             <w:pPr>
+              <w:keepNext/>
               <w:spacing w:after="120" w:line="276" w:lineRule="auto"/>
               <w:rPr>
                 <w:rFonts w:eastAsia="Times New Roman"/>
@@ -5094,6 +5141,7 @@
           </w:tcPr>
           <w:p>
             <w:pPr>
+              <w:keepNext/>
               <w:spacing w:after="120" w:line="276" w:lineRule="auto"/>
               <w:rPr>
                 <w:rFonts w:eastAsia="Times New Roman"/>
@@ -5135,6 +5183,7 @@
           </w:tcPr>
           <w:p>
             <w:pPr>
+              <w:keepNext/>
               <w:spacing w:after="120" w:line="276" w:lineRule="auto"/>
               <w:rPr>
                 <w:rFonts w:eastAsia="Times New Roman"/>
@@ -5158,40 +5207,42 @@
         </w:tc>
       </w:tr>
       <w:tr>
-        <w:tc>
-          <w:tcPr>
-            <w:tcW w:w="0" w:type="auto"/>
-            <w:tcBorders>
-              <w:top w:val="single" w:sz="6" w:space="0" w:color="000000"/>
-              <w:left w:val="single" w:sz="6" w:space="0" w:color="000000"/>
-              <w:bottom w:val="single" w:sz="6" w:space="0" w:color="000000"/>
-              <w:right w:val="single" w:sz="6" w:space="0" w:color="000000"/>
-            </w:tcBorders>
-            <w:shd w:val="clear" w:color="auto" w:fill="FFFFFF"/>
-            <w:tcMar>
-              <w:top w:w="45" w:type="dxa"/>
-              <w:left w:w="75" w:type="dxa"/>
-              <w:bottom w:w="45" w:type="dxa"/>
-              <w:right w:w="75" w:type="dxa"/>
-            </w:tcMar>
-            <w:hideMark/>
-          </w:tcPr>
-          <w:p>
-            <w:pPr>
-              <w:spacing w:after="120" w:line="276" w:lineRule="auto"/>
-              <w:rPr>
-                <w:rFonts w:eastAsia="Times New Roman"/>
-                <w:sz w:val="20"/>
-                <w:szCs w:val="20"/>
-              </w:rPr>
-            </w:pPr>
-            <w:r>
-              <w:rPr>
-                <w:rFonts w:eastAsia="Times New Roman"/>
-                <w:sz w:val="20"/>
-                <w:szCs w:val="20"/>
-              </w:rPr>
-              <w:lastRenderedPageBreak/>
+        <w:trPr>
+          <w:cantSplit/>
+        </w:trPr>
+        <w:tc>
+          <w:tcPr>
+            <w:tcW w:w="0" w:type="auto"/>
+            <w:tcBorders>
+              <w:top w:val="single" w:sz="6" w:space="0" w:color="000000"/>
+              <w:left w:val="single" w:sz="6" w:space="0" w:color="000000"/>
+              <w:bottom w:val="single" w:sz="6" w:space="0" w:color="000000"/>
+              <w:right w:val="single" w:sz="6" w:space="0" w:color="000000"/>
+            </w:tcBorders>
+            <w:shd w:val="clear" w:color="auto" w:fill="FFFFFF"/>
+            <w:tcMar>
+              <w:top w:w="45" w:type="dxa"/>
+              <w:left w:w="75" w:type="dxa"/>
+              <w:bottom w:w="45" w:type="dxa"/>
+              <w:right w:w="75" w:type="dxa"/>
+            </w:tcMar>
+            <w:hideMark/>
+          </w:tcPr>
+          <w:p>
+            <w:pPr>
+              <w:spacing w:after="120" w:line="276" w:lineRule="auto"/>
+              <w:rPr>
+                <w:rFonts w:eastAsia="Times New Roman"/>
+                <w:sz w:val="20"/>
+                <w:szCs w:val="20"/>
+              </w:rPr>
+            </w:pPr>
+            <w:r>
+              <w:rPr>
+                <w:rFonts w:eastAsia="Times New Roman"/>
+                <w:sz w:val="20"/>
+                <w:szCs w:val="20"/>
+              </w:rPr>
               <w:t>Refractive index (RI)</w:t>
             </w:r>
           </w:p>
@@ -5350,6 +5401,9 @@
         </w:tc>
       </w:tr>
       <w:tr>
+        <w:trPr>
+          <w:cantSplit/>
+        </w:trPr>
         <w:tc>
           <w:tcPr>
             <w:tcW w:w="0" w:type="auto"/>
@@ -5515,6 +5569,9 @@
         </w:tc>
       </w:tr>
       <w:tr>
+        <w:trPr>
+          <w:cantSplit/>
+        </w:trPr>
         <w:tc>
           <w:tcPr>
             <w:tcW w:w="0" w:type="auto"/>
@@ -5737,6 +5794,9 @@
         </w:tc>
       </w:tr>
       <w:tr>
+        <w:trPr>
+          <w:cantSplit/>
+        </w:trPr>
         <w:tc>
           <w:tcPr>
             <w:tcW w:w="0" w:type="auto"/>
@@ -5887,6 +5947,9 @@
         </w:tc>
       </w:tr>
       <w:tr>
+        <w:trPr>
+          <w:cantSplit/>
+        </w:trPr>
         <w:tc>
           <w:tcPr>
             <w:tcW w:w="0" w:type="auto"/>
@@ -6055,6 +6118,9 @@
         </w:tc>
       </w:tr>
       <w:tr>
+        <w:trPr>
+          <w:cantSplit/>
+        </w:trPr>
         <w:tc>
           <w:tcPr>
             <w:tcW w:w="0" w:type="auto"/>
@@ -6258,7 +6324,7 @@
           <w:rFonts w:eastAsia="Times New Roman"/>
         </w:rPr>
       </w:pPr>
-      <w:bookmarkStart w:id="12" w:name="_Toc241595876"/>
+      <w:bookmarkStart w:id="12" w:name="_Toc241602197"/>
       <w:r>
         <w:rPr>
           <w:rFonts w:eastAsia="Times New Roman"/>
@@ -6416,7 +6482,7 @@
           <w:noProof/>
         </w:rPr>
         <w:drawing>
-          <wp:inline distT="0" distB="0" distL="0" distR="0" wp14:anchorId="71B8E441" wp14:editId="65F2902F">
+          <wp:inline distT="0" distB="0" distL="0" distR="0" wp14:anchorId="520C05CF" wp14:editId="34B1D553">
             <wp:extent cx="5143500" cy="3152140"/>
             <wp:effectExtent l="0" t="0" r="0" b="0"/>
             <wp:docPr id="5" name="Picture 5"/>
@@ -6539,7 +6605,7 @@
           <w:rFonts w:eastAsia="Times New Roman"/>
         </w:rPr>
       </w:pPr>
-      <w:bookmarkStart w:id="13" w:name="_Toc241595877"/>
+      <w:bookmarkStart w:id="13" w:name="_Toc241602198"/>
       <w:r>
         <w:rPr>
           <w:rFonts w:eastAsia="Times New Roman"/>
@@ -6555,7 +6621,7 @@
           <w:rFonts w:eastAsia="Times New Roman"/>
         </w:rPr>
       </w:pPr>
-      <w:bookmarkStart w:id="14" w:name="_Toc241595878"/>
+      <w:bookmarkStart w:id="14" w:name="_Toc241602199"/>
       <w:r>
         <w:rPr>
           <w:rFonts w:eastAsia="Times New Roman"/>
@@ -6642,11 +6708,12 @@
           <w:rFonts w:eastAsia="Times New Roman"/>
         </w:rPr>
       </w:pPr>
-      <w:bookmarkStart w:id="15" w:name="_Toc241595879"/>
-      <w:r>
-        <w:rPr>
-          <w:rFonts w:eastAsia="Times New Roman"/>
-        </w:rPr>
+      <w:bookmarkStart w:id="15" w:name="_Toc241602200"/>
+      <w:r>
+        <w:rPr>
+          <w:rFonts w:eastAsia="Times New Roman"/>
+        </w:rPr>
+        <w:lastRenderedPageBreak/>
         <w:t>7.2 Reading the result</w:t>
       </w:r>
       <w:bookmarkEnd w:id="15"/>
@@ -6660,9 +6727,8 @@
         <w:rPr>
           <w:noProof/>
         </w:rPr>
-        <w:lastRenderedPageBreak/>
         <w:drawing>
-          <wp:inline distT="0" distB="0" distL="0" distR="0" wp14:anchorId="381B9AC3" wp14:editId="0980B53F">
+          <wp:inline distT="0" distB="0" distL="0" distR="0" wp14:anchorId="02590B65" wp14:editId="6F9B4F9E">
             <wp:extent cx="4095750" cy="3286125"/>
             <wp:effectExtent l="0" t="0" r="0" b="9525"/>
             <wp:docPr id="6" name="Picture 6"/>
@@ -6744,6 +6810,10 @@
         <w:gridCol w:w="6668"/>
       </w:tblGrid>
       <w:tr>
+        <w:trPr>
+          <w:cantSplit/>
+          <w:tblHeader/>
+        </w:trPr>
         <w:tc>
           <w:tcPr>
             <w:tcW w:w="1300" w:type="pct"/>
@@ -6764,6 +6834,7 @@
           </w:tcPr>
           <w:p>
             <w:pPr>
+              <w:keepNext/>
               <w:spacing w:after="120" w:line="276" w:lineRule="auto"/>
               <w:rPr>
                 <w:rFonts w:eastAsia="Times New Roman"/>
@@ -6805,6 +6876,7 @@
           </w:tcPr>
           <w:p>
             <w:pPr>
+              <w:keepNext/>
               <w:spacing w:after="120" w:line="276" w:lineRule="auto"/>
               <w:rPr>
                 <w:rFonts w:eastAsia="Times New Roman"/>
@@ -6828,6 +6900,9 @@
         </w:tc>
       </w:tr>
       <w:tr>
+        <w:trPr>
+          <w:cantSplit/>
+        </w:trPr>
         <w:tc>
           <w:tcPr>
             <w:tcW w:w="0" w:type="auto"/>
@@ -6922,6 +6997,9 @@
         </w:tc>
       </w:tr>
       <w:tr>
+        <w:trPr>
+          <w:cantSplit/>
+        </w:trPr>
         <w:tc>
           <w:tcPr>
             <w:tcW w:w="0" w:type="auto"/>
@@ -7044,6 +7122,9 @@
         </w:tc>
       </w:tr>
       <w:tr>
+        <w:trPr>
+          <w:cantSplit/>
+        </w:trPr>
         <w:tc>
           <w:tcPr>
             <w:tcW w:w="0" w:type="auto"/>
@@ -7236,6 +7317,9 @@
         </w:tc>
       </w:tr>
       <w:tr>
+        <w:trPr>
+          <w:cantSplit/>
+        </w:trPr>
         <w:tc>
           <w:tcPr>
             <w:tcW w:w="0" w:type="auto"/>
@@ -7430,6 +7514,9 @@
         </w:tc>
       </w:tr>
       <w:tr>
+        <w:trPr>
+          <w:cantSplit/>
+        </w:trPr>
         <w:tc>
           <w:tcPr>
             <w:tcW w:w="0" w:type="auto"/>
@@ -7506,6 +7593,9 @@
         </w:tc>
       </w:tr>
       <w:tr>
+        <w:trPr>
+          <w:cantSplit/>
+        </w:trPr>
         <w:tc>
           <w:tcPr>
             <w:tcW w:w="0" w:type="auto"/>
@@ -7582,6 +7672,9 @@
         </w:tc>
       </w:tr>
       <w:tr>
+        <w:trPr>
+          <w:cantSplit/>
+        </w:trPr>
         <w:tc>
           <w:tcPr>
             <w:tcW w:w="0" w:type="auto"/>
@@ -7658,6 +7751,9 @@
         </w:tc>
       </w:tr>
       <w:tr>
+        <w:trPr>
+          <w:cantSplit/>
+        </w:trPr>
         <w:tc>
           <w:tcPr>
             <w:tcW w:w="0" w:type="auto"/>
@@ -7734,39 +7830,43 @@
         </w:tc>
       </w:tr>
       <w:tr>
-        <w:tc>
-          <w:tcPr>
-            <w:tcW w:w="0" w:type="auto"/>
-            <w:tcBorders>
-              <w:top w:val="single" w:sz="6" w:space="0" w:color="000000"/>
-              <w:left w:val="single" w:sz="6" w:space="0" w:color="000000"/>
-              <w:bottom w:val="single" w:sz="6" w:space="0" w:color="000000"/>
-              <w:right w:val="single" w:sz="6" w:space="0" w:color="000000"/>
-            </w:tcBorders>
-            <w:shd w:val="clear" w:color="auto" w:fill="FFFFFF"/>
-            <w:tcMar>
-              <w:top w:w="45" w:type="dxa"/>
-              <w:left w:w="75" w:type="dxa"/>
-              <w:bottom w:w="45" w:type="dxa"/>
-              <w:right w:w="75" w:type="dxa"/>
-            </w:tcMar>
-            <w:hideMark/>
-          </w:tcPr>
-          <w:p>
-            <w:pPr>
-              <w:spacing w:after="120" w:line="276" w:lineRule="auto"/>
-              <w:rPr>
-                <w:rFonts w:eastAsia="Times New Roman"/>
-                <w:sz w:val="20"/>
-                <w:szCs w:val="20"/>
-              </w:rPr>
-            </w:pPr>
-            <w:r>
-              <w:rPr>
-                <w:rFonts w:eastAsia="Times New Roman"/>
-                <w:sz w:val="20"/>
-                <w:szCs w:val="20"/>
-              </w:rPr>
+        <w:trPr>
+          <w:cantSplit/>
+        </w:trPr>
+        <w:tc>
+          <w:tcPr>
+            <w:tcW w:w="0" w:type="auto"/>
+            <w:tcBorders>
+              <w:top w:val="single" w:sz="6" w:space="0" w:color="000000"/>
+              <w:left w:val="single" w:sz="6" w:space="0" w:color="000000"/>
+              <w:bottom w:val="single" w:sz="6" w:space="0" w:color="000000"/>
+              <w:right w:val="single" w:sz="6" w:space="0" w:color="000000"/>
+            </w:tcBorders>
+            <w:shd w:val="clear" w:color="auto" w:fill="FFFFFF"/>
+            <w:tcMar>
+              <w:top w:w="45" w:type="dxa"/>
+              <w:left w:w="75" w:type="dxa"/>
+              <w:bottom w:w="45" w:type="dxa"/>
+              <w:right w:w="75" w:type="dxa"/>
+            </w:tcMar>
+            <w:hideMark/>
+          </w:tcPr>
+          <w:p>
+            <w:pPr>
+              <w:spacing w:after="120" w:line="276" w:lineRule="auto"/>
+              <w:rPr>
+                <w:rFonts w:eastAsia="Times New Roman"/>
+                <w:sz w:val="20"/>
+                <w:szCs w:val="20"/>
+              </w:rPr>
+            </w:pPr>
+            <w:r>
+              <w:rPr>
+                <w:rFonts w:eastAsia="Times New Roman"/>
+                <w:sz w:val="20"/>
+                <w:szCs w:val="20"/>
+              </w:rPr>
+              <w:lastRenderedPageBreak/>
               <w:t>About (gem)</w:t>
             </w:r>
           </w:p>
@@ -7810,40 +7910,42 @@
         </w:tc>
       </w:tr>
       <w:tr>
-        <w:tc>
-          <w:tcPr>
-            <w:tcW w:w="0" w:type="auto"/>
-            <w:tcBorders>
-              <w:top w:val="single" w:sz="6" w:space="0" w:color="000000"/>
-              <w:left w:val="single" w:sz="6" w:space="0" w:color="000000"/>
-              <w:bottom w:val="single" w:sz="6" w:space="0" w:color="000000"/>
-              <w:right w:val="single" w:sz="6" w:space="0" w:color="000000"/>
-            </w:tcBorders>
-            <w:shd w:val="clear" w:color="auto" w:fill="FFFFFF"/>
-            <w:tcMar>
-              <w:top w:w="45" w:type="dxa"/>
-              <w:left w:w="75" w:type="dxa"/>
-              <w:bottom w:w="45" w:type="dxa"/>
-              <w:right w:w="75" w:type="dxa"/>
-            </w:tcMar>
-            <w:hideMark/>
-          </w:tcPr>
-          <w:p>
-            <w:pPr>
-              <w:spacing w:after="120" w:line="276" w:lineRule="auto"/>
-              <w:rPr>
-                <w:rFonts w:eastAsia="Times New Roman"/>
-                <w:sz w:val="20"/>
-                <w:szCs w:val="20"/>
-              </w:rPr>
-            </w:pPr>
-            <w:r>
-              <w:rPr>
-                <w:rFonts w:eastAsia="Times New Roman"/>
-                <w:sz w:val="20"/>
-                <w:szCs w:val="20"/>
-              </w:rPr>
-              <w:lastRenderedPageBreak/>
+        <w:trPr>
+          <w:cantSplit/>
+        </w:trPr>
+        <w:tc>
+          <w:tcPr>
+            <w:tcW w:w="0" w:type="auto"/>
+            <w:tcBorders>
+              <w:top w:val="single" w:sz="6" w:space="0" w:color="000000"/>
+              <w:left w:val="single" w:sz="6" w:space="0" w:color="000000"/>
+              <w:bottom w:val="single" w:sz="6" w:space="0" w:color="000000"/>
+              <w:right w:val="single" w:sz="6" w:space="0" w:color="000000"/>
+            </w:tcBorders>
+            <w:shd w:val="clear" w:color="auto" w:fill="FFFFFF"/>
+            <w:tcMar>
+              <w:top w:w="45" w:type="dxa"/>
+              <w:left w:w="75" w:type="dxa"/>
+              <w:bottom w:w="45" w:type="dxa"/>
+              <w:right w:w="75" w:type="dxa"/>
+            </w:tcMar>
+            <w:hideMark/>
+          </w:tcPr>
+          <w:p>
+            <w:pPr>
+              <w:spacing w:after="120" w:line="276" w:lineRule="auto"/>
+              <w:rPr>
+                <w:rFonts w:eastAsia="Times New Roman"/>
+                <w:sz w:val="20"/>
+                <w:szCs w:val="20"/>
+              </w:rPr>
+            </w:pPr>
+            <w:r>
+              <w:rPr>
+                <w:rFonts w:eastAsia="Times New Roman"/>
+                <w:sz w:val="20"/>
+                <w:szCs w:val="20"/>
+              </w:rPr>
               <w:t>Technical trace</w:t>
             </w:r>
           </w:p>
@@ -7887,6 +7989,9 @@
         </w:tc>
       </w:tr>
       <w:tr>
+        <w:trPr>
+          <w:cantSplit/>
+        </w:trPr>
         <w:tc>
           <w:tcPr>
             <w:tcW w:w="0" w:type="auto"/>
@@ -8024,7 +8129,7 @@
           <w:rFonts w:eastAsia="Times New Roman"/>
         </w:rPr>
       </w:pPr>
-      <w:bookmarkStart w:id="16" w:name="_Toc241595880"/>
+      <w:bookmarkStart w:id="16" w:name="_Toc241602201"/>
       <w:r>
         <w:rPr>
           <w:rFonts w:eastAsia="Times New Roman"/>
@@ -8043,7 +8148,7 @@
           <w:noProof/>
         </w:rPr>
         <w:drawing>
-          <wp:inline distT="0" distB="0" distL="0" distR="0" wp14:anchorId="09E156C3" wp14:editId="3A84EEAD">
+          <wp:inline distT="0" distB="0" distL="0" distR="0" wp14:anchorId="62190BFB" wp14:editId="2F182CF8">
             <wp:extent cx="4095750" cy="4268470"/>
             <wp:effectExtent l="0" t="0" r="0" b="0"/>
             <wp:docPr id="7" name="Picture 7"/>
@@ -8209,6 +8314,7 @@
         <w:pStyle w:val="NormalWeb"/>
       </w:pPr>
       <w:r>
+        <w:lastRenderedPageBreak/>
         <w:t>Hover the mouse over any box to see its full details.</w:t>
       </w:r>
     </w:p>
@@ -8219,12 +8325,11 @@
           <w:rFonts w:eastAsia="Times New Roman"/>
         </w:rPr>
       </w:pPr>
-      <w:bookmarkStart w:id="17" w:name="_Toc241595881"/>
-      <w:r>
-        <w:rPr>
-          <w:rFonts w:eastAsia="Times New Roman"/>
-        </w:rPr>
-        <w:lastRenderedPageBreak/>
+      <w:bookmarkStart w:id="17" w:name="_Toc241602202"/>
+      <w:r>
+        <w:rPr>
+          <w:rFonts w:eastAsia="Times New Roman"/>
+        </w:rPr>
         <w:t>7.4 When some data is missing</w:t>
       </w:r>
       <w:bookmarkEnd w:id="17"/>
@@ -8275,7 +8380,7 @@
           <w:noProof/>
         </w:rPr>
         <w:drawing>
-          <wp:inline distT="0" distB="0" distL="0" distR="0" wp14:anchorId="79A3E428" wp14:editId="43B674BC">
+          <wp:inline distT="0" distB="0" distL="0" distR="0" wp14:anchorId="34175BDC" wp14:editId="0C85DBBB">
             <wp:extent cx="4095750" cy="4534535"/>
             <wp:effectExtent l="0" t="0" r="0" b="0"/>
             <wp:docPr id="8" name="Picture 8"/>
@@ -8340,7 +8445,7 @@
           <w:rFonts w:eastAsia="Times New Roman"/>
         </w:rPr>
       </w:pPr>
-      <w:bookmarkStart w:id="18" w:name="_Toc241595882"/>
+      <w:bookmarkStart w:id="18" w:name="_Toc241602203"/>
       <w:r>
         <w:rPr>
           <w:rFonts w:eastAsia="Times New Roman"/>
@@ -8431,6 +8536,7 @@
         <w:rPr>
           <w:rFonts w:eastAsia="Times New Roman"/>
         </w:rPr>
+        <w:lastRenderedPageBreak/>
         <w:t xml:space="preserve">Press </w:t>
       </w:r>
       <w:r>
@@ -8453,7 +8559,6 @@
         <w:pStyle w:val="NormalWeb"/>
       </w:pPr>
       <w:r>
-        <w:lastRenderedPageBreak/>
         <w:t xml:space="preserve">The answer is a clear </w:t>
       </w:r>
       <w:r>
@@ -8520,7 +8625,7 @@
           <w:noProof/>
         </w:rPr>
         <w:drawing>
-          <wp:inline distT="0" distB="0" distL="0" distR="0" wp14:anchorId="5ED6B2B4" wp14:editId="071C2A61">
+          <wp:inline distT="0" distB="0" distL="0" distR="0" wp14:anchorId="4DE51258" wp14:editId="65243501">
             <wp:extent cx="4095750" cy="2180590"/>
             <wp:effectExtent l="0" t="0" r="0" b="0"/>
             <wp:docPr id="9" name="Picture 9"/>
@@ -8585,7 +8690,7 @@
           <w:rFonts w:eastAsia="Times New Roman"/>
         </w:rPr>
       </w:pPr>
-      <w:bookmarkStart w:id="19" w:name="_Toc241595883"/>
+      <w:bookmarkStart w:id="19" w:name="_Toc241602204"/>
       <w:r>
         <w:rPr>
           <w:rFonts w:eastAsia="Times New Roman"/>
@@ -8843,7 +8948,7 @@
         </w:rPr>
         <w:lastRenderedPageBreak/>
         <w:drawing>
-          <wp:inline distT="0" distB="0" distL="0" distR="0" wp14:anchorId="274E3872" wp14:editId="557F0F42">
+          <wp:inline distT="0" distB="0" distL="0" distR="0" wp14:anchorId="068F38B4" wp14:editId="2AACED07">
             <wp:extent cx="4095750" cy="2847340"/>
             <wp:effectExtent l="0" t="0" r="0" b="0"/>
             <wp:docPr id="10" name="Picture 10"/>
@@ -8906,7 +9011,7 @@
         <w:shd w:val="clear" w:color="auto" w:fill="FFFFFF"/>
         <w:spacing w:line="360" w:lineRule="auto"/>
         <w:jc w:val="both"/>
-        <w:divId w:val="781149747"/>
+        <w:divId w:val="1494223715"/>
         <w:rPr>
           <w:rFonts w:eastAsia="Times New Roman"/>
         </w:rPr>
@@ -8939,7 +9044,7 @@
           <w:rFonts w:eastAsia="Times New Roman"/>
         </w:rPr>
       </w:pPr>
-      <w:bookmarkStart w:id="20" w:name="_Toc241595884"/>
+      <w:bookmarkStart w:id="20" w:name="_Toc241602205"/>
       <w:r>
         <w:rPr>
           <w:rFonts w:eastAsia="Times New Roman"/>
@@ -9069,7 +9174,7 @@
         </w:rPr>
         <w:lastRenderedPageBreak/>
         <w:drawing>
-          <wp:inline distT="0" distB="0" distL="0" distR="0" wp14:anchorId="45E84BB0" wp14:editId="67AEE36C">
+          <wp:inline distT="0" distB="0" distL="0" distR="0" wp14:anchorId="05245EC2" wp14:editId="04CBCD6C">
             <wp:extent cx="4095750" cy="2142490"/>
             <wp:effectExtent l="0" t="0" r="0" b="0"/>
             <wp:docPr id="11" name="Picture 11"/>
@@ -9134,7 +9239,7 @@
           <w:rFonts w:eastAsia="Times New Roman"/>
         </w:rPr>
       </w:pPr>
-      <w:bookmarkStart w:id="21" w:name="_Toc241595885"/>
+      <w:bookmarkStart w:id="21" w:name="_Toc241602206"/>
       <w:r>
         <w:rPr>
           <w:rFonts w:eastAsia="Times New Roman"/>
@@ -9201,7 +9306,7 @@
           <w:noProof/>
         </w:rPr>
         <w:drawing>
-          <wp:inline distT="0" distB="0" distL="0" distR="0" wp14:anchorId="22C4BA6A" wp14:editId="1533D96A">
+          <wp:inline distT="0" distB="0" distL="0" distR="0" wp14:anchorId="315643E6" wp14:editId="580A5452">
             <wp:extent cx="5143500" cy="3333115"/>
             <wp:effectExtent l="0" t="0" r="0" b="635"/>
             <wp:docPr id="12" name="Picture 12"/>
@@ -9284,11 +9389,12 @@
           <w:rFonts w:eastAsia="Times New Roman"/>
         </w:rPr>
       </w:pPr>
-      <w:bookmarkStart w:id="22" w:name="_Toc241595886"/>
-      <w:r>
-        <w:rPr>
-          <w:rFonts w:eastAsia="Times New Roman"/>
-        </w:rPr>
+      <w:bookmarkStart w:id="22" w:name="_Toc241602207"/>
+      <w:r>
+        <w:rPr>
+          <w:rFonts w:eastAsia="Times New Roman"/>
+        </w:rPr>
+        <w:lastRenderedPageBreak/>
         <w:t>11.1 Example 1: a natural blue sapphire</w:t>
       </w:r>
       <w:bookmarkEnd w:id="22"/>
@@ -9309,6 +9415,10 @@
         <w:gridCol w:w="6668"/>
       </w:tblGrid>
       <w:tr>
+        <w:trPr>
+          <w:cantSplit/>
+          <w:tblHeader/>
+        </w:trPr>
         <w:tc>
           <w:tcPr>
             <w:tcW w:w="1300" w:type="pct"/>
@@ -9329,6 +9439,7 @@
           </w:tcPr>
           <w:p>
             <w:pPr>
+              <w:keepNext/>
               <w:spacing w:after="120" w:line="276" w:lineRule="auto"/>
               <w:rPr>
                 <w:rFonts w:eastAsia="Times New Roman"/>
@@ -9346,7 +9457,6 @@
                 <w:sz w:val="20"/>
                 <w:szCs w:val="20"/>
               </w:rPr>
-              <w:lastRenderedPageBreak/>
               <w:t>Input</w:t>
             </w:r>
           </w:p>
@@ -9371,6 +9481,7 @@
           </w:tcPr>
           <w:p>
             <w:pPr>
+              <w:keepNext/>
               <w:spacing w:after="120" w:line="276" w:lineRule="auto"/>
               <w:rPr>
                 <w:rFonts w:eastAsia="Times New Roman"/>
@@ -9390,6 +9501,9 @@
         </w:tc>
       </w:tr>
       <w:tr>
+        <w:trPr>
+          <w:cantSplit/>
+        </w:trPr>
         <w:tc>
           <w:tcPr>
             <w:tcW w:w="0" w:type="auto"/>
@@ -9506,6 +9620,9 @@
         </w:tc>
       </w:tr>
       <w:tr>
+        <w:trPr>
+          <w:cantSplit/>
+        </w:trPr>
         <w:tc>
           <w:tcPr>
             <w:tcW w:w="0" w:type="auto"/>
@@ -9586,6 +9703,9 @@
         </w:tc>
       </w:tr>
       <w:tr>
+        <w:trPr>
+          <w:cantSplit/>
+        </w:trPr>
         <w:tc>
           <w:tcPr>
             <w:tcW w:w="0" w:type="auto"/>
@@ -9673,7 +9793,7 @@
           <w:rFonts w:eastAsia="Times New Roman"/>
         </w:rPr>
       </w:pPr>
-      <w:bookmarkStart w:id="23" w:name="_Toc241595887"/>
+      <w:bookmarkStart w:id="23" w:name="_Toc241602208"/>
       <w:r>
         <w:rPr>
           <w:rFonts w:eastAsia="Times New Roman"/>
@@ -9698,6 +9818,10 @@
         <w:gridCol w:w="6668"/>
       </w:tblGrid>
       <w:tr>
+        <w:trPr>
+          <w:cantSplit/>
+          <w:tblHeader/>
+        </w:trPr>
         <w:tc>
           <w:tcPr>
             <w:tcW w:w="1300" w:type="pct"/>
@@ -9718,6 +9842,7 @@
           </w:tcPr>
           <w:p>
             <w:pPr>
+              <w:keepNext/>
               <w:spacing w:after="120" w:line="276" w:lineRule="auto"/>
               <w:rPr>
                 <w:rFonts w:eastAsia="Times New Roman"/>
@@ -9759,6 +9884,7 @@
           </w:tcPr>
           <w:p>
             <w:pPr>
+              <w:keepNext/>
               <w:spacing w:after="120" w:line="276" w:lineRule="auto"/>
               <w:rPr>
                 <w:rFonts w:eastAsia="Times New Roman"/>
@@ -9778,6 +9904,9 @@
         </w:tc>
       </w:tr>
       <w:tr>
+        <w:trPr>
+          <w:cantSplit/>
+        </w:trPr>
         <w:tc>
           <w:tcPr>
             <w:tcW w:w="0" w:type="auto"/>
@@ -9886,6 +10015,9 @@
         </w:tc>
       </w:tr>
       <w:tr>
+        <w:trPr>
+          <w:cantSplit/>
+        </w:trPr>
         <w:tc>
           <w:tcPr>
             <w:tcW w:w="0" w:type="auto"/>
@@ -9976,7 +10108,7 @@
           <w:noProof/>
         </w:rPr>
         <w:drawing>
-          <wp:inline distT="0" distB="0" distL="0" distR="0" wp14:anchorId="068591AA" wp14:editId="19FA7CBF">
+          <wp:inline distT="0" distB="0" distL="0" distR="0" wp14:anchorId="6B4D334F" wp14:editId="3A53EFFA">
             <wp:extent cx="4095750" cy="1409700"/>
             <wp:effectExtent l="0" t="0" r="0" b="0"/>
             <wp:docPr id="13" name="Picture 13"/>
@@ -10041,7 +10173,7 @@
           <w:rFonts w:eastAsia="Times New Roman"/>
         </w:rPr>
       </w:pPr>
-      <w:bookmarkStart w:id="24" w:name="_Toc241595888"/>
+      <w:bookmarkStart w:id="24" w:name="_Toc241602209"/>
       <w:r>
         <w:rPr>
           <w:rFonts w:eastAsia="Times New Roman"/>
@@ -10066,6 +10198,10 @@
         <w:gridCol w:w="6668"/>
       </w:tblGrid>
       <w:tr>
+        <w:trPr>
+          <w:cantSplit/>
+          <w:tblHeader/>
+        </w:trPr>
         <w:tc>
           <w:tcPr>
             <w:tcW w:w="1300" w:type="pct"/>
@@ -10086,6 +10222,7 @@
           </w:tcPr>
           <w:p>
             <w:pPr>
+              <w:keepNext/>
               <w:spacing w:after="120" w:line="276" w:lineRule="auto"/>
               <w:rPr>
                 <w:rFonts w:eastAsia="Times New Roman"/>
@@ -10127,6 +10264,7 @@
           </w:tcPr>
           <w:p>
             <w:pPr>
+              <w:keepNext/>
               <w:spacing w:after="120" w:line="276" w:lineRule="auto"/>
               <w:rPr>
                 <w:rFonts w:eastAsia="Times New Roman"/>
@@ -10156,6 +10294,9 @@
         </w:tc>
       </w:tr>
       <w:tr>
+        <w:trPr>
+          <w:cantSplit/>
+        </w:trPr>
         <w:tc>
           <w:tcPr>
             <w:tcW w:w="0" w:type="auto"/>
@@ -10279,7 +10420,7 @@
           <w:rFonts w:eastAsia="Times New Roman"/>
         </w:rPr>
       </w:pPr>
-      <w:bookmarkStart w:id="25" w:name="_Toc241595889"/>
+      <w:bookmarkStart w:id="25" w:name="_Toc241602210"/>
       <w:r>
         <w:rPr>
           <w:rFonts w:eastAsia="Times New Roman"/>
@@ -10304,6 +10445,10 @@
         <w:gridCol w:w="6668"/>
       </w:tblGrid>
       <w:tr>
+        <w:trPr>
+          <w:cantSplit/>
+          <w:tblHeader/>
+        </w:trPr>
         <w:tc>
           <w:tcPr>
             <w:tcW w:w="1300" w:type="pct"/>
@@ -10324,6 +10469,7 @@
           </w:tcPr>
           <w:p>
             <w:pPr>
+              <w:keepNext/>
               <w:spacing w:after="120" w:line="276" w:lineRule="auto"/>
               <w:rPr>
                 <w:rFonts w:eastAsia="Times New Roman"/>
@@ -10365,6 +10511,7 @@
           </w:tcPr>
           <w:p>
             <w:pPr>
+              <w:keepNext/>
               <w:spacing w:after="120" w:line="276" w:lineRule="auto"/>
               <w:rPr>
                 <w:rFonts w:eastAsia="Times New Roman"/>
@@ -10402,6 +10549,9 @@
         </w:tc>
       </w:tr>
       <w:tr>
+        <w:trPr>
+          <w:cantSplit/>
+        </w:trPr>
         <w:tc>
           <w:tcPr>
             <w:tcW w:w="0" w:type="auto"/>
@@ -10510,6 +10660,9 @@
         </w:tc>
       </w:tr>
       <w:tr>
+        <w:trPr>
+          <w:cantSplit/>
+        </w:trPr>
         <w:tc>
           <w:tcPr>
             <w:tcW w:w="0" w:type="auto"/>
@@ -10601,7 +10754,7 @@
         </w:rPr>
         <w:lastRenderedPageBreak/>
         <w:drawing>
-          <wp:inline distT="0" distB="0" distL="0" distR="0" wp14:anchorId="0E656C43" wp14:editId="571B769A">
+          <wp:inline distT="0" distB="0" distL="0" distR="0" wp14:anchorId="6B2F5BD7" wp14:editId="3B68F7F5">
             <wp:extent cx="4095750" cy="1409700"/>
             <wp:effectExtent l="0" t="0" r="0" b="0"/>
             <wp:docPr id="14" name="Picture 14"/>
@@ -10666,7 +10819,7 @@
           <w:rFonts w:eastAsia="Times New Roman"/>
         </w:rPr>
       </w:pPr>
-      <w:bookmarkStart w:id="26" w:name="_Toc241595890"/>
+      <w:bookmarkStart w:id="26" w:name="_Toc241602211"/>
       <w:r>
         <w:rPr>
           <w:rFonts w:eastAsia="Times New Roman"/>
@@ -10713,7 +10866,7 @@
           <w:noProof/>
         </w:rPr>
         <w:drawing>
-          <wp:inline distT="0" distB="0" distL="0" distR="0" wp14:anchorId="16FCC007" wp14:editId="7B4D07FD">
+          <wp:inline distT="0" distB="0" distL="0" distR="0" wp14:anchorId="30AFBC00" wp14:editId="5AD3E986">
             <wp:extent cx="3143885" cy="4068445"/>
             <wp:effectExtent l="0" t="0" r="0" b="8255"/>
             <wp:docPr id="15" name="Picture 15"/>
@@ -10778,11 +10931,12 @@
           <w:rFonts w:eastAsia="Times New Roman"/>
         </w:rPr>
       </w:pPr>
-      <w:bookmarkStart w:id="27" w:name="_Toc241595891"/>
-      <w:r>
-        <w:rPr>
-          <w:rFonts w:eastAsia="Times New Roman"/>
-        </w:rPr>
+      <w:bookmarkStart w:id="27" w:name="_Toc241602212"/>
+      <w:r>
+        <w:rPr>
+          <w:rFonts w:eastAsia="Times New Roman"/>
+        </w:rPr>
+        <w:lastRenderedPageBreak/>
         <w:t>13. Your recent stones</w:t>
       </w:r>
       <w:bookmarkEnd w:id="27"/>
@@ -10792,7 +10946,6 @@
         <w:pStyle w:val="NormalWeb"/>
       </w:pPr>
       <w:r>
-        <w:lastRenderedPageBreak/>
         <w:t xml:space="preserve">The system remembers the last eight results you looked at. They appear at the top of the form on the home page under </w:t>
       </w:r>
       <w:r>
@@ -10826,7 +10979,7 @@
           <w:noProof/>
         </w:rPr>
         <w:drawing>
-          <wp:inline distT="0" distB="0" distL="0" distR="0" wp14:anchorId="6311EB35" wp14:editId="0AAD9432">
+          <wp:inline distT="0" distB="0" distL="0" distR="0" wp14:anchorId="12AF1C76" wp14:editId="1FBBCF6F">
             <wp:extent cx="4954270" cy="990600"/>
             <wp:effectExtent l="0" t="0" r="0" b="0"/>
             <wp:docPr id="16" name="Picture 16"/>
@@ -10889,7 +11042,7 @@
         <w:shd w:val="clear" w:color="auto" w:fill="FFFFFF"/>
         <w:spacing w:line="360" w:lineRule="auto"/>
         <w:jc w:val="both"/>
-        <w:divId w:val="773088852"/>
+        <w:divId w:val="1288706573"/>
         <w:rPr>
           <w:rFonts w:eastAsia="Times New Roman"/>
         </w:rPr>
@@ -10908,7 +11061,7 @@
           <w:rFonts w:eastAsia="Times New Roman"/>
         </w:rPr>
       </w:pPr>
-      <w:bookmarkStart w:id="28" w:name="_Toc241595892"/>
+      <w:bookmarkStart w:id="28" w:name="_Toc241602213"/>
       <w:r>
         <w:rPr>
           <w:rFonts w:eastAsia="Times New Roman"/>
@@ -10953,8 +11106,9 @@
         <w:rPr>
           <w:noProof/>
         </w:rPr>
+        <w:lastRenderedPageBreak/>
         <w:drawing>
-          <wp:inline distT="0" distB="0" distL="0" distR="0" wp14:anchorId="61701F75" wp14:editId="6A29367B">
+          <wp:inline distT="0" distB="0" distL="0" distR="0" wp14:anchorId="510EDE2A" wp14:editId="131338B3">
             <wp:extent cx="3999865" cy="3725545"/>
             <wp:effectExtent l="0" t="0" r="635" b="8255"/>
             <wp:docPr id="17" name="Picture 17"/>
@@ -11009,7 +11163,6 @@
         <w:spacing w:before="0" w:beforeAutospacing="0"/>
       </w:pPr>
       <w:r>
-        <w:lastRenderedPageBreak/>
         <w:t>Figure 16. Home page and a result on a phone-sized screen</w:t>
       </w:r>
     </w:p>
@@ -11020,7 +11173,7 @@
           <w:rFonts w:eastAsia="Times New Roman"/>
         </w:rPr>
       </w:pPr>
-      <w:bookmarkStart w:id="29" w:name="_Toc241595893"/>
+      <w:bookmarkStart w:id="29" w:name="_Toc241602214"/>
       <w:r>
         <w:rPr>
           <w:rFonts w:eastAsia="Times New Roman"/>
@@ -11053,6 +11206,10 @@
         <w:gridCol w:w="5947"/>
       </w:tblGrid>
       <w:tr>
+        <w:trPr>
+          <w:cantSplit/>
+          <w:tblHeader/>
+        </w:trPr>
         <w:tc>
           <w:tcPr>
             <w:tcW w:w="1700" w:type="pct"/>
@@ -11073,6 +11230,7 @@
           </w:tcPr>
           <w:p>
             <w:pPr>
+              <w:keepNext/>
               <w:spacing w:after="120" w:line="276" w:lineRule="auto"/>
               <w:rPr>
                 <w:rFonts w:eastAsia="Times New Roman"/>
@@ -11114,6 +11272,7 @@
           </w:tcPr>
           <w:p>
             <w:pPr>
+              <w:keepNext/>
               <w:spacing w:after="120" w:line="276" w:lineRule="auto"/>
               <w:rPr>
                 <w:rFonts w:eastAsia="Times New Roman"/>
@@ -11137,6 +11296,9 @@
         </w:tc>
       </w:tr>
       <w:tr>
+        <w:trPr>
+          <w:cantSplit/>
+        </w:trPr>
         <w:tc>
           <w:tcPr>
             <w:tcW w:w="0" w:type="auto"/>
@@ -11246,6 +11408,9 @@
         </w:tc>
       </w:tr>
       <w:tr>
+        <w:trPr>
+          <w:cantSplit/>
+        </w:trPr>
         <w:tc>
           <w:tcPr>
             <w:tcW w:w="0" w:type="auto"/>
@@ -11343,6 +11508,9 @@
         </w:tc>
       </w:tr>
       <w:tr>
+        <w:trPr>
+          <w:cantSplit/>
+        </w:trPr>
         <w:tc>
           <w:tcPr>
             <w:tcW w:w="0" w:type="auto"/>
@@ -11433,6 +11601,9 @@
         </w:tc>
       </w:tr>
       <w:tr>
+        <w:trPr>
+          <w:cantSplit/>
+        </w:trPr>
         <w:tc>
           <w:tcPr>
             <w:tcW w:w="0" w:type="auto"/>
@@ -11523,6 +11694,9 @@
         </w:tc>
       </w:tr>
       <w:tr>
+        <w:trPr>
+          <w:cantSplit/>
+        </w:trPr>
         <w:tc>
           <w:tcPr>
             <w:tcW w:w="0" w:type="auto"/>
@@ -11636,39 +11810,43 @@
         </w:tc>
       </w:tr>
       <w:tr>
-        <w:tc>
-          <w:tcPr>
-            <w:tcW w:w="0" w:type="auto"/>
-            <w:tcBorders>
-              <w:top w:val="single" w:sz="6" w:space="0" w:color="000000"/>
-              <w:left w:val="single" w:sz="6" w:space="0" w:color="000000"/>
-              <w:bottom w:val="single" w:sz="6" w:space="0" w:color="000000"/>
-              <w:right w:val="single" w:sz="6" w:space="0" w:color="000000"/>
-            </w:tcBorders>
-            <w:shd w:val="clear" w:color="auto" w:fill="FFFFFF"/>
-            <w:tcMar>
-              <w:top w:w="45" w:type="dxa"/>
-              <w:left w:w="75" w:type="dxa"/>
-              <w:bottom w:w="45" w:type="dxa"/>
-              <w:right w:w="75" w:type="dxa"/>
-            </w:tcMar>
-            <w:hideMark/>
-          </w:tcPr>
-          <w:p>
-            <w:pPr>
-              <w:spacing w:after="120" w:line="276" w:lineRule="auto"/>
-              <w:rPr>
-                <w:rFonts w:eastAsia="Times New Roman"/>
-                <w:sz w:val="20"/>
-                <w:szCs w:val="20"/>
-              </w:rPr>
-            </w:pPr>
-            <w:r>
-              <w:rPr>
-                <w:rFonts w:eastAsia="Times New Roman"/>
-                <w:sz w:val="20"/>
-                <w:szCs w:val="20"/>
-              </w:rPr>
+        <w:trPr>
+          <w:cantSplit/>
+        </w:trPr>
+        <w:tc>
+          <w:tcPr>
+            <w:tcW w:w="0" w:type="auto"/>
+            <w:tcBorders>
+              <w:top w:val="single" w:sz="6" w:space="0" w:color="000000"/>
+              <w:left w:val="single" w:sz="6" w:space="0" w:color="000000"/>
+              <w:bottom w:val="single" w:sz="6" w:space="0" w:color="000000"/>
+              <w:right w:val="single" w:sz="6" w:space="0" w:color="000000"/>
+            </w:tcBorders>
+            <w:shd w:val="clear" w:color="auto" w:fill="FFFFFF"/>
+            <w:tcMar>
+              <w:top w:w="45" w:type="dxa"/>
+              <w:left w:w="75" w:type="dxa"/>
+              <w:bottom w:w="45" w:type="dxa"/>
+              <w:right w:w="75" w:type="dxa"/>
+            </w:tcMar>
+            <w:hideMark/>
+          </w:tcPr>
+          <w:p>
+            <w:pPr>
+              <w:spacing w:after="120" w:line="276" w:lineRule="auto"/>
+              <w:rPr>
+                <w:rFonts w:eastAsia="Times New Roman"/>
+                <w:sz w:val="20"/>
+                <w:szCs w:val="20"/>
+              </w:rPr>
+            </w:pPr>
+            <w:r>
+              <w:rPr>
+                <w:rFonts w:eastAsia="Times New Roman"/>
+                <w:sz w:val="20"/>
+                <w:szCs w:val="20"/>
+              </w:rPr>
+              <w:lastRenderedPageBreak/>
               <w:t>"Please check your input" page, or a red message under a box</w:t>
             </w:r>
           </w:p>
@@ -11730,6 +11908,9 @@
         </w:tc>
       </w:tr>
       <w:tr>
+        <w:trPr>
+          <w:cantSplit/>
+        </w:trPr>
         <w:tc>
           <w:tcPr>
             <w:tcW w:w="0" w:type="auto"/>
@@ -11824,6 +12005,9 @@
         </w:tc>
       </w:tr>
       <w:tr>
+        <w:trPr>
+          <w:cantSplit/>
+        </w:trPr>
         <w:tc>
           <w:tcPr>
             <w:tcW w:w="0" w:type="auto"/>
@@ -11900,6 +12084,9 @@
         </w:tc>
       </w:tr>
       <w:tr>
+        <w:trPr>
+          <w:cantSplit/>
+        </w:trPr>
         <w:tc>
           <w:tcPr>
             <w:tcW w:w="0" w:type="auto"/>
@@ -12012,6 +12199,9 @@
         </w:tc>
       </w:tr>
       <w:tr>
+        <w:trPr>
+          <w:cantSplit/>
+        </w:trPr>
         <w:tc>
           <w:tcPr>
             <w:tcW w:w="0" w:type="auto"/>
@@ -12088,6 +12278,9 @@
         </w:tc>
       </w:tr>
       <w:tr>
+        <w:trPr>
+          <w:cantSplit/>
+        </w:trPr>
         <w:tc>
           <w:tcPr>
             <w:tcW w:w="0" w:type="auto"/>
@@ -12178,6 +12371,9 @@
         </w:tc>
       </w:tr>
       <w:tr>
+        <w:trPr>
+          <w:cantSplit/>
+        </w:trPr>
         <w:tc>
           <w:tcPr>
             <w:tcW w:w="0" w:type="auto"/>
@@ -12272,6 +12468,9 @@
         </w:tc>
       </w:tr>
       <w:tr>
+        <w:trPr>
+          <w:cantSplit/>
+        </w:trPr>
         <w:tc>
           <w:tcPr>
             <w:tcW w:w="0" w:type="auto"/>
@@ -12355,12 +12554,11 @@
           <w:rFonts w:eastAsia="Times New Roman"/>
         </w:rPr>
       </w:pPr>
-      <w:bookmarkStart w:id="30" w:name="_Toc241595894"/>
-      <w:r>
-        <w:rPr>
-          <w:rFonts w:eastAsia="Times New Roman"/>
-        </w:rPr>
-        <w:lastRenderedPageBreak/>
+      <w:bookmarkStart w:id="30" w:name="_Toc241602215"/>
+      <w:r>
+        <w:rPr>
+          <w:rFonts w:eastAsia="Times New Roman"/>
+        </w:rPr>
         <w:t>16. Console mode (without a browser)</w:t>
       </w:r>
       <w:bookmarkEnd w:id="30"/>
@@ -12521,6 +12719,7 @@
           <w:b/>
           <w:bCs/>
         </w:rPr>
+        <w:lastRenderedPageBreak/>
         <w:t>Step 4.</w:t>
       </w:r>
       <w:r>
@@ -12701,7 +12900,7 @@
           <w:rFonts w:eastAsia="Times New Roman"/>
         </w:rPr>
       </w:pPr>
-      <w:bookmarkStart w:id="31" w:name="_Toc241595895"/>
+      <w:bookmarkStart w:id="31" w:name="_Toc241602216"/>
       <w:r>
         <w:rPr>
           <w:rFonts w:eastAsia="Times New Roman"/>
@@ -12719,7 +12918,6 @@
           <w:b/>
           <w:bCs/>
         </w:rPr>
-        <w:lastRenderedPageBreak/>
         <w:t>Step 1.</w:t>
       </w:r>
       <w:r>
@@ -12788,7 +12986,7 @@
           <w:rFonts w:eastAsia="Times New Roman"/>
         </w:rPr>
       </w:pPr>
-      <w:bookmarkStart w:id="32" w:name="_Toc241595896"/>
+      <w:bookmarkStart w:id="32" w:name="_Toc241602217"/>
       <w:r>
         <w:rPr>
           <w:rFonts w:eastAsia="Times New Roman"/>
@@ -12821,6 +13019,10 @@
         <w:gridCol w:w="5767"/>
       </w:tblGrid>
       <w:tr>
+        <w:trPr>
+          <w:cantSplit/>
+          <w:tblHeader/>
+        </w:trPr>
         <w:tc>
           <w:tcPr>
             <w:tcW w:w="1800" w:type="pct"/>
@@ -12841,6 +13043,7 @@
           </w:tcPr>
           <w:p>
             <w:pPr>
+              <w:keepNext/>
               <w:spacing w:after="120" w:line="276" w:lineRule="auto"/>
               <w:rPr>
                 <w:rFonts w:eastAsia="Times New Roman"/>
@@ -12882,6 +13085,7 @@
           </w:tcPr>
           <w:p>
             <w:pPr>
+              <w:keepNext/>
               <w:spacing w:after="120" w:line="276" w:lineRule="auto"/>
               <w:rPr>
                 <w:rFonts w:eastAsia="Times New Roman"/>
@@ -12905,6 +13109,9 @@
         </w:tc>
       </w:tr>
       <w:tr>
+        <w:trPr>
+          <w:cantSplit/>
+        </w:trPr>
         <w:tc>
           <w:tcPr>
             <w:tcW w:w="0" w:type="auto"/>
@@ -12981,6 +13188,9 @@
         </w:tc>
       </w:tr>
       <w:tr>
+        <w:trPr>
+          <w:cantSplit/>
+        </w:trPr>
         <w:tc>
           <w:tcPr>
             <w:tcW w:w="0" w:type="auto"/>
@@ -13057,6 +13267,9 @@
         </w:tc>
       </w:tr>
       <w:tr>
+        <w:trPr>
+          <w:cantSplit/>
+        </w:trPr>
         <w:tc>
           <w:tcPr>
             <w:tcW w:w="0" w:type="auto"/>
@@ -13133,6 +13346,9 @@
         </w:tc>
       </w:tr>
       <w:tr>
+        <w:trPr>
+          <w:cantSplit/>
+        </w:trPr>
         <w:tc>
           <w:tcPr>
             <w:tcW w:w="0" w:type="auto"/>
@@ -13209,6 +13425,9 @@
         </w:tc>
       </w:tr>
       <w:tr>
+        <w:trPr>
+          <w:cantSplit/>
+        </w:trPr>
         <w:tc>
           <w:tcPr>
             <w:tcW w:w="0" w:type="auto"/>
@@ -13285,39 +13504,43 @@
         </w:tc>
       </w:tr>
       <w:tr>
-        <w:tc>
-          <w:tcPr>
-            <w:tcW w:w="0" w:type="auto"/>
-            <w:tcBorders>
-              <w:top w:val="single" w:sz="6" w:space="0" w:color="000000"/>
-              <w:left w:val="single" w:sz="6" w:space="0" w:color="000000"/>
-              <w:bottom w:val="single" w:sz="6" w:space="0" w:color="000000"/>
-              <w:right w:val="single" w:sz="6" w:space="0" w:color="000000"/>
-            </w:tcBorders>
-            <w:shd w:val="clear" w:color="auto" w:fill="FFFFFF"/>
-            <w:tcMar>
-              <w:top w:w="45" w:type="dxa"/>
-              <w:left w:w="75" w:type="dxa"/>
-              <w:bottom w:w="45" w:type="dxa"/>
-              <w:right w:w="75" w:type="dxa"/>
-            </w:tcMar>
-            <w:hideMark/>
-          </w:tcPr>
-          <w:p>
-            <w:pPr>
-              <w:spacing w:after="120" w:line="276" w:lineRule="auto"/>
-              <w:rPr>
-                <w:rFonts w:eastAsia="Times New Roman"/>
-                <w:sz w:val="20"/>
-                <w:szCs w:val="20"/>
-              </w:rPr>
-            </w:pPr>
-            <w:r>
-              <w:rPr>
-                <w:rFonts w:eastAsia="Times New Roman"/>
-                <w:sz w:val="20"/>
-                <w:szCs w:val="20"/>
-              </w:rPr>
+        <w:trPr>
+          <w:cantSplit/>
+        </w:trPr>
+        <w:tc>
+          <w:tcPr>
+            <w:tcW w:w="0" w:type="auto"/>
+            <w:tcBorders>
+              <w:top w:val="single" w:sz="6" w:space="0" w:color="000000"/>
+              <w:left w:val="single" w:sz="6" w:space="0" w:color="000000"/>
+              <w:bottom w:val="single" w:sz="6" w:space="0" w:color="000000"/>
+              <w:right w:val="single" w:sz="6" w:space="0" w:color="000000"/>
+            </w:tcBorders>
+            <w:shd w:val="clear" w:color="auto" w:fill="FFFFFF"/>
+            <w:tcMar>
+              <w:top w:w="45" w:type="dxa"/>
+              <w:left w:w="75" w:type="dxa"/>
+              <w:bottom w:w="45" w:type="dxa"/>
+              <w:right w:w="75" w:type="dxa"/>
+            </w:tcMar>
+            <w:hideMark/>
+          </w:tcPr>
+          <w:p>
+            <w:pPr>
+              <w:spacing w:after="120" w:line="276" w:lineRule="auto"/>
+              <w:rPr>
+                <w:rFonts w:eastAsia="Times New Roman"/>
+                <w:sz w:val="20"/>
+                <w:szCs w:val="20"/>
+              </w:rPr>
+            </w:pPr>
+            <w:r>
+              <w:rPr>
+                <w:rFonts w:eastAsia="Times New Roman"/>
+                <w:sz w:val="20"/>
+                <w:szCs w:val="20"/>
+              </w:rPr>
+              <w:lastRenderedPageBreak/>
               <w:t>run_tests.</w:t>
             </w:r>
           </w:p>
@@ -13361,6 +13584,9 @@
         </w:tc>
       </w:tr>
       <w:tr>
+        <w:trPr>
+          <w:cantSplit/>
+        </w:trPr>
         <w:tc>
           <w:tcPr>
             <w:tcW w:w="0" w:type="auto"/>
@@ -13437,6 +13663,9 @@
         </w:tc>
       </w:tr>
       <w:tr>
+        <w:trPr>
+          <w:cantSplit/>
+        </w:trPr>
         <w:tc>
           <w:tcPr>
             <w:tcW w:w="0" w:type="auto"/>
@@ -13537,6 +13766,10 @@
         <w:gridCol w:w="5767"/>
       </w:tblGrid>
       <w:tr>
+        <w:trPr>
+          <w:cantSplit/>
+          <w:tblHeader/>
+        </w:trPr>
         <w:tc>
           <w:tcPr>
             <w:tcW w:w="1800" w:type="pct"/>
@@ -13557,6 +13790,7 @@
           </w:tcPr>
           <w:p>
             <w:pPr>
+              <w:keepNext/>
               <w:spacing w:after="120" w:line="276" w:lineRule="auto"/>
               <w:rPr>
                 <w:rFonts w:eastAsia="Times New Roman"/>
@@ -13598,6 +13832,7 @@
           </w:tcPr>
           <w:p>
             <w:pPr>
+              <w:keepNext/>
               <w:spacing w:after="120" w:line="276" w:lineRule="auto"/>
               <w:rPr>
                 <w:rFonts w:eastAsia="Times New Roman"/>
@@ -13621,6 +13856,9 @@
         </w:tc>
       </w:tr>
       <w:tr>
+        <w:trPr>
+          <w:cantSplit/>
+        </w:trPr>
         <w:tc>
           <w:tcPr>
             <w:tcW w:w="0" w:type="auto"/>
@@ -13697,6 +13935,9 @@
         </w:tc>
       </w:tr>
       <w:tr>
+        <w:trPr>
+          <w:cantSplit/>
+        </w:trPr>
         <w:tc>
           <w:tcPr>
             <w:tcW w:w="0" w:type="auto"/>
@@ -13773,6 +14014,9 @@
         </w:tc>
       </w:tr>
       <w:tr>
+        <w:trPr>
+          <w:cantSplit/>
+        </w:trPr>
         <w:tc>
           <w:tcPr>
             <w:tcW w:w="0" w:type="auto"/>
@@ -13862,7 +14106,7 @@
         </w:rPr>
         <w:br w:type="page"/>
       </w:r>
-      <w:bookmarkStart w:id="33" w:name="_Toc241595897"/>
+      <w:bookmarkStart w:id="33" w:name="_Toc241602218"/>
       <w:r>
         <w:rPr>
           <w:rFonts w:eastAsia="Times New Roman"/>
@@ -14122,6 +14366,10 @@
         <w:gridCol w:w="1130"/>
       </w:tblGrid>
       <w:tr>
+        <w:trPr>
+          <w:cantSplit/>
+          <w:tblHeader/>
+        </w:trPr>
         <w:tc>
           <w:tcPr>
             <w:tcW w:w="400" w:type="pct"/>
@@ -14141,7 +14389,11 @@
             <w:vAlign w:val="center"/>
             <w:hideMark/>
           </w:tcPr>
-          <w:p/>
+          <w:p>
+            <w:pPr>
+              <w:keepNext/>
+            </w:pPr>
+          </w:p>
         </w:tc>
         <w:tc>
           <w:tcPr>
@@ -14164,6 +14416,7 @@
           </w:tcPr>
           <w:p>
             <w:pPr>
+              <w:keepNext/>
               <w:spacing w:after="120" w:line="276" w:lineRule="auto"/>
               <w:rPr>
                 <w:rFonts w:eastAsia="Times New Roman"/>
@@ -14206,6 +14459,7 @@
           </w:tcPr>
           <w:p>
             <w:pPr>
+              <w:keepNext/>
               <w:spacing w:after="120" w:line="276" w:lineRule="auto"/>
               <w:rPr>
                 <w:rFonts w:eastAsia="Times New Roman"/>
@@ -14248,6 +14502,7 @@
           </w:tcPr>
           <w:p>
             <w:pPr>
+              <w:keepNext/>
               <w:spacing w:after="120" w:line="276" w:lineRule="auto"/>
               <w:rPr>
                 <w:rFonts w:eastAsia="Times New Roman"/>
@@ -14290,6 +14545,7 @@
           </w:tcPr>
           <w:p>
             <w:pPr>
+              <w:keepNext/>
               <w:spacing w:after="120" w:line="276" w:lineRule="auto"/>
               <w:rPr>
                 <w:rFonts w:eastAsia="Times New Roman"/>
@@ -14332,6 +14588,7 @@
           </w:tcPr>
           <w:p>
             <w:pPr>
+              <w:keepNext/>
               <w:spacing w:after="120" w:line="276" w:lineRule="auto"/>
               <w:rPr>
                 <w:rFonts w:eastAsia="Times New Roman"/>
@@ -14374,6 +14631,7 @@
           </w:tcPr>
           <w:p>
             <w:pPr>
+              <w:keepNext/>
               <w:spacing w:after="120" w:line="276" w:lineRule="auto"/>
               <w:rPr>
                 <w:rFonts w:eastAsia="Times New Roman"/>
@@ -14416,6 +14674,7 @@
           </w:tcPr>
           <w:p>
             <w:pPr>
+              <w:keepNext/>
               <w:spacing w:after="120" w:line="276" w:lineRule="auto"/>
               <w:rPr>
                 <w:rFonts w:eastAsia="Times New Roman"/>
@@ -14458,6 +14717,7 @@
           </w:tcPr>
           <w:p>
             <w:pPr>
+              <w:keepNext/>
               <w:spacing w:after="120" w:line="276" w:lineRule="auto"/>
               <w:rPr>
                 <w:rFonts w:eastAsia="Times New Roman"/>
@@ -14481,6 +14741,9 @@
         </w:tc>
       </w:tr>
       <w:tr>
+        <w:trPr>
+          <w:cantSplit/>
+        </w:trPr>
         <w:tc>
           <w:tcPr>
             <w:tcW w:w="0" w:type="auto"/>
@@ -14518,7 +14781,7 @@
                 <w:szCs w:val="18"/>
               </w:rPr>
               <w:drawing>
-                <wp:inline distT="0" distB="0" distL="0" distR="0" wp14:anchorId="62052258" wp14:editId="210C98C2">
+                <wp:inline distT="0" distB="0" distL="0" distR="0" wp14:anchorId="08157B45" wp14:editId="4B321171">
                   <wp:extent cx="457835" cy="457835"/>
                   <wp:effectExtent l="0" t="0" r="0" b="0"/>
                   <wp:docPr id="18" name="Picture 18"/>
@@ -14909,6 +15172,9 @@
         </w:tc>
       </w:tr>
       <w:tr>
+        <w:trPr>
+          <w:cantSplit/>
+        </w:trPr>
         <w:tc>
           <w:tcPr>
             <w:tcW w:w="0" w:type="auto"/>
@@ -14946,7 +15212,7 @@
                 <w:szCs w:val="18"/>
               </w:rPr>
               <w:drawing>
-                <wp:inline distT="0" distB="0" distL="0" distR="0" wp14:anchorId="71B3AFDD" wp14:editId="6CE179DA">
+                <wp:inline distT="0" distB="0" distL="0" distR="0" wp14:anchorId="5510D90B" wp14:editId="4FCB741B">
                   <wp:extent cx="457835" cy="457835"/>
                   <wp:effectExtent l="0" t="0" r="0" b="0"/>
                   <wp:docPr id="19" name="Picture 19"/>
@@ -15337,6 +15603,9 @@
         </w:tc>
       </w:tr>
       <w:tr>
+        <w:trPr>
+          <w:cantSplit/>
+        </w:trPr>
         <w:tc>
           <w:tcPr>
             <w:tcW w:w="0" w:type="auto"/>
@@ -15374,7 +15643,7 @@
                 <w:szCs w:val="18"/>
               </w:rPr>
               <w:drawing>
-                <wp:inline distT="0" distB="0" distL="0" distR="0" wp14:anchorId="53035580" wp14:editId="444A2E5D">
+                <wp:inline distT="0" distB="0" distL="0" distR="0" wp14:anchorId="3698147A" wp14:editId="693FCDEA">
                   <wp:extent cx="457835" cy="457835"/>
                   <wp:effectExtent l="0" t="0" r="0" b="0"/>
                   <wp:docPr id="20" name="Picture 20"/>
@@ -15765,6 +16034,9 @@
         </w:tc>
       </w:tr>
       <w:tr>
+        <w:trPr>
+          <w:cantSplit/>
+        </w:trPr>
         <w:tc>
           <w:tcPr>
             <w:tcW w:w="0" w:type="auto"/>
@@ -15803,7 +16075,7 @@
               </w:rPr>
               <w:lastRenderedPageBreak/>
               <w:drawing>
-                <wp:inline distT="0" distB="0" distL="0" distR="0" wp14:anchorId="47090C3B" wp14:editId="0AADB01E">
+                <wp:inline distT="0" distB="0" distL="0" distR="0" wp14:anchorId="23AB864E" wp14:editId="4893CD82">
                   <wp:extent cx="457835" cy="457835"/>
                   <wp:effectExtent l="0" t="0" r="0" b="0"/>
                   <wp:docPr id="21" name="Picture 21"/>
@@ -16201,6 +16473,9 @@
         </w:tc>
       </w:tr>
       <w:tr>
+        <w:trPr>
+          <w:cantSplit/>
+        </w:trPr>
         <w:tc>
           <w:tcPr>
             <w:tcW w:w="0" w:type="auto"/>
@@ -16238,7 +16513,7 @@
                 <w:szCs w:val="18"/>
               </w:rPr>
               <w:drawing>
-                <wp:inline distT="0" distB="0" distL="0" distR="0" wp14:anchorId="142651BB" wp14:editId="267FAA1C">
+                <wp:inline distT="0" distB="0" distL="0" distR="0" wp14:anchorId="332B3E02" wp14:editId="5F548589">
                   <wp:extent cx="457835" cy="457835"/>
                   <wp:effectExtent l="0" t="0" r="0" b="0"/>
                   <wp:docPr id="22" name="Picture 22"/>
@@ -16629,6 +16904,9 @@
         </w:tc>
       </w:tr>
       <w:tr>
+        <w:trPr>
+          <w:cantSplit/>
+        </w:trPr>
         <w:tc>
           <w:tcPr>
             <w:tcW w:w="0" w:type="auto"/>
@@ -16666,7 +16944,7 @@
                 <w:szCs w:val="18"/>
               </w:rPr>
               <w:drawing>
-                <wp:inline distT="0" distB="0" distL="0" distR="0" wp14:anchorId="1193610D" wp14:editId="28CEF452">
+                <wp:inline distT="0" distB="0" distL="0" distR="0" wp14:anchorId="39F73A02" wp14:editId="1DEE703D">
                   <wp:extent cx="457835" cy="457835"/>
                   <wp:effectExtent l="0" t="0" r="0" b="0"/>
                   <wp:docPr id="23" name="Picture 23"/>
@@ -17057,6 +17335,9 @@
         </w:tc>
       </w:tr>
       <w:tr>
+        <w:trPr>
+          <w:cantSplit/>
+        </w:trPr>
         <w:tc>
           <w:tcPr>
             <w:tcW w:w="0" w:type="auto"/>
@@ -17094,7 +17375,7 @@
                 <w:szCs w:val="18"/>
               </w:rPr>
               <w:drawing>
-                <wp:inline distT="0" distB="0" distL="0" distR="0" wp14:anchorId="14F1DDA0" wp14:editId="3D094CAA">
+                <wp:inline distT="0" distB="0" distL="0" distR="0" wp14:anchorId="32DA9492" wp14:editId="0EC45B47">
                   <wp:extent cx="457835" cy="457835"/>
                   <wp:effectExtent l="0" t="0" r="0" b="0"/>
                   <wp:docPr id="24" name="Picture 24"/>
@@ -17485,6 +17766,9 @@
         </w:tc>
       </w:tr>
       <w:tr>
+        <w:trPr>
+          <w:cantSplit/>
+        </w:trPr>
         <w:tc>
           <w:tcPr>
             <w:tcW w:w="0" w:type="auto"/>
@@ -17522,7 +17806,7 @@
                 <w:szCs w:val="18"/>
               </w:rPr>
               <w:drawing>
-                <wp:inline distT="0" distB="0" distL="0" distR="0" wp14:anchorId="51D4B9D8" wp14:editId="6A5AEB7F">
+                <wp:inline distT="0" distB="0" distL="0" distR="0" wp14:anchorId="569DD72B" wp14:editId="26907424">
                   <wp:extent cx="457835" cy="457835"/>
                   <wp:effectExtent l="0" t="0" r="0" b="0"/>
                   <wp:docPr id="25" name="Picture 25"/>
@@ -17913,6 +18197,9 @@
         </w:tc>
       </w:tr>
       <w:tr>
+        <w:trPr>
+          <w:cantSplit/>
+        </w:trPr>
         <w:tc>
           <w:tcPr>
             <w:tcW w:w="0" w:type="auto"/>
@@ -17950,7 +18237,7 @@
                 <w:szCs w:val="18"/>
               </w:rPr>
               <w:drawing>
-                <wp:inline distT="0" distB="0" distL="0" distR="0" wp14:anchorId="061C8E1B" wp14:editId="2E07552A">
+                <wp:inline distT="0" distB="0" distL="0" distR="0" wp14:anchorId="4369B1D4" wp14:editId="2BF9BB3A">
                   <wp:extent cx="457835" cy="457835"/>
                   <wp:effectExtent l="0" t="0" r="0" b="0"/>
                   <wp:docPr id="26" name="Picture 26"/>
@@ -18341,6 +18628,9 @@
         </w:tc>
       </w:tr>
       <w:tr>
+        <w:trPr>
+          <w:cantSplit/>
+        </w:trPr>
         <w:tc>
           <w:tcPr>
             <w:tcW w:w="0" w:type="auto"/>
@@ -18378,7 +18668,7 @@
                 <w:szCs w:val="18"/>
               </w:rPr>
               <w:drawing>
-                <wp:inline distT="0" distB="0" distL="0" distR="0" wp14:anchorId="3FAEC45B" wp14:editId="68D427CA">
+                <wp:inline distT="0" distB="0" distL="0" distR="0" wp14:anchorId="1F4F074F" wp14:editId="4787489E">
                   <wp:extent cx="457835" cy="457835"/>
                   <wp:effectExtent l="0" t="0" r="0" b="0"/>
                   <wp:docPr id="27" name="Picture 27"/>
@@ -18769,6 +19059,9 @@
         </w:tc>
       </w:tr>
       <w:tr>
+        <w:trPr>
+          <w:cantSplit/>
+        </w:trPr>
         <w:tc>
           <w:tcPr>
             <w:tcW w:w="0" w:type="auto"/>
@@ -18806,7 +19099,7 @@
                 <w:szCs w:val="18"/>
               </w:rPr>
               <w:drawing>
-                <wp:inline distT="0" distB="0" distL="0" distR="0" wp14:anchorId="24E01C34" wp14:editId="50625E9A">
+                <wp:inline distT="0" distB="0" distL="0" distR="0" wp14:anchorId="3E6EE87C" wp14:editId="749D09A1">
                   <wp:extent cx="457835" cy="457835"/>
                   <wp:effectExtent l="0" t="0" r="0" b="0"/>
                   <wp:docPr id="28" name="Picture 28"/>
@@ -19197,6 +19490,9 @@
         </w:tc>
       </w:tr>
       <w:tr>
+        <w:trPr>
+          <w:cantSplit/>
+        </w:trPr>
         <w:tc>
           <w:tcPr>
             <w:tcW w:w="0" w:type="auto"/>
@@ -19234,7 +19530,7 @@
                 <w:szCs w:val="18"/>
               </w:rPr>
               <w:drawing>
-                <wp:inline distT="0" distB="0" distL="0" distR="0" wp14:anchorId="4B862B6E" wp14:editId="41255609">
+                <wp:inline distT="0" distB="0" distL="0" distR="0" wp14:anchorId="1DB47ADD" wp14:editId="2FF567D4">
                   <wp:extent cx="457835" cy="457835"/>
                   <wp:effectExtent l="0" t="0" r="0" b="0"/>
                   <wp:docPr id="29" name="Picture 29"/>
@@ -19630,7 +19926,7 @@
         <w:shd w:val="clear" w:color="auto" w:fill="FFFFFF"/>
         <w:spacing w:line="360" w:lineRule="auto"/>
         <w:jc w:val="both"/>
-        <w:divId w:val="1360012401"/>
+        <w:divId w:val="65541650"/>
         <w:rPr>
           <w:rFonts w:eastAsia="Times New Roman"/>
         </w:rPr>
@@ -19833,9 +20129,9 @@
 <file path=word/numbering.xml><?xml version="1.0" encoding="utf-8"?>
 <w:numbering xmlns:wpc="http://schemas.microsoft.com/office/word/2010/wordprocessingCanvas" xmlns:cx="http://schemas.microsoft.com/office/drawing/2014/chartex" xmlns:cx1="http://schemas.microsoft.com/office/drawing/2015/9/8/chartex" xmlns:cx2="http://schemas.microsoft.com/office/drawing/2015/10/21/chartex" xmlns:cx3="http://schemas.microsoft.com/office/drawing/2016/5/9/chartex" xmlns:cx4="http://schemas.microsoft.com/office/drawing/2016/5/10/chartex" xmlns:cx5="http://schemas.microsoft.com/office/drawing/2016/5/11/chartex" xmlns:cx6="http://schemas.microsoft.com/office/drawing/2016/5/12/chartex" xmlns:cx7="http://schemas.microsoft.com/office/drawing/2016/5/13/chartex" xmlns:cx8="http://schemas.microsoft.com/office/drawing/2016/5/14/chartex" xmlns:mc="http://schemas.openxmlformats.org/markup-compatibility/2006" xmlns:aink="http://schemas.microsoft.com/office/drawing/2016/ink" xmlns:am3d="http://schemas.microsoft.com/office/drawing/2017/model3d" xmlns:o="urn:schemas-microsoft-com:office:office" xmlns:oel="http://schemas.microsoft.com/office/2019/extlst" xmlns:r="http://schemas.openxmlformats.org/officeDocument/2006/relationships" xmlns:m="http://schemas.openxmlformats.org/officeDocument/2006/math" xmlns:v="urn:schemas-microsoft-com:vml" xmlns:wp14="http://schemas.microsoft.com/office/word/2010/wordprocessingDrawing" xmlns:wp="http://schemas.openxmlformats.org/drawingml/2006/wordprocessingDrawing" xmlns:w10="urn:schemas-microsoft-com:office:word" xmlns:w="http://schemas.openxmlformats.org/wordprocessingml/2006/main" xmlns:w14="http://schemas.microsoft.com/office/word/2010/wordml" xmlns:w15="http://schemas.microsoft.com/office/word/2012/wordml" xmlns:w16cex="http://schemas.microsoft.com/office/word/2018/wordml/cex" xmlns:w16cid="http://schemas.microsoft.com/office/word/2016/wordml/cid" xmlns:w16="http://schemas.microsoft.com/office/word/2018/wordml" xmlns:w16du="http://schemas.microsoft.com/office/word/2023/wordml/word16du" xmlns:w16sdtdh="http://schemas.microsoft.com/office/word/2020/wordml/sdtdatahash" xmlns:w16sdtfl="http://schemas.microsoft.com/office/word/2024/wordml/sdtformatlock" xmlns:w16se="http://schemas.microsoft.com/office/word/2015/wordml/symex" xmlns:wpg="http://schemas.microsoft.com/office/word/2010/wordprocessingGroup" xmlns:wpi="http://schemas.microsoft.com/office/word/2010/wordprocessingInk" xmlns:wne="http://schemas.microsoft.com/office/word/2006/wordml" xmlns:wps="http://schemas.microsoft.com/office/word/2010/wordprocessingShape" mc:Ignorable="w14 w15 w16se w16cid w16 w16cex w16sdtdh w16sdtfl w16du wp14">
   <w:abstractNum w:abstractNumId="0" w15:restartNumberingAfterBreak="0">
-    <w:nsid w:val="0D582CBE"/>
+    <w:nsid w:val="07207ADE"/>
     <w:multiLevelType w:val="multilevel"/>
-    <w:tmpl w:val="6F48930C"/>
+    <w:tmpl w:val="BEE256A4"/>
     <w:lvl w:ilvl="0">
       <w:start w:val="1"/>
       <w:numFmt w:val="bullet"/>
@@ -19982,9 +20278,122 @@
     </w:lvl>
   </w:abstractNum>
   <w:abstractNum w:abstractNumId="1" w15:restartNumberingAfterBreak="0">
-    <w:nsid w:val="0EB44B2C"/>
+    <w:nsid w:val="099D7ADA"/>
     <w:multiLevelType w:val="multilevel"/>
-    <w:tmpl w:val="29167FAE"/>
+    <w:tmpl w:val="9190CF16"/>
+    <w:lvl w:ilvl="0">
+      <w:start w:val="1"/>
+      <w:numFmt w:val="decimal"/>
+      <w:lvlText w:val="%1."/>
+      <w:lvlJc w:val="left"/>
+      <w:pPr>
+        <w:tabs>
+          <w:tab w:val="num" w:pos="720"/>
+        </w:tabs>
+        <w:ind w:left="720" w:hanging="360"/>
+      </w:pPr>
+    </w:lvl>
+    <w:lvl w:ilvl="1" w:tentative="1">
+      <w:start w:val="1"/>
+      <w:numFmt w:val="decimal"/>
+      <w:lvlText w:val="%2."/>
+      <w:lvlJc w:val="left"/>
+      <w:pPr>
+        <w:tabs>
+          <w:tab w:val="num" w:pos="1440"/>
+        </w:tabs>
+        <w:ind w:left="1440" w:hanging="360"/>
+      </w:pPr>
+    </w:lvl>
+    <w:lvl w:ilvl="2" w:tentative="1">
+      <w:start w:val="1"/>
+      <w:numFmt w:val="decimal"/>
+      <w:lvlText w:val="%3."/>
+      <w:lvlJc w:val="left"/>
+      <w:pPr>
+        <w:tabs>
+          <w:tab w:val="num" w:pos="2160"/>
+        </w:tabs>
+        <w:ind w:left="2160" w:hanging="360"/>
+      </w:pPr>
+    </w:lvl>
+    <w:lvl w:ilvl="3" w:tentative="1">
+      <w:start w:val="1"/>
+      <w:numFmt w:val="decimal"/>
+      <w:lvlText w:val="%4."/>
+      <w:lvlJc w:val="left"/>
+      <w:pPr>
+        <w:tabs>
+          <w:tab w:val="num" w:pos="2880"/>
+        </w:tabs>
+        <w:ind w:left="2880" w:hanging="360"/>
+      </w:pPr>
+    </w:lvl>
+    <w:lvl w:ilvl="4" w:tentative="1">
+      <w:start w:val="1"/>
+      <w:numFmt w:val="decimal"/>
+      <w:lvlText w:val="%5."/>
+      <w:lvlJc w:val="left"/>
+      <w:pPr>
+        <w:tabs>
+          <w:tab w:val="num" w:pos="3600"/>
+        </w:tabs>
+        <w:ind w:left="3600" w:hanging="360"/>
+      </w:pPr>
+    </w:lvl>
+    <w:lvl w:ilvl="5" w:tentative="1">
+      <w:start w:val="1"/>
+      <w:numFmt w:val="decimal"/>
+      <w:lvlText w:val="%6."/>
+      <w:lvlJc w:val="left"/>
+      <w:pPr>
+        <w:tabs>
+          <w:tab w:val="num" w:pos="4320"/>
+        </w:tabs>
+        <w:ind w:left="4320" w:hanging="360"/>
+      </w:pPr>
+    </w:lvl>
+    <w:lvl w:ilvl="6" w:tentative="1">
+      <w:start w:val="1"/>
+      <w:numFmt w:val="decimal"/>
+      <w:lvlText w:val="%7."/>
+      <w:lvlJc w:val="left"/>
+      <w:pPr>
+        <w:tabs>
+          <w:tab w:val="num" w:pos="5040"/>
+        </w:tabs>
+        <w:ind w:left="5040" w:hanging="360"/>
+      </w:pPr>
+    </w:lvl>
+    <w:lvl w:ilvl="7" w:tentative="1">
+      <w:start w:val="1"/>
+      <w:numFmt w:val="decimal"/>
+      <w:lvlText w:val="%8."/>
+      <w:lvlJc w:val="left"/>
+      <w:pPr>
+        <w:tabs>
+          <w:tab w:val="num" w:pos="5760"/>
+        </w:tabs>
+        <w:ind w:left="5760" w:hanging="360"/>
+      </w:pPr>
+    </w:lvl>
+    <w:lvl w:ilvl="8" w:tentative="1">
+      <w:start w:val="1"/>
+      <w:numFmt w:val="decimal"/>
+      <w:lvlText w:val="%9."/>
+      <w:lvlJc w:val="left"/>
+      <w:pPr>
+        <w:tabs>
+          <w:tab w:val="num" w:pos="6480"/>
+        </w:tabs>
+        <w:ind w:left="6480" w:hanging="360"/>
+      </w:pPr>
+    </w:lvl>
+  </w:abstractNum>
+  <w:abstractNum w:abstractNumId="2" w15:restartNumberingAfterBreak="0">
+    <w:nsid w:val="17AB3288"/>
+    <w:multiLevelType w:val="multilevel"/>
+    <w:tmpl w:val="7EEC9DDE"/>
     <w:lvl w:ilvl="0">
       <w:start w:val="1"/>
       <w:numFmt w:val="bullet"/>
@@ -20130,10 +20539,349 @@
       </w:rPr>
     </w:lvl>
   </w:abstractNum>
-  <w:abstractNum w:abstractNumId="2" w15:restartNumberingAfterBreak="0">
-    <w:nsid w:val="18B75C40"/>
+  <w:abstractNum w:abstractNumId="3" w15:restartNumberingAfterBreak="0">
+    <w:nsid w:val="19E6477E"/>
     <w:multiLevelType w:val="multilevel"/>
-    <w:tmpl w:val="BF906FB4"/>
+    <w:tmpl w:val="E048C9AC"/>
+    <w:lvl w:ilvl="0">
+      <w:start w:val="1"/>
+      <w:numFmt w:val="decimal"/>
+      <w:lvlText w:val="%1."/>
+      <w:lvlJc w:val="left"/>
+      <w:pPr>
+        <w:tabs>
+          <w:tab w:val="num" w:pos="720"/>
+        </w:tabs>
+        <w:ind w:left="720" w:hanging="360"/>
+      </w:pPr>
+    </w:lvl>
+    <w:lvl w:ilvl="1" w:tentative="1">
+      <w:start w:val="1"/>
+      <w:numFmt w:val="decimal"/>
+      <w:lvlText w:val="%2."/>
+      <w:lvlJc w:val="left"/>
+      <w:pPr>
+        <w:tabs>
+          <w:tab w:val="num" w:pos="1440"/>
+        </w:tabs>
+        <w:ind w:left="1440" w:hanging="360"/>
+      </w:pPr>
+    </w:lvl>
+    <w:lvl w:ilvl="2" w:tentative="1">
+      <w:start w:val="1"/>
+      <w:numFmt w:val="decimal"/>
+      <w:lvlText w:val="%3."/>
+      <w:lvlJc w:val="left"/>
+      <w:pPr>
+        <w:tabs>
+          <w:tab w:val="num" w:pos="2160"/>
+        </w:tabs>
+        <w:ind w:left="2160" w:hanging="360"/>
+      </w:pPr>
+    </w:lvl>
+    <w:lvl w:ilvl="3" w:tentative="1">
+      <w:start w:val="1"/>
+      <w:numFmt w:val="decimal"/>
+      <w:lvlText w:val="%4."/>
+      <w:lvlJc w:val="left"/>
+      <w:pPr>
+        <w:tabs>
+          <w:tab w:val="num" w:pos="2880"/>
+        </w:tabs>
+        <w:ind w:left="2880" w:hanging="360"/>
+      </w:pPr>
+    </w:lvl>
+    <w:lvl w:ilvl="4" w:tentative="1">
+      <w:start w:val="1"/>
+      <w:numFmt w:val="decimal"/>
+      <w:lvlText w:val="%5."/>
+      <w:lvlJc w:val="left"/>
+      <w:pPr>
+        <w:tabs>
+          <w:tab w:val="num" w:pos="3600"/>
+        </w:tabs>
+        <w:ind w:left="3600" w:hanging="360"/>
+      </w:pPr>
+    </w:lvl>
+    <w:lvl w:ilvl="5" w:tentative="1">
+      <w:start w:val="1"/>
+      <w:numFmt w:val="decimal"/>
+      <w:lvlText w:val="%6."/>
+      <w:lvlJc w:val="left"/>
+      <w:pPr>
+        <w:tabs>
+          <w:tab w:val="num" w:pos="4320"/>
+        </w:tabs>
+        <w:ind w:left="4320" w:hanging="360"/>
+      </w:pPr>
+    </w:lvl>
+    <w:lvl w:ilvl="6" w:tentative="1">
+      <w:start w:val="1"/>
+      <w:numFmt w:val="decimal"/>
+      <w:lvlText w:val="%7."/>
+      <w:lvlJc w:val="left"/>
+      <w:pPr>
+        <w:tabs>
+          <w:tab w:val="num" w:pos="5040"/>
+        </w:tabs>
+        <w:ind w:left="5040" w:hanging="360"/>
+      </w:pPr>
+    </w:lvl>
+    <w:lvl w:ilvl="7" w:tentative="1">
+      <w:start w:val="1"/>
+      <w:numFmt w:val="decimal"/>
+      <w:lvlText w:val="%8."/>
+      <w:lvlJc w:val="left"/>
+      <w:pPr>
+        <w:tabs>
+          <w:tab w:val="num" w:pos="5760"/>
+        </w:tabs>
+        <w:ind w:left="5760" w:hanging="360"/>
+      </w:pPr>
+    </w:lvl>
+    <w:lvl w:ilvl="8" w:tentative="1">
+      <w:start w:val="1"/>
+      <w:numFmt w:val="decimal"/>
+      <w:lvlText w:val="%9."/>
+      <w:lvlJc w:val="left"/>
+      <w:pPr>
+        <w:tabs>
+          <w:tab w:val="num" w:pos="6480"/>
+        </w:tabs>
+        <w:ind w:left="6480" w:hanging="360"/>
+      </w:pPr>
+    </w:lvl>
+  </w:abstractNum>
+  <w:abstractNum w:abstractNumId="4" w15:restartNumberingAfterBreak="0">
+    <w:nsid w:val="2A443FF7"/>
+    <w:multiLevelType w:val="multilevel"/>
+    <w:tmpl w:val="55621970"/>
+    <w:lvl w:ilvl="0">
+      <w:start w:val="1"/>
+      <w:numFmt w:val="decimal"/>
+      <w:lvlText w:val="%1."/>
+      <w:lvlJc w:val="left"/>
+      <w:pPr>
+        <w:tabs>
+          <w:tab w:val="num" w:pos="720"/>
+        </w:tabs>
+        <w:ind w:left="720" w:hanging="360"/>
+      </w:pPr>
+    </w:lvl>
+    <w:lvl w:ilvl="1" w:tentative="1">
+      <w:start w:val="1"/>
+      <w:numFmt w:val="decimal"/>
+      <w:lvlText w:val="%2."/>
+      <w:lvlJc w:val="left"/>
+      <w:pPr>
+        <w:tabs>
+          <w:tab w:val="num" w:pos="1440"/>
+        </w:tabs>
+        <w:ind w:left="1440" w:hanging="360"/>
+      </w:pPr>
+    </w:lvl>
+    <w:lvl w:ilvl="2" w:tentative="1">
+      <w:start w:val="1"/>
+      <w:numFmt w:val="decimal"/>
+      <w:lvlText w:val="%3."/>
+      <w:lvlJc w:val="left"/>
+      <w:pPr>
+        <w:tabs>
+          <w:tab w:val="num" w:pos="2160"/>
+        </w:tabs>
+        <w:ind w:left="2160" w:hanging="360"/>
+      </w:pPr>
+    </w:lvl>
+    <w:lvl w:ilvl="3" w:tentative="1">
+      <w:start w:val="1"/>
+      <w:numFmt w:val="decimal"/>
+      <w:lvlText w:val="%4."/>
+      <w:lvlJc w:val="left"/>
+      <w:pPr>
+        <w:tabs>
+          <w:tab w:val="num" w:pos="2880"/>
+        </w:tabs>
+        <w:ind w:left="2880" w:hanging="360"/>
+      </w:pPr>
+    </w:lvl>
+    <w:lvl w:ilvl="4" w:tentative="1">
+      <w:start w:val="1"/>
+      <w:numFmt w:val="decimal"/>
+      <w:lvlText w:val="%5."/>
+      <w:lvlJc w:val="left"/>
+      <w:pPr>
+        <w:tabs>
+          <w:tab w:val="num" w:pos="3600"/>
+        </w:tabs>
+        <w:ind w:left="3600" w:hanging="360"/>
+      </w:pPr>
+    </w:lvl>
+    <w:lvl w:ilvl="5" w:tentative="1">
+      <w:start w:val="1"/>
+      <w:numFmt w:val="decimal"/>
+      <w:lvlText w:val="%6."/>
+      <w:lvlJc w:val="left"/>
+      <w:pPr>
+        <w:tabs>
+          <w:tab w:val="num" w:pos="4320"/>
+        </w:tabs>
+        <w:ind w:left="4320" w:hanging="360"/>
+      </w:pPr>
+    </w:lvl>
+    <w:lvl w:ilvl="6" w:tentative="1">
+      <w:start w:val="1"/>
+      <w:numFmt w:val="decimal"/>
+      <w:lvlText w:val="%7."/>
+      <w:lvlJc w:val="left"/>
+      <w:pPr>
+        <w:tabs>
+          <w:tab w:val="num" w:pos="5040"/>
+        </w:tabs>
+        <w:ind w:left="5040" w:hanging="360"/>
+      </w:pPr>
+    </w:lvl>
+    <w:lvl w:ilvl="7" w:tentative="1">
+      <w:start w:val="1"/>
+      <w:numFmt w:val="decimal"/>
+      <w:lvlText w:val="%8."/>
+      <w:lvlJc w:val="left"/>
+      <w:pPr>
+        <w:tabs>
+          <w:tab w:val="num" w:pos="5760"/>
+        </w:tabs>
+        <w:ind w:left="5760" w:hanging="360"/>
+      </w:pPr>
+    </w:lvl>
+    <w:lvl w:ilvl="8" w:tentative="1">
+      <w:start w:val="1"/>
+      <w:numFmt w:val="decimal"/>
+      <w:lvlText w:val="%9."/>
+      <w:lvlJc w:val="left"/>
+      <w:pPr>
+        <w:tabs>
+          <w:tab w:val="num" w:pos="6480"/>
+        </w:tabs>
+        <w:ind w:left="6480" w:hanging="360"/>
+      </w:pPr>
+    </w:lvl>
+  </w:abstractNum>
+  <w:abstractNum w:abstractNumId="5" w15:restartNumberingAfterBreak="0">
+    <w:nsid w:val="2A6944A7"/>
+    <w:multiLevelType w:val="multilevel"/>
+    <w:tmpl w:val="0936AA26"/>
+    <w:lvl w:ilvl="0">
+      <w:start w:val="1"/>
+      <w:numFmt w:val="decimal"/>
+      <w:lvlText w:val="%1."/>
+      <w:lvlJc w:val="left"/>
+      <w:pPr>
+        <w:tabs>
+          <w:tab w:val="num" w:pos="720"/>
+        </w:tabs>
+        <w:ind w:left="720" w:hanging="360"/>
+      </w:pPr>
+    </w:lvl>
+    <w:lvl w:ilvl="1" w:tentative="1">
+      <w:start w:val="1"/>
+      <w:numFmt w:val="decimal"/>
+      <w:lvlText w:val="%2."/>
+      <w:lvlJc w:val="left"/>
+      <w:pPr>
+        <w:tabs>
+          <w:tab w:val="num" w:pos="1440"/>
+        </w:tabs>
+        <w:ind w:left="1440" w:hanging="360"/>
+      </w:pPr>
+    </w:lvl>
+    <w:lvl w:ilvl="2" w:tentative="1">
+      <w:start w:val="1"/>
+      <w:numFmt w:val="decimal"/>
+      <w:lvlText w:val="%3."/>
+      <w:lvlJc w:val="left"/>
+      <w:pPr>
+        <w:tabs>
+          <w:tab w:val="num" w:pos="2160"/>
+        </w:tabs>
+        <w:ind w:left="2160" w:hanging="360"/>
+      </w:pPr>
+    </w:lvl>
+    <w:lvl w:ilvl="3" w:tentative="1">
+      <w:start w:val="1"/>
+      <w:numFmt w:val="decimal"/>
+      <w:lvlText w:val="%4."/>
+      <w:lvlJc w:val="left"/>
+      <w:pPr>
+        <w:tabs>
+          <w:tab w:val="num" w:pos="2880"/>
+        </w:tabs>
+        <w:ind w:left="2880" w:hanging="360"/>
+      </w:pPr>
+    </w:lvl>
+    <w:lvl w:ilvl="4" w:tentative="1">
+      <w:start w:val="1"/>
+      <w:numFmt w:val="decimal"/>
+      <w:lvlText w:val="%5."/>
+      <w:lvlJc w:val="left"/>
+      <w:pPr>
+        <w:tabs>
+          <w:tab w:val="num" w:pos="3600"/>
+        </w:tabs>
+        <w:ind w:left="3600" w:hanging="360"/>
+      </w:pPr>
+    </w:lvl>
+    <w:lvl w:ilvl="5" w:tentative="1">
+      <w:start w:val="1"/>
+      <w:numFmt w:val="decimal"/>
+      <w:lvlText w:val="%6."/>
+      <w:lvlJc w:val="left"/>
+      <w:pPr>
+        <w:tabs>
+          <w:tab w:val="num" w:pos="4320"/>
+        </w:tabs>
+        <w:ind w:left="4320" w:hanging="360"/>
+      </w:pPr>
+    </w:lvl>
+    <w:lvl w:ilvl="6" w:tentative="1">
+      <w:start w:val="1"/>
+      <w:numFmt w:val="decimal"/>
+      <w:lvlText w:val="%7."/>
+      <w:lvlJc w:val="left"/>
+      <w:pPr>
+        <w:tabs>
+          <w:tab w:val="num" w:pos="5040"/>
+        </w:tabs>
+        <w:ind w:left="5040" w:hanging="360"/>
+      </w:pPr>
+    </w:lvl>
+    <w:lvl w:ilvl="7" w:tentative="1">
+      <w:start w:val="1"/>
+      <w:numFmt w:val="decimal"/>
+      <w:lvlText w:val="%8."/>
+      <w:lvlJc w:val="left"/>
+      <w:pPr>
+        <w:tabs>
+          <w:tab w:val="num" w:pos="5760"/>
+        </w:tabs>
+        <w:ind w:left="5760" w:hanging="360"/>
+      </w:pPr>
+    </w:lvl>
+    <w:lvl w:ilvl="8" w:tentative="1">
+      <w:start w:val="1"/>
+      <w:numFmt w:val="decimal"/>
+      <w:lvlText w:val="%9."/>
+      <w:lvlJc w:val="left"/>
+      <w:pPr>
+        <w:tabs>
+          <w:tab w:val="num" w:pos="6480"/>
+        </w:tabs>
+        <w:ind w:left="6480" w:hanging="360"/>
+      </w:pPr>
+    </w:lvl>
+  </w:abstractNum>
+  <w:abstractNum w:abstractNumId="6" w15:restartNumberingAfterBreak="0">
+    <w:nsid w:val="39BD3BC3"/>
+    <w:multiLevelType w:val="multilevel"/>
+    <w:tmpl w:val="AB846664"/>
     <w:lvl w:ilvl="0">
       <w:start w:val="1"/>
       <w:numFmt w:val="bullet"/>
@@ -20279,123 +21027,10 @@
       </w:rPr>
     </w:lvl>
   </w:abstractNum>
-  <w:abstractNum w:abstractNumId="3" w15:restartNumberingAfterBreak="0">
-    <w:nsid w:val="235D6039"/>
+  <w:abstractNum w:abstractNumId="7" w15:restartNumberingAfterBreak="0">
+    <w:nsid w:val="48330470"/>
     <w:multiLevelType w:val="multilevel"/>
-    <w:tmpl w:val="746AA4FA"/>
-    <w:lvl w:ilvl="0">
-      <w:start w:val="1"/>
-      <w:numFmt w:val="decimal"/>
-      <w:lvlText w:val="%1."/>
-      <w:lvlJc w:val="left"/>
-      <w:pPr>
-        <w:tabs>
-          <w:tab w:val="num" w:pos="720"/>
-        </w:tabs>
-        <w:ind w:left="720" w:hanging="360"/>
-      </w:pPr>
-    </w:lvl>
-    <w:lvl w:ilvl="1" w:tentative="1">
-      <w:start w:val="1"/>
-      <w:numFmt w:val="decimal"/>
-      <w:lvlText w:val="%2."/>
-      <w:lvlJc w:val="left"/>
-      <w:pPr>
-        <w:tabs>
-          <w:tab w:val="num" w:pos="1440"/>
-        </w:tabs>
-        <w:ind w:left="1440" w:hanging="360"/>
-      </w:pPr>
-    </w:lvl>
-    <w:lvl w:ilvl="2" w:tentative="1">
-      <w:start w:val="1"/>
-      <w:numFmt w:val="decimal"/>
-      <w:lvlText w:val="%3."/>
-      <w:lvlJc w:val="left"/>
-      <w:pPr>
-        <w:tabs>
-          <w:tab w:val="num" w:pos="2160"/>
-        </w:tabs>
-        <w:ind w:left="2160" w:hanging="360"/>
-      </w:pPr>
-    </w:lvl>
-    <w:lvl w:ilvl="3" w:tentative="1">
-      <w:start w:val="1"/>
-      <w:numFmt w:val="decimal"/>
-      <w:lvlText w:val="%4."/>
-      <w:lvlJc w:val="left"/>
-      <w:pPr>
-        <w:tabs>
-          <w:tab w:val="num" w:pos="2880"/>
-        </w:tabs>
-        <w:ind w:left="2880" w:hanging="360"/>
-      </w:pPr>
-    </w:lvl>
-    <w:lvl w:ilvl="4" w:tentative="1">
-      <w:start w:val="1"/>
-      <w:numFmt w:val="decimal"/>
-      <w:lvlText w:val="%5."/>
-      <w:lvlJc w:val="left"/>
-      <w:pPr>
-        <w:tabs>
-          <w:tab w:val="num" w:pos="3600"/>
-        </w:tabs>
-        <w:ind w:left="3600" w:hanging="360"/>
-      </w:pPr>
-    </w:lvl>
-    <w:lvl w:ilvl="5" w:tentative="1">
-      <w:start w:val="1"/>
-      <w:numFmt w:val="decimal"/>
-      <w:lvlText w:val="%6."/>
-      <w:lvlJc w:val="left"/>
-      <w:pPr>
-        <w:tabs>
-          <w:tab w:val="num" w:pos="4320"/>
-        </w:tabs>
-        <w:ind w:left="4320" w:hanging="360"/>
-      </w:pPr>
-    </w:lvl>
-    <w:lvl w:ilvl="6" w:tentative="1">
-      <w:start w:val="1"/>
-      <w:numFmt w:val="decimal"/>
-      <w:lvlText w:val="%7."/>
-      <w:lvlJc w:val="left"/>
-      <w:pPr>
-        <w:tabs>
-          <w:tab w:val="num" w:pos="5040"/>
-        </w:tabs>
-        <w:ind w:left="5040" w:hanging="360"/>
-      </w:pPr>
-    </w:lvl>
-    <w:lvl w:ilvl="7" w:tentative="1">
-      <w:start w:val="1"/>
-      <w:numFmt w:val="decimal"/>
-      <w:lvlText w:val="%8."/>
-      <w:lvlJc w:val="left"/>
-      <w:pPr>
-        <w:tabs>
-          <w:tab w:val="num" w:pos="5760"/>
-        </w:tabs>
-        <w:ind w:left="5760" w:hanging="360"/>
-      </w:pPr>
-    </w:lvl>
-    <w:lvl w:ilvl="8" w:tentative="1">
-      <w:start w:val="1"/>
-      <w:numFmt w:val="decimal"/>
-      <w:lvlText w:val="%9."/>
-      <w:lvlJc w:val="left"/>
-      <w:pPr>
-        <w:tabs>
-          <w:tab w:val="num" w:pos="6480"/>
-        </w:tabs>
-        <w:ind w:left="6480" w:hanging="360"/>
-      </w:pPr>
-    </w:lvl>
-  </w:abstractNum>
-  <w:abstractNum w:abstractNumId="4" w15:restartNumberingAfterBreak="0">
-    <w:nsid w:val="48BD2C71"/>
-    <w:multiLevelType w:val="multilevel"/>
-    <w:tmpl w:val="26EEC718"/>
+    <w:tmpl w:val="F90AAB94"/>
     <w:lvl w:ilvl="0">
       <w:start w:val="1"/>
       <w:numFmt w:val="bullet"/>
@@ -20541,10 +21176,10 @@
       </w:rPr>
     </w:lvl>
   </w:abstractNum>
-  <w:abstractNum w:abstractNumId="5" w15:restartNumberingAfterBreak="0">
-    <w:nsid w:val="55530A72"/>
+  <w:abstractNum w:abstractNumId="8" w15:restartNumberingAfterBreak="0">
+    <w:nsid w:val="4C855160"/>
     <w:multiLevelType w:val="multilevel"/>
-    <w:tmpl w:val="EE3C2852"/>
+    <w:tmpl w:val="4D1813F0"/>
     <w:lvl w:ilvl="0">
       <w:start w:val="1"/>
       <w:numFmt w:val="decimal"/>
@@ -20654,10 +21289,10 @@
       </w:pPr>
     </w:lvl>
   </w:abstractNum>
-  <w:abstractNum w:abstractNumId="6" w15:restartNumberingAfterBreak="0">
-    <w:nsid w:val="5D8166EF"/>
+  <w:abstractNum w:abstractNumId="9" w15:restartNumberingAfterBreak="0">
+    <w:nsid w:val="553A5ADF"/>
     <w:multiLevelType w:val="multilevel"/>
-    <w:tmpl w:val="5C0E0358"/>
+    <w:tmpl w:val="B62A2040"/>
     <w:lvl w:ilvl="0">
       <w:start w:val="1"/>
       <w:numFmt w:val="decimal"/>
@@ -20767,10 +21402,10 @@
       </w:pPr>
     </w:lvl>
   </w:abstractNum>
-  <w:abstractNum w:abstractNumId="7" w15:restartNumberingAfterBreak="0">
-    <w:nsid w:val="61B81D89"/>
+  <w:abstractNum w:abstractNumId="10" w15:restartNumberingAfterBreak="0">
+    <w:nsid w:val="63726895"/>
     <w:multiLevelType w:val="multilevel"/>
-    <w:tmpl w:val="A31AC49E"/>
+    <w:tmpl w:val="BFF4A172"/>
     <w:lvl w:ilvl="0">
       <w:start w:val="1"/>
       <w:numFmt w:val="decimal"/>
@@ -20880,10 +21515,10 @@
       </w:pPr>
     </w:lvl>
   </w:abstractNum>
-  <w:abstractNum w:abstractNumId="8" w15:restartNumberingAfterBreak="0">
-    <w:nsid w:val="6C6F38EB"/>
+  <w:abstractNum w:abstractNumId="11" w15:restartNumberingAfterBreak="0">
+    <w:nsid w:val="66175256"/>
     <w:multiLevelType w:val="multilevel"/>
-    <w:tmpl w:val="A0F680EC"/>
+    <w:tmpl w:val="EAEE6988"/>
     <w:lvl w:ilvl="0">
       <w:start w:val="1"/>
       <w:numFmt w:val="decimal"/>
@@ -20993,123 +21628,10 @@
       </w:pPr>
     </w:lvl>
   </w:abstractNum>
-  <w:abstractNum w:abstractNumId="9" w15:restartNumberingAfterBreak="0">
-    <w:nsid w:val="6DFC1B1E"/>
+  <w:abstractNum w:abstractNumId="12" w15:restartNumberingAfterBreak="0">
+    <w:nsid w:val="66C15141"/>
     <w:multiLevelType w:val="multilevel"/>
-    <w:tmpl w:val="F90CD7E4"/>
-    <w:lvl w:ilvl="0">
-      <w:start w:val="1"/>
-      <w:numFmt w:val="decimal"/>
-      <w:lvlText w:val="%1."/>
-      <w:lvlJc w:val="left"/>
-      <w:pPr>
-        <w:tabs>
-          <w:tab w:val="num" w:pos="720"/>
-        </w:tabs>
-        <w:ind w:left="720" w:hanging="360"/>
-      </w:pPr>
-    </w:lvl>
-    <w:lvl w:ilvl="1" w:tentative="1">
-      <w:start w:val="1"/>
-      <w:numFmt w:val="decimal"/>
-      <w:lvlText w:val="%2."/>
-      <w:lvlJc w:val="left"/>
-      <w:pPr>
-        <w:tabs>
-          <w:tab w:val="num" w:pos="1440"/>
-        </w:tabs>
-        <w:ind w:left="1440" w:hanging="360"/>
-      </w:pPr>
-    </w:lvl>
-    <w:lvl w:ilvl="2" w:tentative="1">
-      <w:start w:val="1"/>
-      <w:numFmt w:val="decimal"/>
-      <w:lvlText w:val="%3."/>
-      <w:lvlJc w:val="left"/>
-      <w:pPr>
-        <w:tabs>
-          <w:tab w:val="num" w:pos="2160"/>
-        </w:tabs>
-        <w:ind w:left="2160" w:hanging="360"/>
-      </w:pPr>
-    </w:lvl>
-    <w:lvl w:ilvl="3" w:tentative="1">
-      <w:start w:val="1"/>
-      <w:numFmt w:val="decimal"/>
-      <w:lvlText w:val="%4."/>
-      <w:lvlJc w:val="left"/>
-      <w:pPr>
-        <w:tabs>
-          <w:tab w:val="num" w:pos="2880"/>
-        </w:tabs>
-        <w:ind w:left="2880" w:hanging="360"/>
-      </w:pPr>
-    </w:lvl>
-    <w:lvl w:ilvl="4" w:tentative="1">
-      <w:start w:val="1"/>
-      <w:numFmt w:val="decimal"/>
-      <w:lvlText w:val="%5."/>
-      <w:lvlJc w:val="left"/>
-      <w:pPr>
-        <w:tabs>
-          <w:tab w:val="num" w:pos="3600"/>
-        </w:tabs>
-        <w:ind w:left="3600" w:hanging="360"/>
-      </w:pPr>
-    </w:lvl>
-    <w:lvl w:ilvl="5" w:tentative="1">
-      <w:start w:val="1"/>
-      <w:numFmt w:val="decimal"/>
-      <w:lvlText w:val="%6."/>
-      <w:lvlJc w:val="left"/>
-      <w:pPr>
-        <w:tabs>
-          <w:tab w:val="num" w:pos="4320"/>
-        </w:tabs>
-        <w:ind w:left="4320" w:hanging="360"/>
-      </w:pPr>
-    </w:lvl>
-    <w:lvl w:ilvl="6" w:tentative="1">
-      <w:start w:val="1"/>
-      <w:numFmt w:val="decimal"/>
-      <w:lvlText w:val="%7."/>
-      <w:lvlJc w:val="left"/>
-      <w:pPr>
-        <w:tabs>
-          <w:tab w:val="num" w:pos="5040"/>
-        </w:tabs>
-        <w:ind w:left="5040" w:hanging="360"/>
-      </w:pPr>
-    </w:lvl>
-    <w:lvl w:ilvl="7" w:tentative="1">
-      <w:start w:val="1"/>
-      <w:numFmt w:val="decimal"/>
-      <w:lvlText w:val="%8."/>
-      <w:lvlJc w:val="left"/>
-      <w:pPr>
-        <w:tabs>
-          <w:tab w:val="num" w:pos="5760"/>
-        </w:tabs>
-        <w:ind w:left="5760" w:hanging="360"/>
-      </w:pPr>
-    </w:lvl>
-    <w:lvl w:ilvl="8" w:tentative="1">
-      <w:start w:val="1"/>
-      <w:numFmt w:val="decimal"/>
-      <w:lvlText w:val="%9."/>
-      <w:lvlJc w:val="left"/>
-      <w:pPr>
-        <w:tabs>
-          <w:tab w:val="num" w:pos="6480"/>
-        </w:tabs>
-        <w:ind w:left="6480" w:hanging="360"/>
-      </w:pPr>
-    </w:lvl>
-  </w:abstractNum>
-  <w:abstractNum w:abstractNumId="10" w15:restartNumberingAfterBreak="0">
-    <w:nsid w:val="721A1AB0"/>
-    <w:multiLevelType w:val="multilevel"/>
-    <w:tmpl w:val="24AA169E"/>
+    <w:tmpl w:val="FDF2F692"/>
     <w:lvl w:ilvl="0">
       <w:start w:val="1"/>
       <w:numFmt w:val="bullet"/>
@@ -21255,270 +21777,44 @@
       </w:rPr>
     </w:lvl>
   </w:abstractNum>
-  <w:abstractNum w:abstractNumId="11" w15:restartNumberingAfterBreak="0">
-    <w:nsid w:val="74F23493"/>
-    <w:multiLevelType w:val="multilevel"/>
-    <w:tmpl w:val="4D38F550"/>
-    <w:lvl w:ilvl="0">
-      <w:start w:val="1"/>
-      <w:numFmt w:val="decimal"/>
-      <w:lvlText w:val="%1."/>
-      <w:lvlJc w:val="left"/>
-      <w:pPr>
-        <w:tabs>
-          <w:tab w:val="num" w:pos="720"/>
-        </w:tabs>
-        <w:ind w:left="720" w:hanging="360"/>
-      </w:pPr>
-    </w:lvl>
-    <w:lvl w:ilvl="1" w:tentative="1">
-      <w:start w:val="1"/>
-      <w:numFmt w:val="decimal"/>
-      <w:lvlText w:val="%2."/>
-      <w:lvlJc w:val="left"/>
-      <w:pPr>
-        <w:tabs>
-          <w:tab w:val="num" w:pos="1440"/>
-        </w:tabs>
-        <w:ind w:left="1440" w:hanging="360"/>
-      </w:pPr>
-    </w:lvl>
-    <w:lvl w:ilvl="2" w:tentative="1">
-      <w:start w:val="1"/>
-      <w:numFmt w:val="decimal"/>
-      <w:lvlText w:val="%3."/>
-      <w:lvlJc w:val="left"/>
-      <w:pPr>
-        <w:tabs>
-          <w:tab w:val="num" w:pos="2160"/>
-        </w:tabs>
-        <w:ind w:left="2160" w:hanging="360"/>
-      </w:pPr>
-    </w:lvl>
-    <w:lvl w:ilvl="3" w:tentative="1">
-      <w:start w:val="1"/>
-      <w:numFmt w:val="decimal"/>
-      <w:lvlText w:val="%4."/>
-      <w:lvlJc w:val="left"/>
-      <w:pPr>
-        <w:tabs>
-          <w:tab w:val="num" w:pos="2880"/>
-        </w:tabs>
-        <w:ind w:left="2880" w:hanging="360"/>
-      </w:pPr>
-    </w:lvl>
-    <w:lvl w:ilvl="4" w:tentative="1">
-      <w:start w:val="1"/>
-      <w:numFmt w:val="decimal"/>
-      <w:lvlText w:val="%5."/>
-      <w:lvlJc w:val="left"/>
-      <w:pPr>
-        <w:tabs>
-          <w:tab w:val="num" w:pos="3600"/>
-        </w:tabs>
-        <w:ind w:left="3600" w:hanging="360"/>
-      </w:pPr>
-    </w:lvl>
-    <w:lvl w:ilvl="5" w:tentative="1">
-      <w:start w:val="1"/>
-      <w:numFmt w:val="decimal"/>
-      <w:lvlText w:val="%6."/>
-      <w:lvlJc w:val="left"/>
-      <w:pPr>
-        <w:tabs>
-          <w:tab w:val="num" w:pos="4320"/>
-        </w:tabs>
-        <w:ind w:left="4320" w:hanging="360"/>
-      </w:pPr>
-    </w:lvl>
-    <w:lvl w:ilvl="6" w:tentative="1">
-      <w:start w:val="1"/>
-      <w:numFmt w:val="decimal"/>
-      <w:lvlText w:val="%7."/>
-      <w:lvlJc w:val="left"/>
-      <w:pPr>
-        <w:tabs>
-          <w:tab w:val="num" w:pos="5040"/>
-        </w:tabs>
-        <w:ind w:left="5040" w:hanging="360"/>
-      </w:pPr>
-    </w:lvl>
-    <w:lvl w:ilvl="7" w:tentative="1">
-      <w:start w:val="1"/>
-      <w:numFmt w:val="decimal"/>
-      <w:lvlText w:val="%8."/>
-      <w:lvlJc w:val="left"/>
-      <w:pPr>
-        <w:tabs>
-          <w:tab w:val="num" w:pos="5760"/>
-        </w:tabs>
-        <w:ind w:left="5760" w:hanging="360"/>
-      </w:pPr>
-    </w:lvl>
-    <w:lvl w:ilvl="8" w:tentative="1">
-      <w:start w:val="1"/>
-      <w:numFmt w:val="decimal"/>
-      <w:lvlText w:val="%9."/>
-      <w:lvlJc w:val="left"/>
-      <w:pPr>
-        <w:tabs>
-          <w:tab w:val="num" w:pos="6480"/>
-        </w:tabs>
-        <w:ind w:left="6480" w:hanging="360"/>
-      </w:pPr>
-    </w:lvl>
-  </w:abstractNum>
-  <w:abstractNum w:abstractNumId="12" w15:restartNumberingAfterBreak="0">
-    <w:nsid w:val="79C37420"/>
-    <w:multiLevelType w:val="multilevel"/>
-    <w:tmpl w:val="8C2AA9FC"/>
-    <w:lvl w:ilvl="0">
-      <w:start w:val="1"/>
-      <w:numFmt w:val="decimal"/>
-      <w:lvlText w:val="%1."/>
-      <w:lvlJc w:val="left"/>
-      <w:pPr>
-        <w:tabs>
-          <w:tab w:val="num" w:pos="720"/>
-        </w:tabs>
-        <w:ind w:left="720" w:hanging="360"/>
-      </w:pPr>
-    </w:lvl>
-    <w:lvl w:ilvl="1" w:tentative="1">
-      <w:start w:val="1"/>
-      <w:numFmt w:val="decimal"/>
-      <w:lvlText w:val="%2."/>
-      <w:lvlJc w:val="left"/>
-      <w:pPr>
-        <w:tabs>
-          <w:tab w:val="num" w:pos="1440"/>
-        </w:tabs>
-        <w:ind w:left="1440" w:hanging="360"/>
-      </w:pPr>
-    </w:lvl>
-    <w:lvl w:ilvl="2" w:tentative="1">
-      <w:start w:val="1"/>
-      <w:numFmt w:val="decimal"/>
-      <w:lvlText w:val="%3."/>
-      <w:lvlJc w:val="left"/>
-      <w:pPr>
-        <w:tabs>
-          <w:tab w:val="num" w:pos="2160"/>
-        </w:tabs>
-        <w:ind w:left="2160" w:hanging="360"/>
-      </w:pPr>
-    </w:lvl>
-    <w:lvl w:ilvl="3" w:tentative="1">
-      <w:start w:val="1"/>
-      <w:numFmt w:val="decimal"/>
-      <w:lvlText w:val="%4."/>
-      <w:lvlJc w:val="left"/>
-      <w:pPr>
-        <w:tabs>
-          <w:tab w:val="num" w:pos="2880"/>
-        </w:tabs>
-        <w:ind w:left="2880" w:hanging="360"/>
-      </w:pPr>
-    </w:lvl>
-    <w:lvl w:ilvl="4" w:tentative="1">
-      <w:start w:val="1"/>
-      <w:numFmt w:val="decimal"/>
-      <w:lvlText w:val="%5."/>
-      <w:lvlJc w:val="left"/>
-      <w:pPr>
-        <w:tabs>
-          <w:tab w:val="num" w:pos="3600"/>
-        </w:tabs>
-        <w:ind w:left="3600" w:hanging="360"/>
-      </w:pPr>
-    </w:lvl>
-    <w:lvl w:ilvl="5" w:tentative="1">
-      <w:start w:val="1"/>
-      <w:numFmt w:val="decimal"/>
-      <w:lvlText w:val="%6."/>
-      <w:lvlJc w:val="left"/>
-      <w:pPr>
-        <w:tabs>
-          <w:tab w:val="num" w:pos="4320"/>
-        </w:tabs>
-        <w:ind w:left="4320" w:hanging="360"/>
-      </w:pPr>
-    </w:lvl>
-    <w:lvl w:ilvl="6" w:tentative="1">
-      <w:start w:val="1"/>
-      <w:numFmt w:val="decimal"/>
-      <w:lvlText w:val="%7."/>
-      <w:lvlJc w:val="left"/>
-      <w:pPr>
-        <w:tabs>
-          <w:tab w:val="num" w:pos="5040"/>
-        </w:tabs>
-        <w:ind w:left="5040" w:hanging="360"/>
-      </w:pPr>
-    </w:lvl>
-    <w:lvl w:ilvl="7" w:tentative="1">
-      <w:start w:val="1"/>
-      <w:numFmt w:val="decimal"/>
-      <w:lvlText w:val="%8."/>
-      <w:lvlJc w:val="left"/>
-      <w:pPr>
-        <w:tabs>
-          <w:tab w:val="num" w:pos="5760"/>
-        </w:tabs>
-        <w:ind w:left="5760" w:hanging="360"/>
-      </w:pPr>
-    </w:lvl>
-    <w:lvl w:ilvl="8" w:tentative="1">
-      <w:start w:val="1"/>
-      <w:numFmt w:val="decimal"/>
-      <w:lvlText w:val="%9."/>
-      <w:lvlJc w:val="left"/>
-      <w:pPr>
-        <w:tabs>
-          <w:tab w:val="num" w:pos="6480"/>
-        </w:tabs>
-        <w:ind w:left="6480" w:hanging="360"/>
-      </w:pPr>
-    </w:lvl>
-  </w:abstractNum>
-  <w:num w:numId="1" w16cid:durableId="1504660940">
+  <w:num w:numId="1" w16cid:durableId="1900822749">
     <w:abstractNumId w:val="2"/>
   </w:num>
-  <w:num w:numId="2" w16cid:durableId="1670906598">
+  <w:num w:numId="2" w16cid:durableId="97677052">
+    <w:abstractNumId w:val="10"/>
+  </w:num>
+  <w:num w:numId="3" w16cid:durableId="30500312">
+    <w:abstractNumId w:val="1"/>
+  </w:num>
+  <w:num w:numId="4" w16cid:durableId="1849519547">
+    <w:abstractNumId w:val="11"/>
+  </w:num>
+  <w:num w:numId="5" w16cid:durableId="352998315">
+    <w:abstractNumId w:val="8"/>
+  </w:num>
+  <w:num w:numId="6" w16cid:durableId="813721857">
+    <w:abstractNumId w:val="3"/>
+  </w:num>
+  <w:num w:numId="7" w16cid:durableId="691030466">
+    <w:abstractNumId w:val="0"/>
+  </w:num>
+  <w:num w:numId="8" w16cid:durableId="1104152011">
     <w:abstractNumId w:val="9"/>
   </w:num>
-  <w:num w:numId="3" w16cid:durableId="230233741">
+  <w:num w:numId="9" w16cid:durableId="1203783001">
+    <w:abstractNumId w:val="6"/>
+  </w:num>
+  <w:num w:numId="10" w16cid:durableId="344750656">
+    <w:abstractNumId w:val="4"/>
+  </w:num>
+  <w:num w:numId="11" w16cid:durableId="2126001667">
     <w:abstractNumId w:val="5"/>
   </w:num>
-  <w:num w:numId="4" w16cid:durableId="942372646">
-    <w:abstractNumId w:val="7"/>
-  </w:num>
-  <w:num w:numId="5" w16cid:durableId="1575165435">
-    <w:abstractNumId w:val="11"/>
-  </w:num>
-  <w:num w:numId="6" w16cid:durableId="1677340578">
-    <w:abstractNumId w:val="6"/>
-  </w:num>
-  <w:num w:numId="7" w16cid:durableId="56898896">
-    <w:abstractNumId w:val="10"/>
-  </w:num>
-  <w:num w:numId="8" w16cid:durableId="1728725225">
+  <w:num w:numId="12" w16cid:durableId="1765299445">
     <w:abstractNumId w:val="12"/>
   </w:num>
-  <w:num w:numId="9" w16cid:durableId="1627465911">
-    <w:abstractNumId w:val="1"/>
-  </w:num>
-  <w:num w:numId="10" w16cid:durableId="1236941683">
-    <w:abstractNumId w:val="3"/>
-  </w:num>
-  <w:num w:numId="11" w16cid:durableId="1130440403">
-    <w:abstractNumId w:val="8"/>
-  </w:num>
-  <w:num w:numId="12" w16cid:durableId="1137455106">
-    <w:abstractNumId w:val="4"/>
-  </w:num>
-  <w:num w:numId="13" w16cid:durableId="1332754847">
-    <w:abstractNumId w:val="0"/>
+  <w:num w:numId="13" w16cid:durableId="1897354024">
+    <w:abstractNumId w:val="7"/>
   </w:num>
 </w:numbering>
 </file>
@@ -21928,6 +22224,7 @@
     <w:uiPriority w:val="9"/>
     <w:qFormat/>
     <w:pPr>
+      <w:keepNext/>
       <w:spacing w:before="360" w:after="120" w:line="360" w:lineRule="auto"/>
       <w:outlineLvl w:val="0"/>
     </w:pPr>
@@ -21946,6 +22243,7 @@
     <w:uiPriority w:val="9"/>
     <w:qFormat/>
     <w:pPr>
+      <w:keepNext/>
       <w:spacing w:before="240" w:after="80" w:line="360" w:lineRule="auto"/>
       <w:outlineLvl w:val="1"/>
     </w:pPr>
@@ -21963,6 +22261,7 @@
     <w:uiPriority w:val="9"/>
     <w:qFormat/>
     <w:pPr>
+      <w:keepNext/>
       <w:spacing w:before="200" w:after="60" w:line="360" w:lineRule="auto"/>
       <w:outlineLvl w:val="2"/>
     </w:pPr>
@@ -22058,6 +22357,8 @@
     <w:semiHidden/>
     <w:unhideWhenUsed/>
     <w:pPr>
+      <w:keepNext/>
+      <w:keepLines/>
       <w:pBdr>
         <w:top w:val="single" w:sz="6" w:space="5" w:color="000000"/>
         <w:left w:val="single" w:sz="6" w:space="5" w:color="000000"/>
@@ -22087,8 +22388,8 @@
     </w:pPr>
     <w:rPr>
       <w:rFonts w:ascii="Courier New" w:hAnsi="Courier New" w:cs="Courier New"/>
-      <w:sz w:val="19"/>
-      <w:szCs w:val="19"/>
+      <w:sz w:val="17"/>
+      <w:szCs w:val="17"/>
     </w:rPr>
   </w:style>
   <w:style w:type="character" w:customStyle="1" w:styleId="HTMLPreformattedChar">
@@ -22098,7 +22399,10 @@
     <w:uiPriority w:val="99"/>
     <w:semiHidden/>
     <w:rPr>
-      <w:rFonts w:ascii="Consolas" w:eastAsiaTheme="minorEastAsia" w:hAnsi="Consolas"/>
+      <w:rFonts w:ascii="Courier New" w:eastAsiaTheme="minorEastAsia" w:hAnsi="Courier New" w:cs="Courier New"/>
+      <w:sz w:val="17"/>
+      <w:szCs w:val="17"/>
+      <w:shd w:val="clear" w:color="auto" w:fill="FFFFFF"/>
     </w:rPr>
   </w:style>
   <w:style w:type="paragraph" w:customStyle="1" w:styleId="msonormal0">
@@ -22151,6 +22455,7 @@
     <w:name w:val="tcaption"/>
     <w:basedOn w:val="Normal"/>
     <w:pPr>
+      <w:keepNext/>
       <w:spacing w:before="160" w:after="60" w:line="360" w:lineRule="auto"/>
     </w:pPr>
     <w:rPr>
@@ -22164,6 +22469,7 @@
     <w:name w:val="fig"/>
     <w:basedOn w:val="Normal"/>
     <w:pPr>
+      <w:keepNext/>
       <w:spacing w:before="100" w:beforeAutospacing="1" w:after="40" w:line="360" w:lineRule="auto"/>
       <w:jc w:val="center"/>
     </w:pPr>
@@ -22273,7 +22579,7 @@
     <w:link w:val="HeaderChar"/>
     <w:uiPriority w:val="99"/>
     <w:unhideWhenUsed/>
-    <w:rsid w:val="001D77D5"/>
+    <w:rsid w:val="00157F1F"/>
     <w:pPr>
       <w:tabs>
         <w:tab w:val="center" w:pos="4680"/>
@@ -22286,7 +22592,7 @@
     <w:basedOn w:val="DefaultParagraphFont"/>
     <w:link w:val="Header"/>
     <w:uiPriority w:val="99"/>
-    <w:rsid w:val="001D77D5"/>
+    <w:rsid w:val="00157F1F"/>
     <w:rPr>
       <w:rFonts w:eastAsiaTheme="minorEastAsia"/>
       <w:sz w:val="24"/>
@@ -22299,7 +22605,7 @@
     <w:link w:val="FooterChar"/>
     <w:uiPriority w:val="99"/>
     <w:unhideWhenUsed/>
-    <w:rsid w:val="001D77D5"/>
+    <w:rsid w:val="00157F1F"/>
     <w:pPr>
       <w:tabs>
         <w:tab w:val="center" w:pos="4680"/>
@@ -22312,7 +22618,7 @@
     <w:basedOn w:val="DefaultParagraphFont"/>
     <w:link w:val="Footer"/>
     <w:uiPriority w:val="99"/>
-    <w:rsid w:val="001D77D5"/>
+    <w:rsid w:val="00157F1F"/>
     <w:rPr>
       <w:rFonts w:eastAsiaTheme="minorEastAsia"/>
       <w:sz w:val="24"/>
@@ -22325,7 +22631,7 @@
     <w:uiPriority w:val="99"/>
     <w:semiHidden/>
     <w:unhideWhenUsed/>
-    <w:rsid w:val="001D77D5"/>
+    <w:rsid w:val="00157F1F"/>
   </w:style>
   <w:style w:type="character" w:styleId="Hyperlink">
     <w:name w:val="Hyperlink"/>
@@ -22333,7 +22639,7 @@
     <w:uiPriority w:val="99"/>
     <w:semiHidden/>
     <w:unhideWhenUsed/>
-    <w:rsid w:val="001D77D5"/>
+    <w:rsid w:val="00157F1F"/>
     <w:rPr>
       <w:color w:val="auto"/>
       <w:u w:val="single"/>
@@ -22346,7 +22652,7 @@
     <w:autoRedefine/>
     <w:uiPriority w:val="39"/>
     <w:unhideWhenUsed/>
-    <w:rsid w:val="001D77D5"/>
+    <w:rsid w:val="00157F1F"/>
     <w:pPr>
       <w:spacing w:after="100" w:line="360" w:lineRule="auto"/>
     </w:pPr>
@@ -22358,7 +22664,7 @@
     <w:autoRedefine/>
     <w:uiPriority w:val="39"/>
     <w:unhideWhenUsed/>
-    <w:rsid w:val="001D77D5"/>
+    <w:rsid w:val="00157F1F"/>
     <w:pPr>
       <w:spacing w:after="100" w:line="360" w:lineRule="auto"/>
       <w:ind w:left="240"/>
@@ -22372,7 +22678,7 @@
     <w:uiPriority w:val="39"/>
     <w:semiHidden/>
     <w:unhideWhenUsed/>
-    <w:rsid w:val="001D77D5"/>
+    <w:rsid w:val="00157F1F"/>
     <w:pPr>
       <w:spacing w:after="100" w:line="360" w:lineRule="auto"/>
       <w:ind w:left="480"/>

</xml_diff>

<commit_message>
Include the user manual in the report as Appendix D; add links to the title page
</commit_message>
<xml_diff>
--- a/gem_expert/docs/Gemstone_Identification_Assistant_User_Manual.docx
+++ b/gem_expert/docs/Gemstone_Identification_Assistant_User_Manual.docx
@@ -67,7 +67,7 @@
           <w:noProof/>
         </w:rPr>
         <w:drawing>
-          <wp:inline distT="0" distB="0" distL="0" distR="0">
+          <wp:inline distT="0" distB="0" distL="0" distR="0" wp14:anchorId="40C3B93B" wp14:editId="5E36BFED">
             <wp:extent cx="4572635" cy="3028315"/>
             <wp:effectExtent l="0" t="0" r="0" b="635"/>
             <wp:docPr id="1" name="Picture 1"/>
@@ -234,7 +234,7 @@
         <w:rPr>
           <w:noProof/>
         </w:rPr>
-        <w:instrText xml:space="preserve"> PAGEREF _Toc241606803 \h </w:instrText>
+        <w:instrText xml:space="preserve"> PAGEREF _Toc241608273 \h </w:instrText>
       </w:r>
       <w:r>
         <w:rPr>
@@ -296,7 +296,7 @@
         <w:rPr>
           <w:noProof/>
         </w:rPr>
-        <w:instrText xml:space="preserve"> PAGEREF _Toc241606804 \h </w:instrText>
+        <w:instrText xml:space="preserve"> PAGEREF _Toc241608274 \h </w:instrText>
       </w:r>
       <w:r>
         <w:rPr>
@@ -358,7 +358,7 @@
         <w:rPr>
           <w:noProof/>
         </w:rPr>
-        <w:instrText xml:space="preserve"> PAGEREF _Toc241606805 \h </w:instrText>
+        <w:instrText xml:space="preserve"> PAGEREF _Toc241608275 \h </w:instrText>
       </w:r>
       <w:r>
         <w:rPr>
@@ -420,7 +420,7 @@
         <w:rPr>
           <w:noProof/>
         </w:rPr>
-        <w:instrText xml:space="preserve"> PAGEREF _Toc241606806 \h </w:instrText>
+        <w:instrText xml:space="preserve"> PAGEREF _Toc241608276 \h </w:instrText>
       </w:r>
       <w:r>
         <w:rPr>
@@ -482,7 +482,7 @@
         <w:rPr>
           <w:noProof/>
         </w:rPr>
-        <w:instrText xml:space="preserve"> PAGEREF _Toc241606807 \h </w:instrText>
+        <w:instrText xml:space="preserve"> PAGEREF _Toc241608277 \h </w:instrText>
       </w:r>
       <w:r>
         <w:rPr>
@@ -544,7 +544,7 @@
         <w:rPr>
           <w:noProof/>
         </w:rPr>
-        <w:instrText xml:space="preserve"> PAGEREF _Toc241606808 \h </w:instrText>
+        <w:instrText xml:space="preserve"> PAGEREF _Toc241608278 \h </w:instrText>
       </w:r>
       <w:r>
         <w:rPr>
@@ -606,7 +606,7 @@
         <w:rPr>
           <w:noProof/>
         </w:rPr>
-        <w:instrText xml:space="preserve"> PAGEREF _Toc241606809 \h </w:instrText>
+        <w:instrText xml:space="preserve"> PAGEREF _Toc241608279 \h </w:instrText>
       </w:r>
       <w:r>
         <w:rPr>
@@ -668,7 +668,7 @@
         <w:rPr>
           <w:noProof/>
         </w:rPr>
-        <w:instrText xml:space="preserve"> PAGEREF _Toc241606810 \h </w:instrText>
+        <w:instrText xml:space="preserve"> PAGEREF _Toc241608280 \h </w:instrText>
       </w:r>
       <w:r>
         <w:rPr>
@@ -730,7 +730,7 @@
         <w:rPr>
           <w:noProof/>
         </w:rPr>
-        <w:instrText xml:space="preserve"> PAGEREF _Toc241606811 \h </w:instrText>
+        <w:instrText xml:space="preserve"> PAGEREF _Toc241608281 \h </w:instrText>
       </w:r>
       <w:r>
         <w:rPr>
@@ -792,7 +792,7 @@
         <w:rPr>
           <w:noProof/>
         </w:rPr>
-        <w:instrText xml:space="preserve"> PAGEREF _Toc241606812 \h </w:instrText>
+        <w:instrText xml:space="preserve"> PAGEREF _Toc241608282 \h </w:instrText>
       </w:r>
       <w:r>
         <w:rPr>
@@ -854,7 +854,7 @@
         <w:rPr>
           <w:noProof/>
         </w:rPr>
-        <w:instrText xml:space="preserve"> PAGEREF _Toc241606813 \h </w:instrText>
+        <w:instrText xml:space="preserve"> PAGEREF _Toc241608283 \h </w:instrText>
       </w:r>
       <w:r>
         <w:rPr>
@@ -916,7 +916,7 @@
         <w:rPr>
           <w:noProof/>
         </w:rPr>
-        <w:instrText xml:space="preserve"> PAGEREF _Toc241606814 \h </w:instrText>
+        <w:instrText xml:space="preserve"> PAGEREF _Toc241608284 \h </w:instrText>
       </w:r>
       <w:r>
         <w:rPr>
@@ -978,7 +978,7 @@
         <w:rPr>
           <w:noProof/>
         </w:rPr>
-        <w:instrText xml:space="preserve"> PAGEREF _Toc241606815 \h </w:instrText>
+        <w:instrText xml:space="preserve"> PAGEREF _Toc241608285 \h </w:instrText>
       </w:r>
       <w:r>
         <w:rPr>
@@ -1040,7 +1040,7 @@
         <w:rPr>
           <w:noProof/>
         </w:rPr>
-        <w:instrText xml:space="preserve"> PAGEREF _Toc241606816 \h </w:instrText>
+        <w:instrText xml:space="preserve"> PAGEREF _Toc241608286 \h </w:instrText>
       </w:r>
       <w:r>
         <w:rPr>
@@ -1102,7 +1102,7 @@
         <w:rPr>
           <w:noProof/>
         </w:rPr>
-        <w:instrText xml:space="preserve"> PAGEREF _Toc241606817 \h </w:instrText>
+        <w:instrText xml:space="preserve"> PAGEREF _Toc241608287 \h </w:instrText>
       </w:r>
       <w:r>
         <w:rPr>
@@ -1164,7 +1164,7 @@
         <w:rPr>
           <w:noProof/>
         </w:rPr>
-        <w:instrText xml:space="preserve"> PAGEREF _Toc241606818 \h </w:instrText>
+        <w:instrText xml:space="preserve"> PAGEREF _Toc241608288 \h </w:instrText>
       </w:r>
       <w:r>
         <w:rPr>
@@ -1226,7 +1226,7 @@
         <w:rPr>
           <w:noProof/>
         </w:rPr>
-        <w:instrText xml:space="preserve"> PAGEREF _Toc241606819 \h </w:instrText>
+        <w:instrText xml:space="preserve"> PAGEREF _Toc241608289 \h </w:instrText>
       </w:r>
       <w:r>
         <w:rPr>
@@ -1288,7 +1288,7 @@
         <w:rPr>
           <w:noProof/>
         </w:rPr>
-        <w:instrText xml:space="preserve"> PAGEREF _Toc241606820 \h </w:instrText>
+        <w:instrText xml:space="preserve"> PAGEREF _Toc241608290 \h </w:instrText>
       </w:r>
       <w:r>
         <w:rPr>
@@ -1350,7 +1350,7 @@
         <w:rPr>
           <w:noProof/>
         </w:rPr>
-        <w:instrText xml:space="preserve"> PAGEREF _Toc241606821 \h </w:instrText>
+        <w:instrText xml:space="preserve"> PAGEREF _Toc241608291 \h </w:instrText>
       </w:r>
       <w:r>
         <w:rPr>
@@ -1412,7 +1412,7 @@
         <w:rPr>
           <w:noProof/>
         </w:rPr>
-        <w:instrText xml:space="preserve"> PAGEREF _Toc241606822 \h </w:instrText>
+        <w:instrText xml:space="preserve"> PAGEREF _Toc241608292 \h </w:instrText>
       </w:r>
       <w:r>
         <w:rPr>
@@ -1474,7 +1474,7 @@
         <w:rPr>
           <w:noProof/>
         </w:rPr>
-        <w:instrText xml:space="preserve"> PAGEREF _Toc241606823 \h </w:instrText>
+        <w:instrText xml:space="preserve"> PAGEREF _Toc241608293 \h </w:instrText>
       </w:r>
       <w:r>
         <w:rPr>
@@ -1536,7 +1536,7 @@
         <w:rPr>
           <w:noProof/>
         </w:rPr>
-        <w:instrText xml:space="preserve"> PAGEREF _Toc241606824 \h </w:instrText>
+        <w:instrText xml:space="preserve"> PAGEREF _Toc241608294 \h </w:instrText>
       </w:r>
       <w:r>
         <w:rPr>
@@ -1598,7 +1598,7 @@
         <w:rPr>
           <w:noProof/>
         </w:rPr>
-        <w:instrText xml:space="preserve"> PAGEREF _Toc241606825 \h </w:instrText>
+        <w:instrText xml:space="preserve"> PAGEREF _Toc241608295 \h </w:instrText>
       </w:r>
       <w:r>
         <w:rPr>
@@ -1660,7 +1660,7 @@
         <w:rPr>
           <w:noProof/>
         </w:rPr>
-        <w:instrText xml:space="preserve"> PAGEREF _Toc241606826 \h </w:instrText>
+        <w:instrText xml:space="preserve"> PAGEREF _Toc241608296 \h </w:instrText>
       </w:r>
       <w:r>
         <w:rPr>
@@ -1722,7 +1722,7 @@
         <w:rPr>
           <w:noProof/>
         </w:rPr>
-        <w:instrText xml:space="preserve"> PAGEREF _Toc241606827 \h </w:instrText>
+        <w:instrText xml:space="preserve"> PAGEREF _Toc241608297 \h </w:instrText>
       </w:r>
       <w:r>
         <w:rPr>
@@ -1784,7 +1784,7 @@
         <w:rPr>
           <w:noProof/>
         </w:rPr>
-        <w:instrText xml:space="preserve"> PAGEREF _Toc241606828 \h </w:instrText>
+        <w:instrText xml:space="preserve"> PAGEREF _Toc241608298 \h </w:instrText>
       </w:r>
       <w:r>
         <w:rPr>
@@ -1847,7 +1847,7 @@
         <w:rPr>
           <w:noProof/>
         </w:rPr>
-        <w:instrText xml:space="preserve"> PAGEREF _Toc241606829 \h </w:instrText>
+        <w:instrText xml:space="preserve"> PAGEREF _Toc241608299 \h </w:instrText>
       </w:r>
       <w:r>
         <w:rPr>
@@ -1909,7 +1909,7 @@
         <w:rPr>
           <w:noProof/>
         </w:rPr>
-        <w:instrText xml:space="preserve"> PAGEREF _Toc241606830 \h </w:instrText>
+        <w:instrText xml:space="preserve"> PAGEREF _Toc241608300 \h </w:instrText>
       </w:r>
       <w:r>
         <w:rPr>
@@ -1971,7 +1971,7 @@
         <w:rPr>
           <w:noProof/>
         </w:rPr>
-        <w:instrText xml:space="preserve"> PAGEREF _Toc241606831 \h </w:instrText>
+        <w:instrText xml:space="preserve"> PAGEREF _Toc241608301 \h </w:instrText>
       </w:r>
       <w:r>
         <w:rPr>
@@ -2033,7 +2033,7 @@
         <w:rPr>
           <w:noProof/>
         </w:rPr>
-        <w:instrText xml:space="preserve"> PAGEREF _Toc241606832 \h </w:instrText>
+        <w:instrText xml:space="preserve"> PAGEREF _Toc241608302 \h </w:instrText>
       </w:r>
       <w:r>
         <w:rPr>
@@ -2095,7 +2095,7 @@
         <w:rPr>
           <w:noProof/>
         </w:rPr>
-        <w:instrText xml:space="preserve"> PAGEREF _Toc241606833 \h </w:instrText>
+        <w:instrText xml:space="preserve"> PAGEREF _Toc241608303 \h </w:instrText>
       </w:r>
       <w:r>
         <w:rPr>
@@ -2157,7 +2157,7 @@
         <w:rPr>
           <w:noProof/>
         </w:rPr>
-        <w:instrText xml:space="preserve"> PAGEREF _Toc241606834 \h </w:instrText>
+        <w:instrText xml:space="preserve"> PAGEREF _Toc241608304 \h </w:instrText>
       </w:r>
       <w:r>
         <w:rPr>
@@ -2219,7 +2219,7 @@
         <w:rPr>
           <w:noProof/>
         </w:rPr>
-        <w:instrText xml:space="preserve"> PAGEREF _Toc241606835 \h </w:instrText>
+        <w:instrText xml:space="preserve"> PAGEREF _Toc241608305 \h </w:instrText>
       </w:r>
       <w:r>
         <w:rPr>
@@ -2281,7 +2281,7 @@
         <w:rPr>
           <w:noProof/>
         </w:rPr>
-        <w:instrText xml:space="preserve"> PAGEREF _Toc241606836 \h </w:instrText>
+        <w:instrText xml:space="preserve"> PAGEREF _Toc241608306 \h </w:instrText>
       </w:r>
       <w:r>
         <w:rPr>
@@ -2343,7 +2343,7 @@
         <w:rPr>
           <w:noProof/>
         </w:rPr>
-        <w:instrText xml:space="preserve"> PAGEREF _Toc241606837 \h </w:instrText>
+        <w:instrText xml:space="preserve"> PAGEREF _Toc241608307 \h </w:instrText>
       </w:r>
       <w:r>
         <w:rPr>
@@ -2390,7 +2390,7 @@
         </w:rPr>
         <w:br w:type="page"/>
       </w:r>
-      <w:bookmarkStart w:id="0" w:name="_Toc241606803"/>
+      <w:bookmarkStart w:id="0" w:name="_Toc241608273"/>
       <w:r>
         <w:rPr>
           <w:rFonts w:eastAsia="Times New Roman"/>
@@ -2530,7 +2530,7 @@
         <w:shd w:val="clear" w:color="auto" w:fill="FFFFFF"/>
         <w:spacing w:line="360" w:lineRule="auto"/>
         <w:jc w:val="both"/>
-        <w:divId w:val="451871003"/>
+        <w:divId w:val="343016079"/>
         <w:rPr>
           <w:rFonts w:eastAsia="Times New Roman"/>
         </w:rPr>
@@ -2563,7 +2563,7 @@
           <w:rFonts w:eastAsia="Times New Roman"/>
         </w:rPr>
       </w:pPr>
-      <w:bookmarkStart w:id="1" w:name="_Toc241606804"/>
+      <w:bookmarkStart w:id="1" w:name="_Toc241608274"/>
       <w:r>
         <w:rPr>
           <w:rFonts w:eastAsia="Times New Roman"/>
@@ -3097,7 +3097,7 @@
           <w:rFonts w:eastAsia="Times New Roman"/>
         </w:rPr>
       </w:pPr>
-      <w:bookmarkStart w:id="2" w:name="_Toc241606805"/>
+      <w:bookmarkStart w:id="2" w:name="_Toc241608275"/>
       <w:r>
         <w:rPr>
           <w:rFonts w:eastAsia="Times New Roman"/>
@@ -3725,7 +3725,7 @@
           <w:rFonts w:eastAsia="Times New Roman"/>
         </w:rPr>
       </w:pPr>
-      <w:bookmarkStart w:id="3" w:name="_Toc241606806"/>
+      <w:bookmarkStart w:id="3" w:name="_Toc241608276"/>
       <w:r>
         <w:rPr>
           <w:rFonts w:eastAsia="Times New Roman"/>
@@ -3812,7 +3812,7 @@
         <w:shd w:val="clear" w:color="auto" w:fill="FFFFFF"/>
         <w:spacing w:line="360" w:lineRule="auto"/>
         <w:jc w:val="both"/>
-        <w:divId w:val="1490632411"/>
+        <w:divId w:val="1270772040"/>
         <w:rPr>
           <w:rFonts w:eastAsia="Times New Roman"/>
         </w:rPr>
@@ -3853,7 +3853,7 @@
           <w:rFonts w:eastAsia="Times New Roman"/>
         </w:rPr>
       </w:pPr>
-      <w:bookmarkStart w:id="4" w:name="_Toc241606807"/>
+      <w:bookmarkStart w:id="4" w:name="_Toc241608277"/>
       <w:r>
         <w:rPr>
           <w:rFonts w:eastAsia="Times New Roman"/>
@@ -3870,7 +3870,7 @@
           <w:rFonts w:eastAsia="Times New Roman"/>
         </w:rPr>
       </w:pPr>
-      <w:bookmarkStart w:id="5" w:name="_Toc241606808"/>
+      <w:bookmarkStart w:id="5" w:name="_Toc241608278"/>
       <w:r>
         <w:rPr>
           <w:rFonts w:eastAsia="Times New Roman"/>
@@ -4500,7 +4500,7 @@
           <w:rFonts w:eastAsia="Times New Roman"/>
         </w:rPr>
       </w:pPr>
-      <w:bookmarkStart w:id="6" w:name="_Toc241606809"/>
+      <w:bookmarkStart w:id="6" w:name="_Toc241608279"/>
       <w:r>
         <w:rPr>
           <w:rFonts w:eastAsia="Times New Roman"/>
@@ -4706,7 +4706,7 @@
           <w:rFonts w:eastAsia="Times New Roman"/>
         </w:rPr>
       </w:pPr>
-      <w:bookmarkStart w:id="7" w:name="_Toc241606810"/>
+      <w:bookmarkStart w:id="7" w:name="_Toc241608280"/>
       <w:r>
         <w:rPr>
           <w:rFonts w:eastAsia="Times New Roman"/>
@@ -5036,7 +5036,7 @@
         <w:shd w:val="clear" w:color="auto" w:fill="FFFFFF"/>
         <w:spacing w:line="360" w:lineRule="auto"/>
         <w:jc w:val="both"/>
-        <w:divId w:val="2124569089"/>
+        <w:divId w:val="941718606"/>
         <w:rPr>
           <w:rFonts w:eastAsia="Times New Roman"/>
         </w:rPr>
@@ -5068,7 +5068,7 @@
           <w:rFonts w:eastAsia="Times New Roman"/>
         </w:rPr>
       </w:pPr>
-      <w:bookmarkStart w:id="8" w:name="_Toc241606811"/>
+      <w:bookmarkStart w:id="8" w:name="_Toc241608281"/>
       <w:r>
         <w:rPr>
           <w:rFonts w:eastAsia="Times New Roman"/>
@@ -5279,7 +5279,7 @@
         <w:shd w:val="clear" w:color="auto" w:fill="FFFFFF"/>
         <w:spacing w:line="360" w:lineRule="auto"/>
         <w:jc w:val="both"/>
-        <w:divId w:val="1603299125"/>
+        <w:divId w:val="1301417586"/>
         <w:rPr>
           <w:rFonts w:eastAsia="Times New Roman"/>
         </w:rPr>
@@ -5298,7 +5298,7 @@
           <w:rFonts w:eastAsia="Times New Roman"/>
         </w:rPr>
       </w:pPr>
-      <w:bookmarkStart w:id="9" w:name="_Toc241606812"/>
+      <w:bookmarkStart w:id="9" w:name="_Toc241608282"/>
       <w:r>
         <w:rPr>
           <w:rFonts w:eastAsia="Times New Roman"/>
@@ -6010,7 +6010,7 @@
         <w:shd w:val="clear" w:color="auto" w:fill="FFFFFF"/>
         <w:spacing w:line="360" w:lineRule="auto"/>
         <w:jc w:val="both"/>
-        <w:divId w:val="1321932772"/>
+        <w:divId w:val="789203855"/>
         <w:rPr>
           <w:rFonts w:eastAsia="Times New Roman"/>
         </w:rPr>
@@ -6041,7 +6041,7 @@
         <w:shd w:val="clear" w:color="auto" w:fill="FFFFFF"/>
         <w:spacing w:line="360" w:lineRule="auto"/>
         <w:jc w:val="both"/>
-        <w:divId w:val="81336660"/>
+        <w:divId w:val="1335106764"/>
         <w:rPr>
           <w:rFonts w:eastAsia="Times New Roman"/>
         </w:rPr>
@@ -6072,7 +6072,7 @@
           <w:rFonts w:eastAsia="Times New Roman"/>
         </w:rPr>
       </w:pPr>
-      <w:bookmarkStart w:id="10" w:name="_Toc241606813"/>
+      <w:bookmarkStart w:id="10" w:name="_Toc241608283"/>
       <w:r>
         <w:rPr>
           <w:rFonts w:eastAsia="Times New Roman"/>
@@ -6150,7 +6150,7 @@
           <w:rFonts w:eastAsia="Times New Roman"/>
         </w:rPr>
       </w:pPr>
-      <w:bookmarkStart w:id="11" w:name="_Toc241606814"/>
+      <w:bookmarkStart w:id="11" w:name="_Toc241608284"/>
       <w:r>
         <w:rPr>
           <w:rFonts w:eastAsia="Times New Roman"/>
@@ -6170,7 +6170,7 @@
           <w:noProof/>
         </w:rPr>
         <w:drawing>
-          <wp:inline distT="0" distB="0" distL="0" distR="0">
+          <wp:inline distT="0" distB="0" distL="0" distR="0" wp14:anchorId="0B407471" wp14:editId="0A14E235">
             <wp:extent cx="5332730" cy="3524885"/>
             <wp:effectExtent l="0" t="0" r="1270" b="0"/>
             <wp:docPr id="2" name="Picture 2"/>
@@ -6337,7 +6337,7 @@
         </w:rPr>
         <w:lastRenderedPageBreak/>
         <w:drawing>
-          <wp:inline distT="0" distB="0" distL="0" distR="0">
+          <wp:inline distT="0" distB="0" distL="0" distR="0" wp14:anchorId="50FC688D" wp14:editId="7E43D591">
             <wp:extent cx="5143500" cy="2990215"/>
             <wp:effectExtent l="0" t="0" r="0" b="635"/>
             <wp:docPr id="3" name="Picture 3"/>
@@ -6402,7 +6402,7 @@
           <w:rFonts w:eastAsia="Times New Roman"/>
         </w:rPr>
       </w:pPr>
-      <w:bookmarkStart w:id="12" w:name="_Toc241606815"/>
+      <w:bookmarkStart w:id="12" w:name="_Toc241608285"/>
       <w:r>
         <w:rPr>
           <w:rFonts w:eastAsia="Times New Roman"/>
@@ -6460,7 +6460,7 @@
         </w:rPr>
         <w:lastRenderedPageBreak/>
         <w:drawing>
-          <wp:inline distT="0" distB="0" distL="0" distR="0">
+          <wp:inline distT="0" distB="0" distL="0" distR="0" wp14:anchorId="0B650E8B" wp14:editId="3EEBAF81">
             <wp:extent cx="4954270" cy="7601585"/>
             <wp:effectExtent l="0" t="0" r="0" b="0"/>
             <wp:docPr id="4" name="Picture 4"/>
@@ -7836,7 +7836,7 @@
           <w:rFonts w:eastAsia="Times New Roman"/>
         </w:rPr>
       </w:pPr>
-      <w:bookmarkStart w:id="13" w:name="_Toc241606816"/>
+      <w:bookmarkStart w:id="13" w:name="_Toc241608286"/>
       <w:r>
         <w:rPr>
           <w:rFonts w:eastAsia="Times New Roman"/>
@@ -7994,7 +7994,7 @@
           <w:noProof/>
         </w:rPr>
         <w:drawing>
-          <wp:inline distT="0" distB="0" distL="0" distR="0">
+          <wp:inline distT="0" distB="0" distL="0" distR="0" wp14:anchorId="72B8CCDD" wp14:editId="369834CB">
             <wp:extent cx="5143500" cy="3152140"/>
             <wp:effectExtent l="0" t="0" r="0" b="0"/>
             <wp:docPr id="5" name="Picture 5"/>
@@ -8117,7 +8117,7 @@
           <w:rFonts w:eastAsia="Times New Roman"/>
         </w:rPr>
       </w:pPr>
-      <w:bookmarkStart w:id="14" w:name="_Toc241606817"/>
+      <w:bookmarkStart w:id="14" w:name="_Toc241608287"/>
       <w:r>
         <w:rPr>
           <w:rFonts w:eastAsia="Times New Roman"/>
@@ -8133,7 +8133,7 @@
           <w:rFonts w:eastAsia="Times New Roman"/>
         </w:rPr>
       </w:pPr>
-      <w:bookmarkStart w:id="15" w:name="_Toc241606818"/>
+      <w:bookmarkStart w:id="15" w:name="_Toc241608288"/>
       <w:r>
         <w:rPr>
           <w:rFonts w:eastAsia="Times New Roman"/>
@@ -8220,7 +8220,7 @@
           <w:rFonts w:eastAsia="Times New Roman"/>
         </w:rPr>
       </w:pPr>
-      <w:bookmarkStart w:id="16" w:name="_Toc241606819"/>
+      <w:bookmarkStart w:id="16" w:name="_Toc241608289"/>
       <w:r>
         <w:rPr>
           <w:rFonts w:eastAsia="Times New Roman"/>
@@ -8240,7 +8240,7 @@
           <w:noProof/>
         </w:rPr>
         <w:drawing>
-          <wp:inline distT="0" distB="0" distL="0" distR="0">
+          <wp:inline distT="0" distB="0" distL="0" distR="0" wp14:anchorId="082E28FD" wp14:editId="6DE73232">
             <wp:extent cx="4095750" cy="3286125"/>
             <wp:effectExtent l="0" t="0" r="0" b="9525"/>
             <wp:docPr id="6" name="Picture 6"/>
@@ -9641,7 +9641,7 @@
           <w:rFonts w:eastAsia="Times New Roman"/>
         </w:rPr>
       </w:pPr>
-      <w:bookmarkStart w:id="17" w:name="_Toc241606820"/>
+      <w:bookmarkStart w:id="17" w:name="_Toc241608290"/>
       <w:r>
         <w:rPr>
           <w:rFonts w:eastAsia="Times New Roman"/>
@@ -9660,7 +9660,7 @@
           <w:noProof/>
         </w:rPr>
         <w:drawing>
-          <wp:inline distT="0" distB="0" distL="0" distR="0">
+          <wp:inline distT="0" distB="0" distL="0" distR="0" wp14:anchorId="597DA285" wp14:editId="43D0B9FC">
             <wp:extent cx="4095750" cy="4268470"/>
             <wp:effectExtent l="0" t="0" r="0" b="0"/>
             <wp:docPr id="7" name="Picture 7"/>
@@ -9837,7 +9837,7 @@
           <w:rFonts w:eastAsia="Times New Roman"/>
         </w:rPr>
       </w:pPr>
-      <w:bookmarkStart w:id="18" w:name="_Toc241606821"/>
+      <w:bookmarkStart w:id="18" w:name="_Toc241608291"/>
       <w:r>
         <w:rPr>
           <w:rFonts w:eastAsia="Times New Roman"/>
@@ -9895,7 +9895,7 @@
           <w:noProof/>
         </w:rPr>
         <w:drawing>
-          <wp:inline distT="0" distB="0" distL="0" distR="0">
+          <wp:inline distT="0" distB="0" distL="0" distR="0" wp14:anchorId="397BC114" wp14:editId="5BAAEF82">
             <wp:extent cx="4095750" cy="4534535"/>
             <wp:effectExtent l="0" t="0" r="0" b="0"/>
             <wp:docPr id="8" name="Picture 8"/>
@@ -9960,7 +9960,7 @@
           <w:rFonts w:eastAsia="Times New Roman"/>
         </w:rPr>
       </w:pPr>
-      <w:bookmarkStart w:id="19" w:name="_Toc241606822"/>
+      <w:bookmarkStart w:id="19" w:name="_Toc241608292"/>
       <w:r>
         <w:rPr>
           <w:rFonts w:eastAsia="Times New Roman"/>
@@ -10140,7 +10140,7 @@
           <w:noProof/>
         </w:rPr>
         <w:drawing>
-          <wp:inline distT="0" distB="0" distL="0" distR="0">
+          <wp:inline distT="0" distB="0" distL="0" distR="0" wp14:anchorId="47B346DC" wp14:editId="43B250B2">
             <wp:extent cx="4095750" cy="2180590"/>
             <wp:effectExtent l="0" t="0" r="0" b="0"/>
             <wp:docPr id="9" name="Picture 9"/>
@@ -10205,7 +10205,7 @@
           <w:rFonts w:eastAsia="Times New Roman"/>
         </w:rPr>
       </w:pPr>
-      <w:bookmarkStart w:id="20" w:name="_Toc241606823"/>
+      <w:bookmarkStart w:id="20" w:name="_Toc241608293"/>
       <w:r>
         <w:rPr>
           <w:rFonts w:eastAsia="Times New Roman"/>
@@ -10463,7 +10463,7 @@
         </w:rPr>
         <w:lastRenderedPageBreak/>
         <w:drawing>
-          <wp:inline distT="0" distB="0" distL="0" distR="0">
+          <wp:inline distT="0" distB="0" distL="0" distR="0" wp14:anchorId="2ACE9049" wp14:editId="51820F45">
             <wp:extent cx="4095750" cy="2847340"/>
             <wp:effectExtent l="0" t="0" r="0" b="0"/>
             <wp:docPr id="10" name="Picture 10"/>
@@ -10526,7 +10526,7 @@
         <w:shd w:val="clear" w:color="auto" w:fill="FFFFFF"/>
         <w:spacing w:line="360" w:lineRule="auto"/>
         <w:jc w:val="both"/>
-        <w:divId w:val="1582258498"/>
+        <w:divId w:val="1625648054"/>
         <w:rPr>
           <w:rFonts w:eastAsia="Times New Roman"/>
         </w:rPr>
@@ -10559,7 +10559,7 @@
           <w:rFonts w:eastAsia="Times New Roman"/>
         </w:rPr>
       </w:pPr>
-      <w:bookmarkStart w:id="21" w:name="_Toc241606824"/>
+      <w:bookmarkStart w:id="21" w:name="_Toc241608294"/>
       <w:r>
         <w:rPr>
           <w:rFonts w:eastAsia="Times New Roman"/>
@@ -10689,7 +10689,7 @@
         </w:rPr>
         <w:lastRenderedPageBreak/>
         <w:drawing>
-          <wp:inline distT="0" distB="0" distL="0" distR="0">
+          <wp:inline distT="0" distB="0" distL="0" distR="0" wp14:anchorId="0590A03D" wp14:editId="185FF34B">
             <wp:extent cx="4095750" cy="2142490"/>
             <wp:effectExtent l="0" t="0" r="0" b="0"/>
             <wp:docPr id="11" name="Picture 11"/>
@@ -10754,7 +10754,7 @@
           <w:rFonts w:eastAsia="Times New Roman"/>
         </w:rPr>
       </w:pPr>
-      <w:bookmarkStart w:id="22" w:name="_Toc241606825"/>
+      <w:bookmarkStart w:id="22" w:name="_Toc241608295"/>
       <w:r>
         <w:rPr>
           <w:rFonts w:eastAsia="Times New Roman"/>
@@ -10821,7 +10821,7 @@
           <w:noProof/>
         </w:rPr>
         <w:drawing>
-          <wp:inline distT="0" distB="0" distL="0" distR="0">
+          <wp:inline distT="0" distB="0" distL="0" distR="0" wp14:anchorId="34054163" wp14:editId="48AA5532">
             <wp:extent cx="5143500" cy="3333115"/>
             <wp:effectExtent l="0" t="0" r="0" b="635"/>
             <wp:docPr id="12" name="Picture 12"/>
@@ -10904,7 +10904,7 @@
           <w:rFonts w:eastAsia="Times New Roman"/>
         </w:rPr>
       </w:pPr>
-      <w:bookmarkStart w:id="23" w:name="_Toc241606826"/>
+      <w:bookmarkStart w:id="23" w:name="_Toc241608296"/>
       <w:r>
         <w:rPr>
           <w:rFonts w:eastAsia="Times New Roman"/>
@@ -11308,7 +11308,7 @@
           <w:rFonts w:eastAsia="Times New Roman"/>
         </w:rPr>
       </w:pPr>
-      <w:bookmarkStart w:id="24" w:name="_Toc241606827"/>
+      <w:bookmarkStart w:id="24" w:name="_Toc241608297"/>
       <w:r>
         <w:rPr>
           <w:rFonts w:eastAsia="Times New Roman"/>
@@ -11623,7 +11623,7 @@
           <w:noProof/>
         </w:rPr>
         <w:drawing>
-          <wp:inline distT="0" distB="0" distL="0" distR="0">
+          <wp:inline distT="0" distB="0" distL="0" distR="0" wp14:anchorId="49933E06" wp14:editId="30BF445F">
             <wp:extent cx="4095750" cy="1409700"/>
             <wp:effectExtent l="0" t="0" r="0" b="0"/>
             <wp:docPr id="13" name="Picture 13"/>
@@ -11688,7 +11688,7 @@
           <w:rFonts w:eastAsia="Times New Roman"/>
         </w:rPr>
       </w:pPr>
-      <w:bookmarkStart w:id="25" w:name="_Toc241606828"/>
+      <w:bookmarkStart w:id="25" w:name="_Toc241608298"/>
       <w:r>
         <w:rPr>
           <w:rFonts w:eastAsia="Times New Roman"/>
@@ -11935,7 +11935,7 @@
           <w:rFonts w:eastAsia="Times New Roman"/>
         </w:rPr>
       </w:pPr>
-      <w:bookmarkStart w:id="26" w:name="_Toc241606829"/>
+      <w:bookmarkStart w:id="26" w:name="_Toc241608299"/>
       <w:r>
         <w:rPr>
           <w:rFonts w:eastAsia="Times New Roman"/>
@@ -12269,7 +12269,7 @@
         </w:rPr>
         <w:lastRenderedPageBreak/>
         <w:drawing>
-          <wp:inline distT="0" distB="0" distL="0" distR="0">
+          <wp:inline distT="0" distB="0" distL="0" distR="0" wp14:anchorId="34AEC256" wp14:editId="2F621E35">
             <wp:extent cx="4095750" cy="1409700"/>
             <wp:effectExtent l="0" t="0" r="0" b="0"/>
             <wp:docPr id="14" name="Picture 14"/>
@@ -12334,7 +12334,7 @@
           <w:rFonts w:eastAsia="Times New Roman"/>
         </w:rPr>
       </w:pPr>
-      <w:bookmarkStart w:id="27" w:name="_Toc241606830"/>
+      <w:bookmarkStart w:id="27" w:name="_Toc241608300"/>
       <w:r>
         <w:rPr>
           <w:rFonts w:eastAsia="Times New Roman"/>
@@ -12381,7 +12381,7 @@
           <w:noProof/>
         </w:rPr>
         <w:drawing>
-          <wp:inline distT="0" distB="0" distL="0" distR="0">
+          <wp:inline distT="0" distB="0" distL="0" distR="0" wp14:anchorId="622D9D3C" wp14:editId="32D4001B">
             <wp:extent cx="3143885" cy="4068445"/>
             <wp:effectExtent l="0" t="0" r="0" b="8255"/>
             <wp:docPr id="15" name="Picture 15"/>
@@ -12446,7 +12446,7 @@
           <w:rFonts w:eastAsia="Times New Roman"/>
         </w:rPr>
       </w:pPr>
-      <w:bookmarkStart w:id="28" w:name="_Toc241606831"/>
+      <w:bookmarkStart w:id="28" w:name="_Toc241608301"/>
       <w:r>
         <w:rPr>
           <w:rFonts w:eastAsia="Times New Roman"/>
@@ -12494,7 +12494,7 @@
           <w:noProof/>
         </w:rPr>
         <w:drawing>
-          <wp:inline distT="0" distB="0" distL="0" distR="0">
+          <wp:inline distT="0" distB="0" distL="0" distR="0" wp14:anchorId="1977B3B2" wp14:editId="20356B57">
             <wp:extent cx="4954270" cy="990600"/>
             <wp:effectExtent l="0" t="0" r="0" b="0"/>
             <wp:docPr id="16" name="Picture 16"/>
@@ -12557,7 +12557,7 @@
         <w:shd w:val="clear" w:color="auto" w:fill="FFFFFF"/>
         <w:spacing w:line="360" w:lineRule="auto"/>
         <w:jc w:val="both"/>
-        <w:divId w:val="1050768844"/>
+        <w:divId w:val="1489665222"/>
         <w:rPr>
           <w:rFonts w:eastAsia="Times New Roman"/>
         </w:rPr>
@@ -12576,7 +12576,7 @@
           <w:rFonts w:eastAsia="Times New Roman"/>
         </w:rPr>
       </w:pPr>
-      <w:bookmarkStart w:id="29" w:name="_Toc241606832"/>
+      <w:bookmarkStart w:id="29" w:name="_Toc241608302"/>
       <w:r>
         <w:rPr>
           <w:rFonts w:eastAsia="Times New Roman"/>
@@ -12636,7 +12636,7 @@
         </w:rPr>
         <w:lastRenderedPageBreak/>
         <w:drawing>
-          <wp:inline distT="0" distB="0" distL="0" distR="0">
+          <wp:inline distT="0" distB="0" distL="0" distR="0" wp14:anchorId="3C639A82" wp14:editId="76B203C8">
             <wp:extent cx="3999865" cy="3725545"/>
             <wp:effectExtent l="0" t="0" r="635" b="8255"/>
             <wp:docPr id="17" name="Picture 17"/>
@@ -12701,7 +12701,7 @@
           <w:rFonts w:eastAsia="Times New Roman"/>
         </w:rPr>
       </w:pPr>
-      <w:bookmarkStart w:id="30" w:name="_Toc241606833"/>
+      <w:bookmarkStart w:id="30" w:name="_Toc241608303"/>
       <w:r>
         <w:rPr>
           <w:rFonts w:eastAsia="Times New Roman"/>
@@ -14266,7 +14266,7 @@
           <w:rFonts w:eastAsia="Times New Roman"/>
         </w:rPr>
       </w:pPr>
-      <w:bookmarkStart w:id="31" w:name="_Toc241606834"/>
+      <w:bookmarkStart w:id="31" w:name="_Toc241608304"/>
       <w:r>
         <w:rPr>
           <w:rFonts w:eastAsia="Times New Roman"/>
@@ -14609,7 +14609,7 @@
           <w:rFonts w:eastAsia="Times New Roman"/>
         </w:rPr>
       </w:pPr>
-      <w:bookmarkStart w:id="32" w:name="_Toc241606835"/>
+      <w:bookmarkStart w:id="32" w:name="_Toc241608305"/>
       <w:r>
         <w:rPr>
           <w:rFonts w:eastAsia="Times New Roman"/>
@@ -14695,7 +14695,7 @@
           <w:rFonts w:eastAsia="Times New Roman"/>
         </w:rPr>
       </w:pPr>
-      <w:bookmarkStart w:id="33" w:name="_Toc241606836"/>
+      <w:bookmarkStart w:id="33" w:name="_Toc241608306"/>
       <w:r>
         <w:rPr>
           <w:rFonts w:eastAsia="Times New Roman"/>
@@ -15894,7 +15894,7 @@
         </w:rPr>
         <w:br w:type="page"/>
       </w:r>
-      <w:bookmarkStart w:id="34" w:name="_Toc241606837"/>
+      <w:bookmarkStart w:id="34" w:name="_Toc241608307"/>
       <w:r>
         <w:rPr>
           <w:rFonts w:eastAsia="Times New Roman"/>
@@ -16572,7 +16572,7 @@
                 <w:szCs w:val="18"/>
               </w:rPr>
               <w:drawing>
-                <wp:inline distT="0" distB="0" distL="0" distR="0">
+                <wp:inline distT="0" distB="0" distL="0" distR="0" wp14:anchorId="1B29EAA9" wp14:editId="02B69DE5">
                   <wp:extent cx="457835" cy="457835"/>
                   <wp:effectExtent l="0" t="0" r="0" b="0"/>
                   <wp:docPr id="18" name="Picture 18"/>
@@ -17003,7 +17003,7 @@
                 <w:szCs w:val="18"/>
               </w:rPr>
               <w:drawing>
-                <wp:inline distT="0" distB="0" distL="0" distR="0">
+                <wp:inline distT="0" distB="0" distL="0" distR="0" wp14:anchorId="7B618417" wp14:editId="6659163A">
                   <wp:extent cx="457835" cy="457835"/>
                   <wp:effectExtent l="0" t="0" r="0" b="0"/>
                   <wp:docPr id="19" name="Picture 19"/>
@@ -17434,7 +17434,7 @@
                 <w:szCs w:val="18"/>
               </w:rPr>
               <w:drawing>
-                <wp:inline distT="0" distB="0" distL="0" distR="0">
+                <wp:inline distT="0" distB="0" distL="0" distR="0" wp14:anchorId="3A939321" wp14:editId="7AD55CE1">
                   <wp:extent cx="457835" cy="457835"/>
                   <wp:effectExtent l="0" t="0" r="0" b="0"/>
                   <wp:docPr id="20" name="Picture 20"/>
@@ -17866,7 +17866,7 @@
               </w:rPr>
               <w:lastRenderedPageBreak/>
               <w:drawing>
-                <wp:inline distT="0" distB="0" distL="0" distR="0">
+                <wp:inline distT="0" distB="0" distL="0" distR="0" wp14:anchorId="315635C5" wp14:editId="57914372">
                   <wp:extent cx="457835" cy="457835"/>
                   <wp:effectExtent l="0" t="0" r="0" b="0"/>
                   <wp:docPr id="21" name="Picture 21"/>
@@ -18297,7 +18297,7 @@
                 <w:szCs w:val="18"/>
               </w:rPr>
               <w:drawing>
-                <wp:inline distT="0" distB="0" distL="0" distR="0">
+                <wp:inline distT="0" distB="0" distL="0" distR="0" wp14:anchorId="2D88C8B1" wp14:editId="4074B003">
                   <wp:extent cx="457835" cy="457835"/>
                   <wp:effectExtent l="0" t="0" r="0" b="0"/>
                   <wp:docPr id="22" name="Picture 22"/>
@@ -18728,7 +18728,7 @@
                 <w:szCs w:val="18"/>
               </w:rPr>
               <w:drawing>
-                <wp:inline distT="0" distB="0" distL="0" distR="0">
+                <wp:inline distT="0" distB="0" distL="0" distR="0" wp14:anchorId="425A1985" wp14:editId="5D0C6B13">
                   <wp:extent cx="457835" cy="457835"/>
                   <wp:effectExtent l="0" t="0" r="0" b="0"/>
                   <wp:docPr id="23" name="Picture 23"/>
@@ -19159,7 +19159,7 @@
                 <w:szCs w:val="18"/>
               </w:rPr>
               <w:drawing>
-                <wp:inline distT="0" distB="0" distL="0" distR="0">
+                <wp:inline distT="0" distB="0" distL="0" distR="0" wp14:anchorId="192B8A34" wp14:editId="5ABE9950">
                   <wp:extent cx="457835" cy="457835"/>
                   <wp:effectExtent l="0" t="0" r="0" b="0"/>
                   <wp:docPr id="24" name="Picture 24"/>
@@ -19590,7 +19590,7 @@
                 <w:szCs w:val="18"/>
               </w:rPr>
               <w:drawing>
-                <wp:inline distT="0" distB="0" distL="0" distR="0">
+                <wp:inline distT="0" distB="0" distL="0" distR="0" wp14:anchorId="5D5A24E7" wp14:editId="61CEEF48">
                   <wp:extent cx="457835" cy="457835"/>
                   <wp:effectExtent l="0" t="0" r="0" b="0"/>
                   <wp:docPr id="25" name="Picture 25"/>
@@ -20021,7 +20021,7 @@
                 <w:szCs w:val="18"/>
               </w:rPr>
               <w:drawing>
-                <wp:inline distT="0" distB="0" distL="0" distR="0">
+                <wp:inline distT="0" distB="0" distL="0" distR="0" wp14:anchorId="3B55642F" wp14:editId="2176B372">
                   <wp:extent cx="457835" cy="457835"/>
                   <wp:effectExtent l="0" t="0" r="0" b="0"/>
                   <wp:docPr id="26" name="Picture 26"/>
@@ -20452,7 +20452,7 @@
                 <w:szCs w:val="18"/>
               </w:rPr>
               <w:drawing>
-                <wp:inline distT="0" distB="0" distL="0" distR="0">
+                <wp:inline distT="0" distB="0" distL="0" distR="0" wp14:anchorId="214104C5" wp14:editId="39021F47">
                   <wp:extent cx="457835" cy="457835"/>
                   <wp:effectExtent l="0" t="0" r="0" b="0"/>
                   <wp:docPr id="27" name="Picture 27"/>
@@ -20883,7 +20883,7 @@
                 <w:szCs w:val="18"/>
               </w:rPr>
               <w:drawing>
-                <wp:inline distT="0" distB="0" distL="0" distR="0">
+                <wp:inline distT="0" distB="0" distL="0" distR="0" wp14:anchorId="57F7B85B" wp14:editId="0C2315A5">
                   <wp:extent cx="457835" cy="457835"/>
                   <wp:effectExtent l="0" t="0" r="0" b="0"/>
                   <wp:docPr id="28" name="Picture 28"/>
@@ -21314,7 +21314,7 @@
                 <w:szCs w:val="18"/>
               </w:rPr>
               <w:drawing>
-                <wp:inline distT="0" distB="0" distL="0" distR="0">
+                <wp:inline distT="0" distB="0" distL="0" distR="0" wp14:anchorId="1D5D1AF0" wp14:editId="52CC8BFC">
                   <wp:extent cx="457835" cy="457835"/>
                   <wp:effectExtent l="0" t="0" r="0" b="0"/>
                   <wp:docPr id="29" name="Picture 29"/>
@@ -21710,7 +21710,7 @@
         <w:shd w:val="clear" w:color="auto" w:fill="FFFFFF"/>
         <w:spacing w:line="360" w:lineRule="auto"/>
         <w:jc w:val="both"/>
-        <w:divId w:val="1803964318"/>
+        <w:divId w:val="171989377"/>
         <w:rPr>
           <w:rFonts w:eastAsia="Times New Roman"/>
         </w:rPr>
@@ -21913,122 +21913,9 @@
 <file path=word/numbering.xml><?xml version="1.0" encoding="utf-8"?>
 <w:numbering xmlns:wpc="http://schemas.microsoft.com/office/word/2010/wordprocessingCanvas" xmlns:cx="http://schemas.microsoft.com/office/drawing/2014/chartex" xmlns:cx1="http://schemas.microsoft.com/office/drawing/2015/9/8/chartex" xmlns:cx2="http://schemas.microsoft.com/office/drawing/2015/10/21/chartex" xmlns:cx3="http://schemas.microsoft.com/office/drawing/2016/5/9/chartex" xmlns:cx4="http://schemas.microsoft.com/office/drawing/2016/5/10/chartex" xmlns:cx5="http://schemas.microsoft.com/office/drawing/2016/5/11/chartex" xmlns:cx6="http://schemas.microsoft.com/office/drawing/2016/5/12/chartex" xmlns:cx7="http://schemas.microsoft.com/office/drawing/2016/5/13/chartex" xmlns:cx8="http://schemas.microsoft.com/office/drawing/2016/5/14/chartex" xmlns:mc="http://schemas.openxmlformats.org/markup-compatibility/2006" xmlns:aink="http://schemas.microsoft.com/office/drawing/2016/ink" xmlns:am3d="http://schemas.microsoft.com/office/drawing/2017/model3d" xmlns:o="urn:schemas-microsoft-com:office:office" xmlns:oel="http://schemas.microsoft.com/office/2019/extlst" xmlns:r="http://schemas.openxmlformats.org/officeDocument/2006/relationships" xmlns:m="http://schemas.openxmlformats.org/officeDocument/2006/math" xmlns:v="urn:schemas-microsoft-com:vml" xmlns:wp14="http://schemas.microsoft.com/office/word/2010/wordprocessingDrawing" xmlns:wp="http://schemas.openxmlformats.org/drawingml/2006/wordprocessingDrawing" xmlns:w10="urn:schemas-microsoft-com:office:word" xmlns:w="http://schemas.openxmlformats.org/wordprocessingml/2006/main" xmlns:w14="http://schemas.microsoft.com/office/word/2010/wordml" xmlns:w15="http://schemas.microsoft.com/office/word/2012/wordml" xmlns:w16cex="http://schemas.microsoft.com/office/word/2018/wordml/cex" xmlns:w16cid="http://schemas.microsoft.com/office/word/2016/wordml/cid" xmlns:w16="http://schemas.microsoft.com/office/word/2018/wordml" xmlns:w16du="http://schemas.microsoft.com/office/word/2023/wordml/word16du" xmlns:w16sdtdh="http://schemas.microsoft.com/office/word/2020/wordml/sdtdatahash" xmlns:w16sdtfl="http://schemas.microsoft.com/office/word/2024/wordml/sdtformatlock" xmlns:w16se="http://schemas.microsoft.com/office/word/2015/wordml/symex" xmlns:wpg="http://schemas.microsoft.com/office/word/2010/wordprocessingGroup" xmlns:wpi="http://schemas.microsoft.com/office/word/2010/wordprocessingInk" xmlns:wne="http://schemas.microsoft.com/office/word/2006/wordml" xmlns:wps="http://schemas.microsoft.com/office/word/2010/wordprocessingShape" mc:Ignorable="w14 w15 w16se w16cid w16 w16cex w16sdtdh w16sdtfl w16du wp14">
   <w:abstractNum w:abstractNumId="0" w15:restartNumberingAfterBreak="0">
-    <w:nsid w:val="22955A5B"/>
+    <w:nsid w:val="14C31EF6"/>
     <w:multiLevelType w:val="multilevel"/>
-    <w:tmpl w:val="311442FE"/>
-    <w:lvl w:ilvl="0">
-      <w:start w:val="1"/>
-      <w:numFmt w:val="decimal"/>
-      <w:lvlText w:val="%1."/>
-      <w:lvlJc w:val="left"/>
-      <w:pPr>
-        <w:tabs>
-          <w:tab w:val="num" w:pos="720"/>
-        </w:tabs>
-        <w:ind w:left="720" w:hanging="360"/>
-      </w:pPr>
-    </w:lvl>
-    <w:lvl w:ilvl="1" w:tentative="1">
-      <w:start w:val="1"/>
-      <w:numFmt w:val="decimal"/>
-      <w:lvlText w:val="%2."/>
-      <w:lvlJc w:val="left"/>
-      <w:pPr>
-        <w:tabs>
-          <w:tab w:val="num" w:pos="1440"/>
-        </w:tabs>
-        <w:ind w:left="1440" w:hanging="360"/>
-      </w:pPr>
-    </w:lvl>
-    <w:lvl w:ilvl="2" w:tentative="1">
-      <w:start w:val="1"/>
-      <w:numFmt w:val="decimal"/>
-      <w:lvlText w:val="%3."/>
-      <w:lvlJc w:val="left"/>
-      <w:pPr>
-        <w:tabs>
-          <w:tab w:val="num" w:pos="2160"/>
-        </w:tabs>
-        <w:ind w:left="2160" w:hanging="360"/>
-      </w:pPr>
-    </w:lvl>
-    <w:lvl w:ilvl="3" w:tentative="1">
-      <w:start w:val="1"/>
-      <w:numFmt w:val="decimal"/>
-      <w:lvlText w:val="%4."/>
-      <w:lvlJc w:val="left"/>
-      <w:pPr>
-        <w:tabs>
-          <w:tab w:val="num" w:pos="2880"/>
-        </w:tabs>
-        <w:ind w:left="2880" w:hanging="360"/>
-      </w:pPr>
-    </w:lvl>
-    <w:lvl w:ilvl="4" w:tentative="1">
-      <w:start w:val="1"/>
-      <w:numFmt w:val="decimal"/>
-      <w:lvlText w:val="%5."/>
-      <w:lvlJc w:val="left"/>
-      <w:pPr>
-        <w:tabs>
-          <w:tab w:val="num" w:pos="3600"/>
-        </w:tabs>
-        <w:ind w:left="3600" w:hanging="360"/>
-      </w:pPr>
-    </w:lvl>
-    <w:lvl w:ilvl="5" w:tentative="1">
-      <w:start w:val="1"/>
-      <w:numFmt w:val="decimal"/>
-      <w:lvlText w:val="%6."/>
-      <w:lvlJc w:val="left"/>
-      <w:pPr>
-        <w:tabs>
-          <w:tab w:val="num" w:pos="4320"/>
-        </w:tabs>
-        <w:ind w:left="4320" w:hanging="360"/>
-      </w:pPr>
-    </w:lvl>
-    <w:lvl w:ilvl="6" w:tentative="1">
-      <w:start w:val="1"/>
-      <w:numFmt w:val="decimal"/>
-      <w:lvlText w:val="%7."/>
-      <w:lvlJc w:val="left"/>
-      <w:pPr>
-        <w:tabs>
-          <w:tab w:val="num" w:pos="5040"/>
-        </w:tabs>
-        <w:ind w:left="5040" w:hanging="360"/>
-      </w:pPr>
-    </w:lvl>
-    <w:lvl w:ilvl="7" w:tentative="1">
-      <w:start w:val="1"/>
-      <w:numFmt w:val="decimal"/>
-      <w:lvlText w:val="%8."/>
-      <w:lvlJc w:val="left"/>
-      <w:pPr>
-        <w:tabs>
-          <w:tab w:val="num" w:pos="5760"/>
-        </w:tabs>
-        <w:ind w:left="5760" w:hanging="360"/>
-      </w:pPr>
-    </w:lvl>
-    <w:lvl w:ilvl="8" w:tentative="1">
-      <w:start w:val="1"/>
-      <w:numFmt w:val="decimal"/>
-      <w:lvlText w:val="%9."/>
-      <w:lvlJc w:val="left"/>
-      <w:pPr>
-        <w:tabs>
-          <w:tab w:val="num" w:pos="6480"/>
-        </w:tabs>
-        <w:ind w:left="6480" w:hanging="360"/>
-      </w:pPr>
-    </w:lvl>
-  </w:abstractNum>
-  <w:abstractNum w:abstractNumId="1" w15:restartNumberingAfterBreak="0">
-    <w:nsid w:val="26942AAC"/>
-    <w:multiLevelType w:val="multilevel"/>
-    <w:tmpl w:val="65BE9E8A"/>
+    <w:tmpl w:val="FE663EDC"/>
     <w:lvl w:ilvl="0">
       <w:start w:val="1"/>
       <w:numFmt w:val="bullet"/>
@@ -22174,349 +22061,10 @@
       </w:rPr>
     </w:lvl>
   </w:abstractNum>
-  <w:abstractNum w:abstractNumId="2" w15:restartNumberingAfterBreak="0">
-    <w:nsid w:val="27145C1A"/>
+  <w:abstractNum w:abstractNumId="1" w15:restartNumberingAfterBreak="0">
+    <w:nsid w:val="20410DBC"/>
     <w:multiLevelType w:val="multilevel"/>
-    <w:tmpl w:val="30EC52C8"/>
-    <w:lvl w:ilvl="0">
-      <w:start w:val="1"/>
-      <w:numFmt w:val="decimal"/>
-      <w:lvlText w:val="%1."/>
-      <w:lvlJc w:val="left"/>
-      <w:pPr>
-        <w:tabs>
-          <w:tab w:val="num" w:pos="720"/>
-        </w:tabs>
-        <w:ind w:left="720" w:hanging="360"/>
-      </w:pPr>
-    </w:lvl>
-    <w:lvl w:ilvl="1" w:tentative="1">
-      <w:start w:val="1"/>
-      <w:numFmt w:val="decimal"/>
-      <w:lvlText w:val="%2."/>
-      <w:lvlJc w:val="left"/>
-      <w:pPr>
-        <w:tabs>
-          <w:tab w:val="num" w:pos="1440"/>
-        </w:tabs>
-        <w:ind w:left="1440" w:hanging="360"/>
-      </w:pPr>
-    </w:lvl>
-    <w:lvl w:ilvl="2" w:tentative="1">
-      <w:start w:val="1"/>
-      <w:numFmt w:val="decimal"/>
-      <w:lvlText w:val="%3."/>
-      <w:lvlJc w:val="left"/>
-      <w:pPr>
-        <w:tabs>
-          <w:tab w:val="num" w:pos="2160"/>
-        </w:tabs>
-        <w:ind w:left="2160" w:hanging="360"/>
-      </w:pPr>
-    </w:lvl>
-    <w:lvl w:ilvl="3" w:tentative="1">
-      <w:start w:val="1"/>
-      <w:numFmt w:val="decimal"/>
-      <w:lvlText w:val="%4."/>
-      <w:lvlJc w:val="left"/>
-      <w:pPr>
-        <w:tabs>
-          <w:tab w:val="num" w:pos="2880"/>
-        </w:tabs>
-        <w:ind w:left="2880" w:hanging="360"/>
-      </w:pPr>
-    </w:lvl>
-    <w:lvl w:ilvl="4" w:tentative="1">
-      <w:start w:val="1"/>
-      <w:numFmt w:val="decimal"/>
-      <w:lvlText w:val="%5."/>
-      <w:lvlJc w:val="left"/>
-      <w:pPr>
-        <w:tabs>
-          <w:tab w:val="num" w:pos="3600"/>
-        </w:tabs>
-        <w:ind w:left="3600" w:hanging="360"/>
-      </w:pPr>
-    </w:lvl>
-    <w:lvl w:ilvl="5" w:tentative="1">
-      <w:start w:val="1"/>
-      <w:numFmt w:val="decimal"/>
-      <w:lvlText w:val="%6."/>
-      <w:lvlJc w:val="left"/>
-      <w:pPr>
-        <w:tabs>
-          <w:tab w:val="num" w:pos="4320"/>
-        </w:tabs>
-        <w:ind w:left="4320" w:hanging="360"/>
-      </w:pPr>
-    </w:lvl>
-    <w:lvl w:ilvl="6" w:tentative="1">
-      <w:start w:val="1"/>
-      <w:numFmt w:val="decimal"/>
-      <w:lvlText w:val="%7."/>
-      <w:lvlJc w:val="left"/>
-      <w:pPr>
-        <w:tabs>
-          <w:tab w:val="num" w:pos="5040"/>
-        </w:tabs>
-        <w:ind w:left="5040" w:hanging="360"/>
-      </w:pPr>
-    </w:lvl>
-    <w:lvl w:ilvl="7" w:tentative="1">
-      <w:start w:val="1"/>
-      <w:numFmt w:val="decimal"/>
-      <w:lvlText w:val="%8."/>
-      <w:lvlJc w:val="left"/>
-      <w:pPr>
-        <w:tabs>
-          <w:tab w:val="num" w:pos="5760"/>
-        </w:tabs>
-        <w:ind w:left="5760" w:hanging="360"/>
-      </w:pPr>
-    </w:lvl>
-    <w:lvl w:ilvl="8" w:tentative="1">
-      <w:start w:val="1"/>
-      <w:numFmt w:val="decimal"/>
-      <w:lvlText w:val="%9."/>
-      <w:lvlJc w:val="left"/>
-      <w:pPr>
-        <w:tabs>
-          <w:tab w:val="num" w:pos="6480"/>
-        </w:tabs>
-        <w:ind w:left="6480" w:hanging="360"/>
-      </w:pPr>
-    </w:lvl>
-  </w:abstractNum>
-  <w:abstractNum w:abstractNumId="3" w15:restartNumberingAfterBreak="0">
-    <w:nsid w:val="2C1E3212"/>
-    <w:multiLevelType w:val="multilevel"/>
-    <w:tmpl w:val="10A84022"/>
-    <w:lvl w:ilvl="0">
-      <w:start w:val="1"/>
-      <w:numFmt w:val="decimal"/>
-      <w:lvlText w:val="%1."/>
-      <w:lvlJc w:val="left"/>
-      <w:pPr>
-        <w:tabs>
-          <w:tab w:val="num" w:pos="720"/>
-        </w:tabs>
-        <w:ind w:left="720" w:hanging="360"/>
-      </w:pPr>
-    </w:lvl>
-    <w:lvl w:ilvl="1" w:tentative="1">
-      <w:start w:val="1"/>
-      <w:numFmt w:val="decimal"/>
-      <w:lvlText w:val="%2."/>
-      <w:lvlJc w:val="left"/>
-      <w:pPr>
-        <w:tabs>
-          <w:tab w:val="num" w:pos="1440"/>
-        </w:tabs>
-        <w:ind w:left="1440" w:hanging="360"/>
-      </w:pPr>
-    </w:lvl>
-    <w:lvl w:ilvl="2" w:tentative="1">
-      <w:start w:val="1"/>
-      <w:numFmt w:val="decimal"/>
-      <w:lvlText w:val="%3."/>
-      <w:lvlJc w:val="left"/>
-      <w:pPr>
-        <w:tabs>
-          <w:tab w:val="num" w:pos="2160"/>
-        </w:tabs>
-        <w:ind w:left="2160" w:hanging="360"/>
-      </w:pPr>
-    </w:lvl>
-    <w:lvl w:ilvl="3" w:tentative="1">
-      <w:start w:val="1"/>
-      <w:numFmt w:val="decimal"/>
-      <w:lvlText w:val="%4."/>
-      <w:lvlJc w:val="left"/>
-      <w:pPr>
-        <w:tabs>
-          <w:tab w:val="num" w:pos="2880"/>
-        </w:tabs>
-        <w:ind w:left="2880" w:hanging="360"/>
-      </w:pPr>
-    </w:lvl>
-    <w:lvl w:ilvl="4" w:tentative="1">
-      <w:start w:val="1"/>
-      <w:numFmt w:val="decimal"/>
-      <w:lvlText w:val="%5."/>
-      <w:lvlJc w:val="left"/>
-      <w:pPr>
-        <w:tabs>
-          <w:tab w:val="num" w:pos="3600"/>
-        </w:tabs>
-        <w:ind w:left="3600" w:hanging="360"/>
-      </w:pPr>
-    </w:lvl>
-    <w:lvl w:ilvl="5" w:tentative="1">
-      <w:start w:val="1"/>
-      <w:numFmt w:val="decimal"/>
-      <w:lvlText w:val="%6."/>
-      <w:lvlJc w:val="left"/>
-      <w:pPr>
-        <w:tabs>
-          <w:tab w:val="num" w:pos="4320"/>
-        </w:tabs>
-        <w:ind w:left="4320" w:hanging="360"/>
-      </w:pPr>
-    </w:lvl>
-    <w:lvl w:ilvl="6" w:tentative="1">
-      <w:start w:val="1"/>
-      <w:numFmt w:val="decimal"/>
-      <w:lvlText w:val="%7."/>
-      <w:lvlJc w:val="left"/>
-      <w:pPr>
-        <w:tabs>
-          <w:tab w:val="num" w:pos="5040"/>
-        </w:tabs>
-        <w:ind w:left="5040" w:hanging="360"/>
-      </w:pPr>
-    </w:lvl>
-    <w:lvl w:ilvl="7" w:tentative="1">
-      <w:start w:val="1"/>
-      <w:numFmt w:val="decimal"/>
-      <w:lvlText w:val="%8."/>
-      <w:lvlJc w:val="left"/>
-      <w:pPr>
-        <w:tabs>
-          <w:tab w:val="num" w:pos="5760"/>
-        </w:tabs>
-        <w:ind w:left="5760" w:hanging="360"/>
-      </w:pPr>
-    </w:lvl>
-    <w:lvl w:ilvl="8" w:tentative="1">
-      <w:start w:val="1"/>
-      <w:numFmt w:val="decimal"/>
-      <w:lvlText w:val="%9."/>
-      <w:lvlJc w:val="left"/>
-      <w:pPr>
-        <w:tabs>
-          <w:tab w:val="num" w:pos="6480"/>
-        </w:tabs>
-        <w:ind w:left="6480" w:hanging="360"/>
-      </w:pPr>
-    </w:lvl>
-  </w:abstractNum>
-  <w:abstractNum w:abstractNumId="4" w15:restartNumberingAfterBreak="0">
-    <w:nsid w:val="2E0772DB"/>
-    <w:multiLevelType w:val="multilevel"/>
-    <w:tmpl w:val="15769D02"/>
-    <w:lvl w:ilvl="0">
-      <w:start w:val="1"/>
-      <w:numFmt w:val="decimal"/>
-      <w:lvlText w:val="%1."/>
-      <w:lvlJc w:val="left"/>
-      <w:pPr>
-        <w:tabs>
-          <w:tab w:val="num" w:pos="720"/>
-        </w:tabs>
-        <w:ind w:left="720" w:hanging="360"/>
-      </w:pPr>
-    </w:lvl>
-    <w:lvl w:ilvl="1" w:tentative="1">
-      <w:start w:val="1"/>
-      <w:numFmt w:val="decimal"/>
-      <w:lvlText w:val="%2."/>
-      <w:lvlJc w:val="left"/>
-      <w:pPr>
-        <w:tabs>
-          <w:tab w:val="num" w:pos="1440"/>
-        </w:tabs>
-        <w:ind w:left="1440" w:hanging="360"/>
-      </w:pPr>
-    </w:lvl>
-    <w:lvl w:ilvl="2" w:tentative="1">
-      <w:start w:val="1"/>
-      <w:numFmt w:val="decimal"/>
-      <w:lvlText w:val="%3."/>
-      <w:lvlJc w:val="left"/>
-      <w:pPr>
-        <w:tabs>
-          <w:tab w:val="num" w:pos="2160"/>
-        </w:tabs>
-        <w:ind w:left="2160" w:hanging="360"/>
-      </w:pPr>
-    </w:lvl>
-    <w:lvl w:ilvl="3" w:tentative="1">
-      <w:start w:val="1"/>
-      <w:numFmt w:val="decimal"/>
-      <w:lvlText w:val="%4."/>
-      <w:lvlJc w:val="left"/>
-      <w:pPr>
-        <w:tabs>
-          <w:tab w:val="num" w:pos="2880"/>
-        </w:tabs>
-        <w:ind w:left="2880" w:hanging="360"/>
-      </w:pPr>
-    </w:lvl>
-    <w:lvl w:ilvl="4" w:tentative="1">
-      <w:start w:val="1"/>
-      <w:numFmt w:val="decimal"/>
-      <w:lvlText w:val="%5."/>
-      <w:lvlJc w:val="left"/>
-      <w:pPr>
-        <w:tabs>
-          <w:tab w:val="num" w:pos="3600"/>
-        </w:tabs>
-        <w:ind w:left="3600" w:hanging="360"/>
-      </w:pPr>
-    </w:lvl>
-    <w:lvl w:ilvl="5" w:tentative="1">
-      <w:start w:val="1"/>
-      <w:numFmt w:val="decimal"/>
-      <w:lvlText w:val="%6."/>
-      <w:lvlJc w:val="left"/>
-      <w:pPr>
-        <w:tabs>
-          <w:tab w:val="num" w:pos="4320"/>
-        </w:tabs>
-        <w:ind w:left="4320" w:hanging="360"/>
-      </w:pPr>
-    </w:lvl>
-    <w:lvl w:ilvl="6" w:tentative="1">
-      <w:start w:val="1"/>
-      <w:numFmt w:val="decimal"/>
-      <w:lvlText w:val="%7."/>
-      <w:lvlJc w:val="left"/>
-      <w:pPr>
-        <w:tabs>
-          <w:tab w:val="num" w:pos="5040"/>
-        </w:tabs>
-        <w:ind w:left="5040" w:hanging="360"/>
-      </w:pPr>
-    </w:lvl>
-    <w:lvl w:ilvl="7" w:tentative="1">
-      <w:start w:val="1"/>
-      <w:numFmt w:val="decimal"/>
-      <w:lvlText w:val="%8."/>
-      <w:lvlJc w:val="left"/>
-      <w:pPr>
-        <w:tabs>
-          <w:tab w:val="num" w:pos="5760"/>
-        </w:tabs>
-        <w:ind w:left="5760" w:hanging="360"/>
-      </w:pPr>
-    </w:lvl>
-    <w:lvl w:ilvl="8" w:tentative="1">
-      <w:start w:val="1"/>
-      <w:numFmt w:val="decimal"/>
-      <w:lvlText w:val="%9."/>
-      <w:lvlJc w:val="left"/>
-      <w:pPr>
-        <w:tabs>
-          <w:tab w:val="num" w:pos="6480"/>
-        </w:tabs>
-        <w:ind w:left="6480" w:hanging="360"/>
-      </w:pPr>
-    </w:lvl>
-  </w:abstractNum>
-  <w:abstractNum w:abstractNumId="5" w15:restartNumberingAfterBreak="0">
-    <w:nsid w:val="422A76CE"/>
-    <w:multiLevelType w:val="multilevel"/>
-    <w:tmpl w:val="F7F29D22"/>
+    <w:tmpl w:val="54B62CA6"/>
     <w:lvl w:ilvl="0">
       <w:start w:val="1"/>
       <w:numFmt w:val="bullet"/>
@@ -22662,10 +22210,236 @@
       </w:rPr>
     </w:lvl>
   </w:abstractNum>
-  <w:abstractNum w:abstractNumId="6" w15:restartNumberingAfterBreak="0">
-    <w:nsid w:val="4D5D2C31"/>
+  <w:abstractNum w:abstractNumId="2" w15:restartNumberingAfterBreak="0">
+    <w:nsid w:val="20BA3E13"/>
     <w:multiLevelType w:val="multilevel"/>
-    <w:tmpl w:val="29A88CEA"/>
+    <w:tmpl w:val="65CA647C"/>
+    <w:lvl w:ilvl="0">
+      <w:start w:val="1"/>
+      <w:numFmt w:val="decimal"/>
+      <w:lvlText w:val="%1."/>
+      <w:lvlJc w:val="left"/>
+      <w:pPr>
+        <w:tabs>
+          <w:tab w:val="num" w:pos="720"/>
+        </w:tabs>
+        <w:ind w:left="720" w:hanging="360"/>
+      </w:pPr>
+    </w:lvl>
+    <w:lvl w:ilvl="1" w:tentative="1">
+      <w:start w:val="1"/>
+      <w:numFmt w:val="decimal"/>
+      <w:lvlText w:val="%2."/>
+      <w:lvlJc w:val="left"/>
+      <w:pPr>
+        <w:tabs>
+          <w:tab w:val="num" w:pos="1440"/>
+        </w:tabs>
+        <w:ind w:left="1440" w:hanging="360"/>
+      </w:pPr>
+    </w:lvl>
+    <w:lvl w:ilvl="2" w:tentative="1">
+      <w:start w:val="1"/>
+      <w:numFmt w:val="decimal"/>
+      <w:lvlText w:val="%3."/>
+      <w:lvlJc w:val="left"/>
+      <w:pPr>
+        <w:tabs>
+          <w:tab w:val="num" w:pos="2160"/>
+        </w:tabs>
+        <w:ind w:left="2160" w:hanging="360"/>
+      </w:pPr>
+    </w:lvl>
+    <w:lvl w:ilvl="3" w:tentative="1">
+      <w:start w:val="1"/>
+      <w:numFmt w:val="decimal"/>
+      <w:lvlText w:val="%4."/>
+      <w:lvlJc w:val="left"/>
+      <w:pPr>
+        <w:tabs>
+          <w:tab w:val="num" w:pos="2880"/>
+        </w:tabs>
+        <w:ind w:left="2880" w:hanging="360"/>
+      </w:pPr>
+    </w:lvl>
+    <w:lvl w:ilvl="4" w:tentative="1">
+      <w:start w:val="1"/>
+      <w:numFmt w:val="decimal"/>
+      <w:lvlText w:val="%5."/>
+      <w:lvlJc w:val="left"/>
+      <w:pPr>
+        <w:tabs>
+          <w:tab w:val="num" w:pos="3600"/>
+        </w:tabs>
+        <w:ind w:left="3600" w:hanging="360"/>
+      </w:pPr>
+    </w:lvl>
+    <w:lvl w:ilvl="5" w:tentative="1">
+      <w:start w:val="1"/>
+      <w:numFmt w:val="decimal"/>
+      <w:lvlText w:val="%6."/>
+      <w:lvlJc w:val="left"/>
+      <w:pPr>
+        <w:tabs>
+          <w:tab w:val="num" w:pos="4320"/>
+        </w:tabs>
+        <w:ind w:left="4320" w:hanging="360"/>
+      </w:pPr>
+    </w:lvl>
+    <w:lvl w:ilvl="6" w:tentative="1">
+      <w:start w:val="1"/>
+      <w:numFmt w:val="decimal"/>
+      <w:lvlText w:val="%7."/>
+      <w:lvlJc w:val="left"/>
+      <w:pPr>
+        <w:tabs>
+          <w:tab w:val="num" w:pos="5040"/>
+        </w:tabs>
+        <w:ind w:left="5040" w:hanging="360"/>
+      </w:pPr>
+    </w:lvl>
+    <w:lvl w:ilvl="7" w:tentative="1">
+      <w:start w:val="1"/>
+      <w:numFmt w:val="decimal"/>
+      <w:lvlText w:val="%8."/>
+      <w:lvlJc w:val="left"/>
+      <w:pPr>
+        <w:tabs>
+          <w:tab w:val="num" w:pos="5760"/>
+        </w:tabs>
+        <w:ind w:left="5760" w:hanging="360"/>
+      </w:pPr>
+    </w:lvl>
+    <w:lvl w:ilvl="8" w:tentative="1">
+      <w:start w:val="1"/>
+      <w:numFmt w:val="decimal"/>
+      <w:lvlText w:val="%9."/>
+      <w:lvlJc w:val="left"/>
+      <w:pPr>
+        <w:tabs>
+          <w:tab w:val="num" w:pos="6480"/>
+        </w:tabs>
+        <w:ind w:left="6480" w:hanging="360"/>
+      </w:pPr>
+    </w:lvl>
+  </w:abstractNum>
+  <w:abstractNum w:abstractNumId="3" w15:restartNumberingAfterBreak="0">
+    <w:nsid w:val="2750702C"/>
+    <w:multiLevelType w:val="multilevel"/>
+    <w:tmpl w:val="2D68460A"/>
+    <w:lvl w:ilvl="0">
+      <w:start w:val="1"/>
+      <w:numFmt w:val="decimal"/>
+      <w:lvlText w:val="%1."/>
+      <w:lvlJc w:val="left"/>
+      <w:pPr>
+        <w:tabs>
+          <w:tab w:val="num" w:pos="720"/>
+        </w:tabs>
+        <w:ind w:left="720" w:hanging="360"/>
+      </w:pPr>
+    </w:lvl>
+    <w:lvl w:ilvl="1" w:tentative="1">
+      <w:start w:val="1"/>
+      <w:numFmt w:val="decimal"/>
+      <w:lvlText w:val="%2."/>
+      <w:lvlJc w:val="left"/>
+      <w:pPr>
+        <w:tabs>
+          <w:tab w:val="num" w:pos="1440"/>
+        </w:tabs>
+        <w:ind w:left="1440" w:hanging="360"/>
+      </w:pPr>
+    </w:lvl>
+    <w:lvl w:ilvl="2" w:tentative="1">
+      <w:start w:val="1"/>
+      <w:numFmt w:val="decimal"/>
+      <w:lvlText w:val="%3."/>
+      <w:lvlJc w:val="left"/>
+      <w:pPr>
+        <w:tabs>
+          <w:tab w:val="num" w:pos="2160"/>
+        </w:tabs>
+        <w:ind w:left="2160" w:hanging="360"/>
+      </w:pPr>
+    </w:lvl>
+    <w:lvl w:ilvl="3" w:tentative="1">
+      <w:start w:val="1"/>
+      <w:numFmt w:val="decimal"/>
+      <w:lvlText w:val="%4."/>
+      <w:lvlJc w:val="left"/>
+      <w:pPr>
+        <w:tabs>
+          <w:tab w:val="num" w:pos="2880"/>
+        </w:tabs>
+        <w:ind w:left="2880" w:hanging="360"/>
+      </w:pPr>
+    </w:lvl>
+    <w:lvl w:ilvl="4" w:tentative="1">
+      <w:start w:val="1"/>
+      <w:numFmt w:val="decimal"/>
+      <w:lvlText w:val="%5."/>
+      <w:lvlJc w:val="left"/>
+      <w:pPr>
+        <w:tabs>
+          <w:tab w:val="num" w:pos="3600"/>
+        </w:tabs>
+        <w:ind w:left="3600" w:hanging="360"/>
+      </w:pPr>
+    </w:lvl>
+    <w:lvl w:ilvl="5" w:tentative="1">
+      <w:start w:val="1"/>
+      <w:numFmt w:val="decimal"/>
+      <w:lvlText w:val="%6."/>
+      <w:lvlJc w:val="left"/>
+      <w:pPr>
+        <w:tabs>
+          <w:tab w:val="num" w:pos="4320"/>
+        </w:tabs>
+        <w:ind w:left="4320" w:hanging="360"/>
+      </w:pPr>
+    </w:lvl>
+    <w:lvl w:ilvl="6" w:tentative="1">
+      <w:start w:val="1"/>
+      <w:numFmt w:val="decimal"/>
+      <w:lvlText w:val="%7."/>
+      <w:lvlJc w:val="left"/>
+      <w:pPr>
+        <w:tabs>
+          <w:tab w:val="num" w:pos="5040"/>
+        </w:tabs>
+        <w:ind w:left="5040" w:hanging="360"/>
+      </w:pPr>
+    </w:lvl>
+    <w:lvl w:ilvl="7" w:tentative="1">
+      <w:start w:val="1"/>
+      <w:numFmt w:val="decimal"/>
+      <w:lvlText w:val="%8."/>
+      <w:lvlJc w:val="left"/>
+      <w:pPr>
+        <w:tabs>
+          <w:tab w:val="num" w:pos="5760"/>
+        </w:tabs>
+        <w:ind w:left="5760" w:hanging="360"/>
+      </w:pPr>
+    </w:lvl>
+    <w:lvl w:ilvl="8" w:tentative="1">
+      <w:start w:val="1"/>
+      <w:numFmt w:val="decimal"/>
+      <w:lvlText w:val="%9."/>
+      <w:lvlJc w:val="left"/>
+      <w:pPr>
+        <w:tabs>
+          <w:tab w:val="num" w:pos="6480"/>
+        </w:tabs>
+        <w:ind w:left="6480" w:hanging="360"/>
+      </w:pPr>
+    </w:lvl>
+  </w:abstractNum>
+  <w:abstractNum w:abstractNumId="4" w15:restartNumberingAfterBreak="0">
+    <w:nsid w:val="2FE80911"/>
+    <w:multiLevelType w:val="multilevel"/>
+    <w:tmpl w:val="E4ECC12C"/>
     <w:lvl w:ilvl="0">
       <w:start w:val="1"/>
       <w:numFmt w:val="bullet"/>
@@ -22811,10 +22585,353 @@
       </w:rPr>
     </w:lvl>
   </w:abstractNum>
+  <w:abstractNum w:abstractNumId="5" w15:restartNumberingAfterBreak="0">
+    <w:nsid w:val="32C27F2A"/>
+    <w:multiLevelType w:val="multilevel"/>
+    <w:tmpl w:val="70D6536E"/>
+    <w:lvl w:ilvl="0">
+      <w:start w:val="1"/>
+      <w:numFmt w:val="decimal"/>
+      <w:lvlText w:val="%1."/>
+      <w:lvlJc w:val="left"/>
+      <w:pPr>
+        <w:tabs>
+          <w:tab w:val="num" w:pos="720"/>
+        </w:tabs>
+        <w:ind w:left="720" w:hanging="360"/>
+      </w:pPr>
+    </w:lvl>
+    <w:lvl w:ilvl="1" w:tentative="1">
+      <w:start w:val="1"/>
+      <w:numFmt w:val="decimal"/>
+      <w:lvlText w:val="%2."/>
+      <w:lvlJc w:val="left"/>
+      <w:pPr>
+        <w:tabs>
+          <w:tab w:val="num" w:pos="1440"/>
+        </w:tabs>
+        <w:ind w:left="1440" w:hanging="360"/>
+      </w:pPr>
+    </w:lvl>
+    <w:lvl w:ilvl="2" w:tentative="1">
+      <w:start w:val="1"/>
+      <w:numFmt w:val="decimal"/>
+      <w:lvlText w:val="%3."/>
+      <w:lvlJc w:val="left"/>
+      <w:pPr>
+        <w:tabs>
+          <w:tab w:val="num" w:pos="2160"/>
+        </w:tabs>
+        <w:ind w:left="2160" w:hanging="360"/>
+      </w:pPr>
+    </w:lvl>
+    <w:lvl w:ilvl="3" w:tentative="1">
+      <w:start w:val="1"/>
+      <w:numFmt w:val="decimal"/>
+      <w:lvlText w:val="%4."/>
+      <w:lvlJc w:val="left"/>
+      <w:pPr>
+        <w:tabs>
+          <w:tab w:val="num" w:pos="2880"/>
+        </w:tabs>
+        <w:ind w:left="2880" w:hanging="360"/>
+      </w:pPr>
+    </w:lvl>
+    <w:lvl w:ilvl="4" w:tentative="1">
+      <w:start w:val="1"/>
+      <w:numFmt w:val="decimal"/>
+      <w:lvlText w:val="%5."/>
+      <w:lvlJc w:val="left"/>
+      <w:pPr>
+        <w:tabs>
+          <w:tab w:val="num" w:pos="3600"/>
+        </w:tabs>
+        <w:ind w:left="3600" w:hanging="360"/>
+      </w:pPr>
+    </w:lvl>
+    <w:lvl w:ilvl="5" w:tentative="1">
+      <w:start w:val="1"/>
+      <w:numFmt w:val="decimal"/>
+      <w:lvlText w:val="%6."/>
+      <w:lvlJc w:val="left"/>
+      <w:pPr>
+        <w:tabs>
+          <w:tab w:val="num" w:pos="4320"/>
+        </w:tabs>
+        <w:ind w:left="4320" w:hanging="360"/>
+      </w:pPr>
+    </w:lvl>
+    <w:lvl w:ilvl="6" w:tentative="1">
+      <w:start w:val="1"/>
+      <w:numFmt w:val="decimal"/>
+      <w:lvlText w:val="%7."/>
+      <w:lvlJc w:val="left"/>
+      <w:pPr>
+        <w:tabs>
+          <w:tab w:val="num" w:pos="5040"/>
+        </w:tabs>
+        <w:ind w:left="5040" w:hanging="360"/>
+      </w:pPr>
+    </w:lvl>
+    <w:lvl w:ilvl="7" w:tentative="1">
+      <w:start w:val="1"/>
+      <w:numFmt w:val="decimal"/>
+      <w:lvlText w:val="%8."/>
+      <w:lvlJc w:val="left"/>
+      <w:pPr>
+        <w:tabs>
+          <w:tab w:val="num" w:pos="5760"/>
+        </w:tabs>
+        <w:ind w:left="5760" w:hanging="360"/>
+      </w:pPr>
+    </w:lvl>
+    <w:lvl w:ilvl="8" w:tentative="1">
+      <w:start w:val="1"/>
+      <w:numFmt w:val="decimal"/>
+      <w:lvlText w:val="%9."/>
+      <w:lvlJc w:val="left"/>
+      <w:pPr>
+        <w:tabs>
+          <w:tab w:val="num" w:pos="6480"/>
+        </w:tabs>
+        <w:ind w:left="6480" w:hanging="360"/>
+      </w:pPr>
+    </w:lvl>
+  </w:abstractNum>
+  <w:abstractNum w:abstractNumId="6" w15:restartNumberingAfterBreak="0">
+    <w:nsid w:val="3F3220C0"/>
+    <w:multiLevelType w:val="multilevel"/>
+    <w:tmpl w:val="50FEAA32"/>
+    <w:lvl w:ilvl="0">
+      <w:start w:val="1"/>
+      <w:numFmt w:val="decimal"/>
+      <w:lvlText w:val="%1."/>
+      <w:lvlJc w:val="left"/>
+      <w:pPr>
+        <w:tabs>
+          <w:tab w:val="num" w:pos="720"/>
+        </w:tabs>
+        <w:ind w:left="720" w:hanging="360"/>
+      </w:pPr>
+    </w:lvl>
+    <w:lvl w:ilvl="1" w:tentative="1">
+      <w:start w:val="1"/>
+      <w:numFmt w:val="decimal"/>
+      <w:lvlText w:val="%2."/>
+      <w:lvlJc w:val="left"/>
+      <w:pPr>
+        <w:tabs>
+          <w:tab w:val="num" w:pos="1440"/>
+        </w:tabs>
+        <w:ind w:left="1440" w:hanging="360"/>
+      </w:pPr>
+    </w:lvl>
+    <w:lvl w:ilvl="2" w:tentative="1">
+      <w:start w:val="1"/>
+      <w:numFmt w:val="decimal"/>
+      <w:lvlText w:val="%3."/>
+      <w:lvlJc w:val="left"/>
+      <w:pPr>
+        <w:tabs>
+          <w:tab w:val="num" w:pos="2160"/>
+        </w:tabs>
+        <w:ind w:left="2160" w:hanging="360"/>
+      </w:pPr>
+    </w:lvl>
+    <w:lvl w:ilvl="3" w:tentative="1">
+      <w:start w:val="1"/>
+      <w:numFmt w:val="decimal"/>
+      <w:lvlText w:val="%4."/>
+      <w:lvlJc w:val="left"/>
+      <w:pPr>
+        <w:tabs>
+          <w:tab w:val="num" w:pos="2880"/>
+        </w:tabs>
+        <w:ind w:left="2880" w:hanging="360"/>
+      </w:pPr>
+    </w:lvl>
+    <w:lvl w:ilvl="4" w:tentative="1">
+      <w:start w:val="1"/>
+      <w:numFmt w:val="decimal"/>
+      <w:lvlText w:val="%5."/>
+      <w:lvlJc w:val="left"/>
+      <w:pPr>
+        <w:tabs>
+          <w:tab w:val="num" w:pos="3600"/>
+        </w:tabs>
+        <w:ind w:left="3600" w:hanging="360"/>
+      </w:pPr>
+    </w:lvl>
+    <w:lvl w:ilvl="5" w:tentative="1">
+      <w:start w:val="1"/>
+      <w:numFmt w:val="decimal"/>
+      <w:lvlText w:val="%6."/>
+      <w:lvlJc w:val="left"/>
+      <w:pPr>
+        <w:tabs>
+          <w:tab w:val="num" w:pos="4320"/>
+        </w:tabs>
+        <w:ind w:left="4320" w:hanging="360"/>
+      </w:pPr>
+    </w:lvl>
+    <w:lvl w:ilvl="6" w:tentative="1">
+      <w:start w:val="1"/>
+      <w:numFmt w:val="decimal"/>
+      <w:lvlText w:val="%7."/>
+      <w:lvlJc w:val="left"/>
+      <w:pPr>
+        <w:tabs>
+          <w:tab w:val="num" w:pos="5040"/>
+        </w:tabs>
+        <w:ind w:left="5040" w:hanging="360"/>
+      </w:pPr>
+    </w:lvl>
+    <w:lvl w:ilvl="7" w:tentative="1">
+      <w:start w:val="1"/>
+      <w:numFmt w:val="decimal"/>
+      <w:lvlText w:val="%8."/>
+      <w:lvlJc w:val="left"/>
+      <w:pPr>
+        <w:tabs>
+          <w:tab w:val="num" w:pos="5760"/>
+        </w:tabs>
+        <w:ind w:left="5760" w:hanging="360"/>
+      </w:pPr>
+    </w:lvl>
+    <w:lvl w:ilvl="8" w:tentative="1">
+      <w:start w:val="1"/>
+      <w:numFmt w:val="decimal"/>
+      <w:lvlText w:val="%9."/>
+      <w:lvlJc w:val="left"/>
+      <w:pPr>
+        <w:tabs>
+          <w:tab w:val="num" w:pos="6480"/>
+        </w:tabs>
+        <w:ind w:left="6480" w:hanging="360"/>
+      </w:pPr>
+    </w:lvl>
+  </w:abstractNum>
   <w:abstractNum w:abstractNumId="7" w15:restartNumberingAfterBreak="0">
-    <w:nsid w:val="51E63035"/>
+    <w:nsid w:val="4A2A6F14"/>
     <w:multiLevelType w:val="multilevel"/>
-    <w:tmpl w:val="561853DE"/>
+    <w:tmpl w:val="25822FC0"/>
+    <w:lvl w:ilvl="0">
+      <w:start w:val="1"/>
+      <w:numFmt w:val="decimal"/>
+      <w:lvlText w:val="%1."/>
+      <w:lvlJc w:val="left"/>
+      <w:pPr>
+        <w:tabs>
+          <w:tab w:val="num" w:pos="720"/>
+        </w:tabs>
+        <w:ind w:left="720" w:hanging="360"/>
+      </w:pPr>
+    </w:lvl>
+    <w:lvl w:ilvl="1">
+      <w:start w:val="1"/>
+      <w:numFmt w:val="bullet"/>
+      <w:lvlText w:val="o"/>
+      <w:lvlJc w:val="left"/>
+      <w:pPr>
+        <w:tabs>
+          <w:tab w:val="num" w:pos="1440"/>
+        </w:tabs>
+        <w:ind w:left="1440" w:hanging="360"/>
+      </w:pPr>
+      <w:rPr>
+        <w:rFonts w:ascii="Courier New" w:hAnsi="Courier New" w:hint="default"/>
+        <w:sz w:val="20"/>
+      </w:rPr>
+    </w:lvl>
+    <w:lvl w:ilvl="2" w:tentative="1">
+      <w:start w:val="1"/>
+      <w:numFmt w:val="decimal"/>
+      <w:lvlText w:val="%3."/>
+      <w:lvlJc w:val="left"/>
+      <w:pPr>
+        <w:tabs>
+          <w:tab w:val="num" w:pos="2160"/>
+        </w:tabs>
+        <w:ind w:left="2160" w:hanging="360"/>
+      </w:pPr>
+    </w:lvl>
+    <w:lvl w:ilvl="3" w:tentative="1">
+      <w:start w:val="1"/>
+      <w:numFmt w:val="decimal"/>
+      <w:lvlText w:val="%4."/>
+      <w:lvlJc w:val="left"/>
+      <w:pPr>
+        <w:tabs>
+          <w:tab w:val="num" w:pos="2880"/>
+        </w:tabs>
+        <w:ind w:left="2880" w:hanging="360"/>
+      </w:pPr>
+    </w:lvl>
+    <w:lvl w:ilvl="4" w:tentative="1">
+      <w:start w:val="1"/>
+      <w:numFmt w:val="decimal"/>
+      <w:lvlText w:val="%5."/>
+      <w:lvlJc w:val="left"/>
+      <w:pPr>
+        <w:tabs>
+          <w:tab w:val="num" w:pos="3600"/>
+        </w:tabs>
+        <w:ind w:left="3600" w:hanging="360"/>
+      </w:pPr>
+    </w:lvl>
+    <w:lvl w:ilvl="5" w:tentative="1">
+      <w:start w:val="1"/>
+      <w:numFmt w:val="decimal"/>
+      <w:lvlText w:val="%6."/>
+      <w:lvlJc w:val="left"/>
+      <w:pPr>
+        <w:tabs>
+          <w:tab w:val="num" w:pos="4320"/>
+        </w:tabs>
+        <w:ind w:left="4320" w:hanging="360"/>
+      </w:pPr>
+    </w:lvl>
+    <w:lvl w:ilvl="6" w:tentative="1">
+      <w:start w:val="1"/>
+      <w:numFmt w:val="decimal"/>
+      <w:lvlText w:val="%7."/>
+      <w:lvlJc w:val="left"/>
+      <w:pPr>
+        <w:tabs>
+          <w:tab w:val="num" w:pos="5040"/>
+        </w:tabs>
+        <w:ind w:left="5040" w:hanging="360"/>
+      </w:pPr>
+    </w:lvl>
+    <w:lvl w:ilvl="7" w:tentative="1">
+      <w:start w:val="1"/>
+      <w:numFmt w:val="decimal"/>
+      <w:lvlText w:val="%8."/>
+      <w:lvlJc w:val="left"/>
+      <w:pPr>
+        <w:tabs>
+          <w:tab w:val="num" w:pos="5760"/>
+        </w:tabs>
+        <w:ind w:left="5760" w:hanging="360"/>
+      </w:pPr>
+    </w:lvl>
+    <w:lvl w:ilvl="8" w:tentative="1">
+      <w:start w:val="1"/>
+      <w:numFmt w:val="decimal"/>
+      <w:lvlText w:val="%9."/>
+      <w:lvlJc w:val="left"/>
+      <w:pPr>
+        <w:tabs>
+          <w:tab w:val="num" w:pos="6480"/>
+        </w:tabs>
+        <w:ind w:left="6480" w:hanging="360"/>
+      </w:pPr>
+    </w:lvl>
+  </w:abstractNum>
+  <w:abstractNum w:abstractNumId="8" w15:restartNumberingAfterBreak="0">
+    <w:nsid w:val="4C872E10"/>
+    <w:multiLevelType w:val="multilevel"/>
+    <w:tmpl w:val="C354ED08"/>
     <w:lvl w:ilvl="0">
       <w:start w:val="1"/>
       <w:numFmt w:val="bullet"/>
@@ -22960,236 +23077,10 @@
       </w:rPr>
     </w:lvl>
   </w:abstractNum>
-  <w:abstractNum w:abstractNumId="8" w15:restartNumberingAfterBreak="0">
-    <w:nsid w:val="60184BCE"/>
+  <w:abstractNum w:abstractNumId="9" w15:restartNumberingAfterBreak="0">
+    <w:nsid w:val="574829FF"/>
     <w:multiLevelType w:val="multilevel"/>
-    <w:tmpl w:val="9F922B0E"/>
-    <w:lvl w:ilvl="0">
-      <w:start w:val="1"/>
-      <w:numFmt w:val="decimal"/>
-      <w:lvlText w:val="%1."/>
-      <w:lvlJc w:val="left"/>
-      <w:pPr>
-        <w:tabs>
-          <w:tab w:val="num" w:pos="720"/>
-        </w:tabs>
-        <w:ind w:left="720" w:hanging="360"/>
-      </w:pPr>
-    </w:lvl>
-    <w:lvl w:ilvl="1" w:tentative="1">
-      <w:start w:val="1"/>
-      <w:numFmt w:val="decimal"/>
-      <w:lvlText w:val="%2."/>
-      <w:lvlJc w:val="left"/>
-      <w:pPr>
-        <w:tabs>
-          <w:tab w:val="num" w:pos="1440"/>
-        </w:tabs>
-        <w:ind w:left="1440" w:hanging="360"/>
-      </w:pPr>
-    </w:lvl>
-    <w:lvl w:ilvl="2" w:tentative="1">
-      <w:start w:val="1"/>
-      <w:numFmt w:val="decimal"/>
-      <w:lvlText w:val="%3."/>
-      <w:lvlJc w:val="left"/>
-      <w:pPr>
-        <w:tabs>
-          <w:tab w:val="num" w:pos="2160"/>
-        </w:tabs>
-        <w:ind w:left="2160" w:hanging="360"/>
-      </w:pPr>
-    </w:lvl>
-    <w:lvl w:ilvl="3" w:tentative="1">
-      <w:start w:val="1"/>
-      <w:numFmt w:val="decimal"/>
-      <w:lvlText w:val="%4."/>
-      <w:lvlJc w:val="left"/>
-      <w:pPr>
-        <w:tabs>
-          <w:tab w:val="num" w:pos="2880"/>
-        </w:tabs>
-        <w:ind w:left="2880" w:hanging="360"/>
-      </w:pPr>
-    </w:lvl>
-    <w:lvl w:ilvl="4" w:tentative="1">
-      <w:start w:val="1"/>
-      <w:numFmt w:val="decimal"/>
-      <w:lvlText w:val="%5."/>
-      <w:lvlJc w:val="left"/>
-      <w:pPr>
-        <w:tabs>
-          <w:tab w:val="num" w:pos="3600"/>
-        </w:tabs>
-        <w:ind w:left="3600" w:hanging="360"/>
-      </w:pPr>
-    </w:lvl>
-    <w:lvl w:ilvl="5" w:tentative="1">
-      <w:start w:val="1"/>
-      <w:numFmt w:val="decimal"/>
-      <w:lvlText w:val="%6."/>
-      <w:lvlJc w:val="left"/>
-      <w:pPr>
-        <w:tabs>
-          <w:tab w:val="num" w:pos="4320"/>
-        </w:tabs>
-        <w:ind w:left="4320" w:hanging="360"/>
-      </w:pPr>
-    </w:lvl>
-    <w:lvl w:ilvl="6" w:tentative="1">
-      <w:start w:val="1"/>
-      <w:numFmt w:val="decimal"/>
-      <w:lvlText w:val="%7."/>
-      <w:lvlJc w:val="left"/>
-      <w:pPr>
-        <w:tabs>
-          <w:tab w:val="num" w:pos="5040"/>
-        </w:tabs>
-        <w:ind w:left="5040" w:hanging="360"/>
-      </w:pPr>
-    </w:lvl>
-    <w:lvl w:ilvl="7" w:tentative="1">
-      <w:start w:val="1"/>
-      <w:numFmt w:val="decimal"/>
-      <w:lvlText w:val="%8."/>
-      <w:lvlJc w:val="left"/>
-      <w:pPr>
-        <w:tabs>
-          <w:tab w:val="num" w:pos="5760"/>
-        </w:tabs>
-        <w:ind w:left="5760" w:hanging="360"/>
-      </w:pPr>
-    </w:lvl>
-    <w:lvl w:ilvl="8" w:tentative="1">
-      <w:start w:val="1"/>
-      <w:numFmt w:val="decimal"/>
-      <w:lvlText w:val="%9."/>
-      <w:lvlJc w:val="left"/>
-      <w:pPr>
-        <w:tabs>
-          <w:tab w:val="num" w:pos="6480"/>
-        </w:tabs>
-        <w:ind w:left="6480" w:hanging="360"/>
-      </w:pPr>
-    </w:lvl>
-  </w:abstractNum>
-  <w:abstractNum w:abstractNumId="9" w15:restartNumberingAfterBreak="0">
-    <w:nsid w:val="642D5084"/>
-    <w:multiLevelType w:val="multilevel"/>
-    <w:tmpl w:val="365832B2"/>
-    <w:lvl w:ilvl="0">
-      <w:start w:val="1"/>
-      <w:numFmt w:val="decimal"/>
-      <w:lvlText w:val="%1."/>
-      <w:lvlJc w:val="left"/>
-      <w:pPr>
-        <w:tabs>
-          <w:tab w:val="num" w:pos="720"/>
-        </w:tabs>
-        <w:ind w:left="720" w:hanging="360"/>
-      </w:pPr>
-    </w:lvl>
-    <w:lvl w:ilvl="1" w:tentative="1">
-      <w:start w:val="1"/>
-      <w:numFmt w:val="decimal"/>
-      <w:lvlText w:val="%2."/>
-      <w:lvlJc w:val="left"/>
-      <w:pPr>
-        <w:tabs>
-          <w:tab w:val="num" w:pos="1440"/>
-        </w:tabs>
-        <w:ind w:left="1440" w:hanging="360"/>
-      </w:pPr>
-    </w:lvl>
-    <w:lvl w:ilvl="2" w:tentative="1">
-      <w:start w:val="1"/>
-      <w:numFmt w:val="decimal"/>
-      <w:lvlText w:val="%3."/>
-      <w:lvlJc w:val="left"/>
-      <w:pPr>
-        <w:tabs>
-          <w:tab w:val="num" w:pos="2160"/>
-        </w:tabs>
-        <w:ind w:left="2160" w:hanging="360"/>
-      </w:pPr>
-    </w:lvl>
-    <w:lvl w:ilvl="3" w:tentative="1">
-      <w:start w:val="1"/>
-      <w:numFmt w:val="decimal"/>
-      <w:lvlText w:val="%4."/>
-      <w:lvlJc w:val="left"/>
-      <w:pPr>
-        <w:tabs>
-          <w:tab w:val="num" w:pos="2880"/>
-        </w:tabs>
-        <w:ind w:left="2880" w:hanging="360"/>
-      </w:pPr>
-    </w:lvl>
-    <w:lvl w:ilvl="4" w:tentative="1">
-      <w:start w:val="1"/>
-      <w:numFmt w:val="decimal"/>
-      <w:lvlText w:val="%5."/>
-      <w:lvlJc w:val="left"/>
-      <w:pPr>
-        <w:tabs>
-          <w:tab w:val="num" w:pos="3600"/>
-        </w:tabs>
-        <w:ind w:left="3600" w:hanging="360"/>
-      </w:pPr>
-    </w:lvl>
-    <w:lvl w:ilvl="5" w:tentative="1">
-      <w:start w:val="1"/>
-      <w:numFmt w:val="decimal"/>
-      <w:lvlText w:val="%6."/>
-      <w:lvlJc w:val="left"/>
-      <w:pPr>
-        <w:tabs>
-          <w:tab w:val="num" w:pos="4320"/>
-        </w:tabs>
-        <w:ind w:left="4320" w:hanging="360"/>
-      </w:pPr>
-    </w:lvl>
-    <w:lvl w:ilvl="6" w:tentative="1">
-      <w:start w:val="1"/>
-      <w:numFmt w:val="decimal"/>
-      <w:lvlText w:val="%7."/>
-      <w:lvlJc w:val="left"/>
-      <w:pPr>
-        <w:tabs>
-          <w:tab w:val="num" w:pos="5040"/>
-        </w:tabs>
-        <w:ind w:left="5040" w:hanging="360"/>
-      </w:pPr>
-    </w:lvl>
-    <w:lvl w:ilvl="7" w:tentative="1">
-      <w:start w:val="1"/>
-      <w:numFmt w:val="decimal"/>
-      <w:lvlText w:val="%8."/>
-      <w:lvlJc w:val="left"/>
-      <w:pPr>
-        <w:tabs>
-          <w:tab w:val="num" w:pos="5760"/>
-        </w:tabs>
-        <w:ind w:left="5760" w:hanging="360"/>
-      </w:pPr>
-    </w:lvl>
-    <w:lvl w:ilvl="8" w:tentative="1">
-      <w:start w:val="1"/>
-      <w:numFmt w:val="decimal"/>
-      <w:lvlText w:val="%9."/>
-      <w:lvlJc w:val="left"/>
-      <w:pPr>
-        <w:tabs>
-          <w:tab w:val="num" w:pos="6480"/>
-        </w:tabs>
-        <w:ind w:left="6480" w:hanging="360"/>
-      </w:pPr>
-    </w:lvl>
-  </w:abstractNum>
-  <w:abstractNum w:abstractNumId="10" w15:restartNumberingAfterBreak="0">
-    <w:nsid w:val="68584C5F"/>
-    <w:multiLevelType w:val="multilevel"/>
-    <w:tmpl w:val="3416AE74"/>
+    <w:tmpl w:val="90ACA292"/>
     <w:lvl w:ilvl="0">
       <w:start w:val="1"/>
       <w:numFmt w:val="bullet"/>
@@ -23335,10 +23226,10 @@
       </w:rPr>
     </w:lvl>
   </w:abstractNum>
-  <w:abstractNum w:abstractNumId="11" w15:restartNumberingAfterBreak="0">
-    <w:nsid w:val="73415089"/>
+  <w:abstractNum w:abstractNumId="10" w15:restartNumberingAfterBreak="0">
+    <w:nsid w:val="5C032495"/>
     <w:multiLevelType w:val="multilevel"/>
-    <w:tmpl w:val="D61C9BAC"/>
+    <w:tmpl w:val="2D50D2EC"/>
     <w:lvl w:ilvl="0">
       <w:start w:val="1"/>
       <w:numFmt w:val="decimal"/>
@@ -23448,10 +23339,10 @@
       </w:pPr>
     </w:lvl>
   </w:abstractNum>
-  <w:abstractNum w:abstractNumId="12" w15:restartNumberingAfterBreak="0">
-    <w:nsid w:val="747C7B54"/>
+  <w:abstractNum w:abstractNumId="11" w15:restartNumberingAfterBreak="0">
+    <w:nsid w:val="5D5435F9"/>
     <w:multiLevelType w:val="multilevel"/>
-    <w:tmpl w:val="4C42E138"/>
+    <w:tmpl w:val="B790A914"/>
     <w:lvl w:ilvl="0">
       <w:start w:val="1"/>
       <w:numFmt w:val="bullet"/>
@@ -23597,10 +23488,10 @@
       </w:rPr>
     </w:lvl>
   </w:abstractNum>
-  <w:abstractNum w:abstractNumId="13" w15:restartNumberingAfterBreak="0">
-    <w:nsid w:val="7A5566CC"/>
+  <w:abstractNum w:abstractNumId="12" w15:restartNumberingAfterBreak="0">
+    <w:nsid w:val="645B35A7"/>
     <w:multiLevelType w:val="multilevel"/>
-    <w:tmpl w:val="FAE0FD02"/>
+    <w:tmpl w:val="EE5857AC"/>
     <w:lvl w:ilvl="0">
       <w:start w:val="1"/>
       <w:numFmt w:val="decimal"/>
@@ -23613,10 +23504,10 @@
         <w:ind w:left="720" w:hanging="360"/>
       </w:pPr>
     </w:lvl>
-    <w:lvl w:ilvl="1">
+    <w:lvl w:ilvl="1" w:tentative="1">
       <w:start w:val="1"/>
-      <w:numFmt w:val="bullet"/>
-      <w:lvlText w:val="o"/>
+      <w:numFmt w:val="decimal"/>
+      <w:lvlText w:val="%2."/>
       <w:lvlJc w:val="left"/>
       <w:pPr>
         <w:tabs>
@@ -23624,10 +23515,6 @@
         </w:tabs>
         <w:ind w:left="1440" w:hanging="360"/>
       </w:pPr>
-      <w:rPr>
-        <w:rFonts w:ascii="Courier New" w:hAnsi="Courier New" w:hint="default"/>
-        <w:sz w:val="20"/>
-      </w:rPr>
     </w:lvl>
     <w:lvl w:ilvl="2" w:tentative="1">
       <w:start w:val="1"/>
@@ -23714,47 +23601,160 @@
       </w:pPr>
     </w:lvl>
   </w:abstractNum>
-  <w:num w:numId="1" w16cid:durableId="818419870">
+  <w:abstractNum w:abstractNumId="13" w15:restartNumberingAfterBreak="0">
+    <w:nsid w:val="70007BCC"/>
+    <w:multiLevelType w:val="multilevel"/>
+    <w:tmpl w:val="0C4E615A"/>
+    <w:lvl w:ilvl="0">
+      <w:start w:val="1"/>
+      <w:numFmt w:val="decimal"/>
+      <w:lvlText w:val="%1."/>
+      <w:lvlJc w:val="left"/>
+      <w:pPr>
+        <w:tabs>
+          <w:tab w:val="num" w:pos="720"/>
+        </w:tabs>
+        <w:ind w:left="720" w:hanging="360"/>
+      </w:pPr>
+    </w:lvl>
+    <w:lvl w:ilvl="1" w:tentative="1">
+      <w:start w:val="1"/>
+      <w:numFmt w:val="decimal"/>
+      <w:lvlText w:val="%2."/>
+      <w:lvlJc w:val="left"/>
+      <w:pPr>
+        <w:tabs>
+          <w:tab w:val="num" w:pos="1440"/>
+        </w:tabs>
+        <w:ind w:left="1440" w:hanging="360"/>
+      </w:pPr>
+    </w:lvl>
+    <w:lvl w:ilvl="2" w:tentative="1">
+      <w:start w:val="1"/>
+      <w:numFmt w:val="decimal"/>
+      <w:lvlText w:val="%3."/>
+      <w:lvlJc w:val="left"/>
+      <w:pPr>
+        <w:tabs>
+          <w:tab w:val="num" w:pos="2160"/>
+        </w:tabs>
+        <w:ind w:left="2160" w:hanging="360"/>
+      </w:pPr>
+    </w:lvl>
+    <w:lvl w:ilvl="3" w:tentative="1">
+      <w:start w:val="1"/>
+      <w:numFmt w:val="decimal"/>
+      <w:lvlText w:val="%4."/>
+      <w:lvlJc w:val="left"/>
+      <w:pPr>
+        <w:tabs>
+          <w:tab w:val="num" w:pos="2880"/>
+        </w:tabs>
+        <w:ind w:left="2880" w:hanging="360"/>
+      </w:pPr>
+    </w:lvl>
+    <w:lvl w:ilvl="4" w:tentative="1">
+      <w:start w:val="1"/>
+      <w:numFmt w:val="decimal"/>
+      <w:lvlText w:val="%5."/>
+      <w:lvlJc w:val="left"/>
+      <w:pPr>
+        <w:tabs>
+          <w:tab w:val="num" w:pos="3600"/>
+        </w:tabs>
+        <w:ind w:left="3600" w:hanging="360"/>
+      </w:pPr>
+    </w:lvl>
+    <w:lvl w:ilvl="5" w:tentative="1">
+      <w:start w:val="1"/>
+      <w:numFmt w:val="decimal"/>
+      <w:lvlText w:val="%6."/>
+      <w:lvlJc w:val="left"/>
+      <w:pPr>
+        <w:tabs>
+          <w:tab w:val="num" w:pos="4320"/>
+        </w:tabs>
+        <w:ind w:left="4320" w:hanging="360"/>
+      </w:pPr>
+    </w:lvl>
+    <w:lvl w:ilvl="6" w:tentative="1">
+      <w:start w:val="1"/>
+      <w:numFmt w:val="decimal"/>
+      <w:lvlText w:val="%7."/>
+      <w:lvlJc w:val="left"/>
+      <w:pPr>
+        <w:tabs>
+          <w:tab w:val="num" w:pos="5040"/>
+        </w:tabs>
+        <w:ind w:left="5040" w:hanging="360"/>
+      </w:pPr>
+    </w:lvl>
+    <w:lvl w:ilvl="7" w:tentative="1">
+      <w:start w:val="1"/>
+      <w:numFmt w:val="decimal"/>
+      <w:lvlText w:val="%8."/>
+      <w:lvlJc w:val="left"/>
+      <w:pPr>
+        <w:tabs>
+          <w:tab w:val="num" w:pos="5760"/>
+        </w:tabs>
+        <w:ind w:left="5760" w:hanging="360"/>
+      </w:pPr>
+    </w:lvl>
+    <w:lvl w:ilvl="8" w:tentative="1">
+      <w:start w:val="1"/>
+      <w:numFmt w:val="decimal"/>
+      <w:lvlText w:val="%9."/>
+      <w:lvlJc w:val="left"/>
+      <w:pPr>
+        <w:tabs>
+          <w:tab w:val="num" w:pos="6480"/>
+        </w:tabs>
+        <w:ind w:left="6480" w:hanging="360"/>
+      </w:pPr>
+    </w:lvl>
+  </w:abstractNum>
+  <w:num w:numId="1" w16cid:durableId="1777867734">
+    <w:abstractNumId w:val="11"/>
+  </w:num>
+  <w:num w:numId="2" w16cid:durableId="1848059497">
+    <w:abstractNumId w:val="12"/>
+  </w:num>
+  <w:num w:numId="3" w16cid:durableId="487022031">
+    <w:abstractNumId w:val="13"/>
+  </w:num>
+  <w:num w:numId="4" w16cid:durableId="1105735487">
+    <w:abstractNumId w:val="3"/>
+  </w:num>
+  <w:num w:numId="5" w16cid:durableId="684093722">
+    <w:abstractNumId w:val="9"/>
+  </w:num>
+  <w:num w:numId="6" w16cid:durableId="605189946">
+    <w:abstractNumId w:val="7"/>
+  </w:num>
+  <w:num w:numId="7" w16cid:durableId="1820805428">
     <w:abstractNumId w:val="6"/>
   </w:num>
-  <w:num w:numId="2" w16cid:durableId="499346144">
+  <w:num w:numId="8" w16cid:durableId="1797990040">
+    <w:abstractNumId w:val="0"/>
+  </w:num>
+  <w:num w:numId="9" w16cid:durableId="651983152">
+    <w:abstractNumId w:val="10"/>
+  </w:num>
+  <w:num w:numId="10" w16cid:durableId="574049973">
+    <w:abstractNumId w:val="4"/>
+  </w:num>
+  <w:num w:numId="11" w16cid:durableId="26880900">
+    <w:abstractNumId w:val="5"/>
+  </w:num>
+  <w:num w:numId="12" w16cid:durableId="716052950">
+    <w:abstractNumId w:val="2"/>
+  </w:num>
+  <w:num w:numId="13" w16cid:durableId="2123837070">
     <w:abstractNumId w:val="8"/>
   </w:num>
-  <w:num w:numId="3" w16cid:durableId="286741246">
-    <w:abstractNumId w:val="9"/>
-  </w:num>
-  <w:num w:numId="4" w16cid:durableId="1713268705">
-    <w:abstractNumId w:val="3"/>
-  </w:num>
-  <w:num w:numId="5" w16cid:durableId="519051067">
-    <w:abstractNumId w:val="10"/>
-  </w:num>
-  <w:num w:numId="6" w16cid:durableId="1812675402">
-    <w:abstractNumId w:val="13"/>
-  </w:num>
-  <w:num w:numId="7" w16cid:durableId="1745255859">
-    <w:abstractNumId w:val="4"/>
-  </w:num>
-  <w:num w:numId="8" w16cid:durableId="1395665578">
+  <w:num w:numId="14" w16cid:durableId="321549759">
     <w:abstractNumId w:val="1"/>
-  </w:num>
-  <w:num w:numId="9" w16cid:durableId="1305431858">
-    <w:abstractNumId w:val="11"/>
-  </w:num>
-  <w:num w:numId="10" w16cid:durableId="1935630209">
-    <w:abstractNumId w:val="12"/>
-  </w:num>
-  <w:num w:numId="11" w16cid:durableId="589001586">
-    <w:abstractNumId w:val="2"/>
-  </w:num>
-  <w:num w:numId="12" w16cid:durableId="1172262909">
-    <w:abstractNumId w:val="0"/>
-  </w:num>
-  <w:num w:numId="13" w16cid:durableId="1762023693">
-    <w:abstractNumId w:val="7"/>
-  </w:num>
-  <w:num w:numId="14" w16cid:durableId="1393969070">
-    <w:abstractNumId w:val="5"/>
   </w:num>
 </w:numbering>
 </file>
@@ -24519,7 +24519,7 @@
     <w:link w:val="HeaderChar"/>
     <w:uiPriority w:val="99"/>
     <w:unhideWhenUsed/>
-    <w:rsid w:val="00CA6DEF"/>
+    <w:rsid w:val="009377EF"/>
     <w:pPr>
       <w:tabs>
         <w:tab w:val="center" w:pos="4680"/>
@@ -24532,7 +24532,7 @@
     <w:basedOn w:val="DefaultParagraphFont"/>
     <w:link w:val="Header"/>
     <w:uiPriority w:val="99"/>
-    <w:rsid w:val="00CA6DEF"/>
+    <w:rsid w:val="009377EF"/>
     <w:rPr>
       <w:rFonts w:eastAsiaTheme="minorEastAsia"/>
       <w:sz w:val="24"/>
@@ -24545,7 +24545,7 @@
     <w:link w:val="FooterChar"/>
     <w:uiPriority w:val="99"/>
     <w:unhideWhenUsed/>
-    <w:rsid w:val="00CA6DEF"/>
+    <w:rsid w:val="009377EF"/>
     <w:pPr>
       <w:tabs>
         <w:tab w:val="center" w:pos="4680"/>
@@ -24558,7 +24558,7 @@
     <w:basedOn w:val="DefaultParagraphFont"/>
     <w:link w:val="Footer"/>
     <w:uiPriority w:val="99"/>
-    <w:rsid w:val="00CA6DEF"/>
+    <w:rsid w:val="009377EF"/>
     <w:rPr>
       <w:rFonts w:eastAsiaTheme="minorEastAsia"/>
       <w:sz w:val="24"/>
@@ -24571,7 +24571,7 @@
     <w:uiPriority w:val="99"/>
     <w:semiHidden/>
     <w:unhideWhenUsed/>
-    <w:rsid w:val="00CA6DEF"/>
+    <w:rsid w:val="009377EF"/>
   </w:style>
   <w:style w:type="character" w:styleId="Hyperlink">
     <w:name w:val="Hyperlink"/>
@@ -24579,7 +24579,7 @@
     <w:uiPriority w:val="99"/>
     <w:semiHidden/>
     <w:unhideWhenUsed/>
-    <w:rsid w:val="00CA6DEF"/>
+    <w:rsid w:val="009377EF"/>
     <w:rPr>
       <w:color w:val="auto"/>
       <w:u w:val="single"/>
@@ -24592,7 +24592,7 @@
     <w:autoRedefine/>
     <w:uiPriority w:val="39"/>
     <w:unhideWhenUsed/>
-    <w:rsid w:val="00CA6DEF"/>
+    <w:rsid w:val="009377EF"/>
     <w:pPr>
       <w:spacing w:after="100" w:line="360" w:lineRule="auto"/>
     </w:pPr>
@@ -24604,7 +24604,7 @@
     <w:autoRedefine/>
     <w:uiPriority w:val="39"/>
     <w:unhideWhenUsed/>
-    <w:rsid w:val="00CA6DEF"/>
+    <w:rsid w:val="009377EF"/>
     <w:pPr>
       <w:spacing w:after="100" w:line="360" w:lineRule="auto"/>
       <w:ind w:left="240"/>
@@ -24618,7 +24618,7 @@
     <w:uiPriority w:val="39"/>
     <w:semiHidden/>
     <w:unhideWhenUsed/>
-    <w:rsid w:val="00CA6DEF"/>
+    <w:rsid w:val="009377EF"/>
     <w:pPr>
       <w:spacing w:after="100" w:line="360" w:lineRule="auto"/>
       <w:ind w:left="480"/>

</xml_diff>